<commit_message>
Polish PCF manuscript and figures
</commit_message>
<xml_diff>
--- a/docs/PAPER_DRAFT_v4_synced.docx
+++ b/docs/PAPER_DRAFT_v4_synced.docx
@@ -11,7 +11,7 @@
         <w:rPr>
           <w:rFonts w:ascii="Times New Roman" w:hAnsi="Times New Roman"/>
           <w:b/>
-          <w:color w:val="17232D"/>
+          <w:color w:val="000000"/>
           <w:sz w:val="36"/>
         </w:rPr>
         <w:t>Patch-Content Fungibility: Geometry, Functional Transmission, and Operator-Aware Token Compression</w:t>
@@ -54,7 +54,7 @@
         <w:rPr>
           <w:rFonts w:ascii="Times New Roman" w:hAnsi="Times New Roman"/>
           <w:b/>
-          <w:color w:val="173D52"/>
+          <w:color w:val="000000"/>
           <w:sz w:val="28"/>
         </w:rPr>
         <w:t>Abstract</w:t>
@@ -71,7 +71,7 @@
           <w:color w:val="202A32"/>
           <w:sz w:val="20"/>
         </w:rPr>
-        <w:t>Vision transformers represent an image as a fixed sequence of patch slots, yet the role of each slot’s image-specific content in late layers remains unclear. We causally replace selected late-layer patch activations with class-agnostic calibration surrogates while preserving token slots, sequence length, model weights, and all subsequent computation. In the tested models, this fixed-slot content replacement reveals conditional fungibility bounded by feature geometry and token diversity, distinct from token pruning or merging. Mechanistic audits associate replaceability with anisotropic downstream transmission, coherent accumulation and cancellation through the attention value path, and a larger functional near-null subspace in later layers. We use an end-to-end downstream Jacobian to define a compression objective and evaluate it on 1,000 held-out images per architecture. At the most aggressive tested budgets, operator-aware variants improve classification accuracy by 4.2–12.0 percentage points over the strongest pruning baseline for each architecture; the accuracy-token frontier shifts on three of four architectures, while a strong merging baseline remains competitive. A separate classifier-carrier study shows that gains in linearized operator space do not reliably improve nonlinear classification or establish a general deployment frontier. The evidence supports a bounded vision-transformer-specific causal chain from fixed-slot patch-content replacement through geometry and coherent functional transmission to downstream compression, with limited translation to practical carrier corrections.</w:t>
+        <w:t>Vision transformers represent an image as a fixed sequence of patch slots, yet the role of each slot’s image-specific content in late layers remains unclear. We causally replace selected late-layer patch activations with class-agnostic calibration surrogates while preserving token slots, sequence length, model weights, and all subsequent computation. In the tested models, this fixed-slot content replacement reveals conditional fungibility bounded by feature geometry and token diversity, distinct from token pruning or merging. Mechanistic audits associate replaceability with anisotropic downstream transmission, coherent accumulation and cancellation through the attention value path, and growth of a threshold-defined near-null subspace in an empirical margin-gradient feature metric at later layers. We use an end-to-end downstream Jacobian to define a compression objective and evaluate it on 1,000 held-out images per architecture. At the most aggressive tested budgets, operator-aware variants improve classification accuracy by 4.2–12.0 percentage points over the strongest pruning baseline for each architecture; the accuracy-token frontier shifts on three of four architectures, while a strong merging baseline remains competitive. A separate classifier-carrier study shows that gains in linearized operator space do not reliably improve nonlinear classification or establish a general deployment frontier. The evidence supports a bounded vision-transformer-specific causal chain from fixed-slot patch-content replacement through geometry and coherent functional transmission to downstream compression, with limited translation to practical carrier corrections.</w:t>
       </w:r>
     </w:p>
     <w:p>
@@ -83,7 +83,7 @@
         <w:rPr>
           <w:rFonts w:ascii="Times New Roman" w:hAnsi="Times New Roman"/>
           <w:b/>
-          <w:color w:val="173D52"/>
+          <w:color w:val="000000"/>
           <w:sz w:val="28"/>
         </w:rPr>
         <w:t>1. Introduction</w:t>
@@ -267,11 +267,12 @@
           <w:color w:val="202A32"/>
           <w:sz w:val="20"/>
         </w:rPr>
-        <w:t>We answer with a controlled content intervention. At a selected late layer, image-specific patch activations are causally removed and replaced with class-agnostic calibration surrogates while token slots, sequence length, model weights, and all downstream computation are held fixed. The intervention isolates content dependence while preserving the structure of the sequence received by later layers. Replaceability is conditional: tolerated content changes depend on feature geometry and token diversity, and this result does not establish that deleting a token is harmless. Fig. 1 maps the intervention to the geometric constraints, anisotropic and coherent transmission, Value-path cancellation, downstream operator, and compression study.</w:t>
+        <w:t>We answer with a controlled content intervention. At a selected late layer, image-specific patch activations are causally removed and replaced with class-agnostic calibration surrogates while token slots, sequence length, model weights, and all downstream computation are held fixed. The intervention isolates content dependence while preserving the structure of the sequence received by later layers. Replaceability is conditional on feature geometry and token diversity; the intervention tests content substitution with fixed token slots rather than token deletion. Fig. 1 summarizes the fixed-slot intervention, geometric and diversity constraints, and selective transmission through anisotropic sensitivity and Value-path cancellation.</w:t>
       </w:r>
     </w:p>
     <w:p>
       <w:pPr>
+        <w:keepNext/>
         <w:keepLines/>
         <w:spacing w:after="20"/>
         <w:jc w:val="center"/>
@@ -313,6 +314,7 @@
     </w:p>
     <w:p>
       <w:pPr>
+        <w:keepLines/>
         <w:spacing w:after="80"/>
         <w:jc w:val="center"/>
       </w:pPr>
@@ -323,7 +325,7 @@
           <w:color w:val="4C5963"/>
           <w:sz w:val="17"/>
         </w:rPr>
-        <w:t>Fig. 1. Conceptual overview of (a) fixed-slot late-layer patch-content substitution, (b) geometry, token-diversity, and Value-path cancellation constraints, and (c) anisotropic downstream transmission. The schematic summarizes the paper’s mechanisms and is not a quantitative result.</w:t>
+        <w:t>Fig. 1. Fixed-slot late-layer patch-content substitution (a), geometric and diversity constraints (b), and anisotropic sensitivity with Value-path cancellation (c).</w:t>
       </w:r>
     </w:p>
     <w:p>
@@ -337,7 +339,7 @@
           <w:color w:val="202A32"/>
           <w:sz w:val="20"/>
         </w:rPr>
-        <w:t>The contribution is the connected ViT-specific causal chain: fixed-slot patch-content substitution, geometric and diversity constraints, Value-mediated coherence and cancellation, downstream-persistent functional transmission, and operator-aware token compression. We do not claim novelty for Jacobians, singular-value decompositions, anisotropy in general, token redundancy, pruning, merging, low-rank operators, or generic output-aware compression. The predictor and practical-carrier branch remains secondary: operator-space improvement is observed, but translation to nonlinear classification and deployment is limited in the measured settings.</w:t>
+        <w:t>The contribution is the connected ViT-specific causal chain: fixed-slot patch-content substitution, geometric and diversity constraints, Value-mediated coherence and cancellation, downstream-persistent functional transmission, and operator-aware token compression. The analytical tools and efficiency mechanisms involved—Jacobians, singular-value decompositions, anisotropy analysis, token redundancy, pruning, merging, low-rank operators, and output-aware compression—are established; the contribution lies in their connection through this ViT-specific causal chain. The predictor and practical-carrier branch remains secondary: operator-space improvement is observed, but translation to nonlinear classification and deployment is limited in the measured settings.</w:t>
       </w:r>
     </w:p>
     <w:p>
@@ -349,7 +351,7 @@
         <w:rPr>
           <w:rFonts w:ascii="Times New Roman" w:hAnsi="Times New Roman"/>
           <w:b/>
-          <w:color w:val="173D52"/>
+          <w:color w:val="000000"/>
           <w:sz w:val="28"/>
         </w:rPr>
         <w:t>2. Related Work</w:t>
@@ -601,7 +603,7 @@
           <w:color w:val="202A32"/>
           <w:sz w:val="20"/>
         </w:rPr>
-        <w:t>. These works are relevant precedents for compression, but they do not establish the PCF claim or evaluate the fixed-slot patch-content intervention. We use a downstream operator as an empirical objective for grouping and correcting patch carriers; the Jacobian, singular-value decomposition, and output-sensitive objectives themselves are established tools.</w:t>
+        <w:t>. These works provide precedents for compression; PCF instead evaluates a fixed-slot patch-content intervention. We use a downstream operator as an empirical objective for grouping and correcting patch carriers; the Jacobian, singular-value decomposition, and output-sensitive objectives themselves are established tools.</w:t>
       </w:r>
     </w:p>
     <w:p>
@@ -678,10 +680,10 @@
         <w:rPr>
           <w:rFonts w:ascii="Times New Roman" w:hAnsi="Times New Roman"/>
           <w:b/>
-          <w:color w:val="173D52"/>
+          <w:color w:val="000000"/>
           <w:sz w:val="28"/>
         </w:rPr>
-        <w:t>3. Experimental Scope and Measurement Units</w:t>
+        <w:t>3. Experimental Setup and Interventions</w:t>
       </w:r>
     </w:p>
     <w:p>
@@ -695,7 +697,7 @@
           <w:color w:val="202A32"/>
           <w:sz w:val="20"/>
         </w:rPr>
-        <w:t>The paper reports distinct evidence cohorts and keeps their units separate. Table I lists the sampling unit and inference scope for each study. Here, N denotes the count of the stated sampling unit; it is not interchangeable across image-based and perturbation-based studies. Top-1 accuracy means the fraction of evaluated images for which the highest-scoring class equals the ground-truth label.</w:t>
+        <w:t>The analyses use distinct evidence cohorts, with each sampling unit reported separately. Table I lists the sampling unit and inference scope for each study. Here, N denotes the count of the stated sampling unit, which differs across image-based and perturbation-based studies. Top-1 accuracy is the fraction of evaluated images for which the highest-scoring class equals the ground-truth label.</w:t>
       </w:r>
     </w:p>
     <w:p>
@@ -1998,6 +2000,7 @@
     </w:p>
     <w:p>
       <w:pPr>
+        <w:keepLines/>
         <w:spacing w:after="80"/>
         <w:jc w:val="center"/>
       </w:pPr>
@@ -2022,23 +2025,123 @@
           <w:color w:val="202A32"/>
           <w:sz w:val="20"/>
         </w:rPr>
-        <w:t>For the intervention, let P_ℓ∈ℝ^{N×D} be the matrix of N patch activations at layer ℓ, and let p_{ℓ,i}∈ℝ^D denote row i. The class-agnostic calibration surrogate for that row is r_{ℓ,i}. The binary indicator m_i is one only for selected slots:</w:t>
+        <w:t>In the equations, N</w:t>
+      </w:r>
+      <w:r>
+        <w:rPr>
+          <w:rFonts w:ascii="Times New Roman" w:hAnsi="Times New Roman"/>
+          <w:i w:val="0"/>
+          <w:color w:val="202A32"/>
+          <w:sz w:val="20"/>
+          <w:vertAlign w:val="subscript"/>
+        </w:rPr>
+        <w:t>img</w:t>
+      </w:r>
+      <w:r>
+        <w:rPr>
+          <w:rFonts w:ascii="Times New Roman" w:hAnsi="Times New Roman"/>
+          <w:i w:val="0"/>
+          <w:color w:val="202A32"/>
+          <w:sz w:val="20"/>
+        </w:rPr>
+        <w:t xml:space="preserve"> denotes the number of image samples, n_p the number of spatial patch slots, and D the feature dimension; Table I reports N alongside each study's sampling unit. For the fixed-slot intervention, let P_ℓ∈ℝ^{n_p×D} contain the patch activations at layer ℓ, with p_{ℓ,i}∈ℝ^D as row i and r_{ℓ,i} its class-agnostic calibration surrogate. The binary indicator u_i selects the slots to replace:</w:t>
       </w:r>
     </w:p>
-    <w:p>
-      <w:pPr>
-        <w:keepLines/>
-        <w:spacing w:before="40" w:after="80"/>
+    <w:tbl>
+      <w:tblPr>
+        <w:tblW w:type="auto" w:w="0"/>
         <w:jc w:val="center"/>
-      </w:pPr>
-      <m:oMathPara>
-        <m:oMath>
-          <m:r>
-            <m:t xml:space="preserve">p̃ₗ,ᵢ=(1−mᵢ)pₗ,ᵢ+mᵢ rₗ,ᵢ, mᵢ∈{0,1}, i=1,…,N.</m:t>
-          </m:r>
-        </m:oMath>
-      </m:oMathPara>
-    </w:p>
+        <w:tblLayout w:type="fixed"/>
+        <w:tblLook w:firstColumn="1" w:firstRow="1" w:lastColumn="0" w:lastRow="0" w:noHBand="0" w:noVBand="1" w:val="04A0"/>
+        <w:tblW w:w="9994" w:type="dxa"/>
+        <w:tblBorders>
+          <w:top w:val="nil"/>
+          <w:left w:val="nil"/>
+          <w:bottom w:val="nil"/>
+          <w:right w:val="nil"/>
+          <w:insideH w:val="nil"/>
+          <w:insideV w:val="nil"/>
+        </w:tblBorders>
+      </w:tblPr>
+      <w:tblGrid>
+        <w:gridCol w:w="518"/>
+        <w:gridCol w:w="8957"/>
+        <w:gridCol w:w="518"/>
+      </w:tblGrid>
+      <w:tr>
+        <w:trPr>
+          <w:cantSplit/>
+        </w:trPr>
+        <w:tc>
+          <w:tcPr>
+            <w:tcW w:type="dxa" w:w="518"/>
+            <w:vAlign w:val="center"/>
+            <w:tcMar>
+              <w:top w:w="0" w:type="dxa"/>
+              <w:left w:w="0" w:type="dxa"/>
+              <w:bottom w:w="0" w:type="dxa"/>
+              <w:right w:w="0" w:type="dxa"/>
+            </w:tcMar>
+          </w:tcPr>
+          <w:p>
+            <w:pPr>
+              <w:keepLines/>
+              <w:spacing w:before="40" w:after="80" w:line="240" w:lineRule="auto"/>
+            </w:pPr>
+          </w:p>
+        </w:tc>
+        <w:tc>
+          <w:tcPr>
+            <w:tcW w:type="dxa" w:w="8957"/>
+            <w:vAlign w:val="center"/>
+            <w:tcMar>
+              <w:top w:w="0" w:type="dxa"/>
+              <w:left w:w="0" w:type="dxa"/>
+              <w:bottom w:w="0" w:type="dxa"/>
+              <w:right w:w="0" w:type="dxa"/>
+            </w:tcMar>
+          </w:tcPr>
+          <w:p>
+            <w:pPr>
+              <w:keepLines/>
+              <w:spacing w:before="0" w:after="0" w:line="240" w:lineRule="auto"/>
+              <w:jc w:val="center"/>
+            </w:pPr>
+            <m:oMath>
+              <m:r>
+                <m:t xml:space="preserve">p~[l,i]=(1−u[i])p[l,i]+u[i] r[l,i], u[i]∈{0,1}, i=1, …, n_p.</m:t>
+              </m:r>
+            </m:oMath>
+          </w:p>
+        </w:tc>
+        <w:tc>
+          <w:tcPr>
+            <w:tcW w:type="dxa" w:w="518"/>
+            <w:vAlign w:val="center"/>
+            <w:tcMar>
+              <w:top w:w="0" w:type="dxa"/>
+              <w:left w:w="0" w:type="dxa"/>
+              <w:bottom w:w="0" w:type="dxa"/>
+              <w:right w:w="0" w:type="dxa"/>
+            </w:tcMar>
+          </w:tcPr>
+          <w:p>
+            <w:pPr>
+              <w:keepLines/>
+              <w:spacing w:before="40" w:after="80" w:line="240" w:lineRule="auto"/>
+              <w:jc w:val="right"/>
+            </w:pPr>
+            <w:r>
+              <w:rPr>
+                <w:rFonts w:ascii="Times New Roman" w:hAnsi="Times New Roman"/>
+                <w:sz w:val="18"/>
+              </w:rPr>
+              <w:t>(1)</w:t>
+            </w:r>
+          </w:p>
+        </w:tc>
+      </w:tr>
+    </w:tbl>
     <w:p>
       <w:pPr>
         <w:spacing w:after="100" w:line="259" w:lineRule="auto"/>
@@ -2050,7 +2153,7 @@
           <w:color w:val="202A32"/>
           <w:sz w:val="20"/>
         </w:rPr>
-        <w:t>Thus, when m_i=0 the original activation remains, and when m_i=1 it is replaced by the corresponding surrogate. The class token, position indices, number of rows, model weights, and subsequent computation remain unchanged. The intervention therefore isolates dependence on image-specific content; it does not test whether deleting a token can be harmless.</w:t>
+        <w:t>Thus, when u_i=0 the original activation remains, and when u_i=1 it is replaced by the corresponding surrogate. The class token, position indices, number of rows, model weights, and subsequent computation remain unchanged. The intervention isolates dependence on image-specific content while keeping token slots fixed.</w:t>
       </w:r>
     </w:p>
     <w:p>
@@ -2076,10 +2179,25 @@
         <w:rPr>
           <w:rFonts w:ascii="Times New Roman" w:hAnsi="Times New Roman"/>
           <w:b/>
-          <w:color w:val="173D52"/>
+          <w:color w:val="000000"/>
           <w:sz w:val="28"/>
         </w:rPr>
-        <w:t>4. Late Patch-Content Fungibility Has Geometric and Diversity Boundaries</w:t>
+        <w:t>4. Geometric and Diversity Constraints on Patch-Content Fungibility</w:t>
+      </w:r>
+    </w:p>
+    <w:p>
+      <w:pPr>
+        <w:pStyle w:val="Heading2"/>
+        <w:keepNext/>
+      </w:pPr>
+      <w:r>
+        <w:rPr>
+          <w:rFonts w:ascii="Times New Roman" w:hAnsi="Times New Roman"/>
+          <w:b/>
+          <w:color w:val="000000"/>
+          <w:sz w:val="23"/>
+        </w:rPr>
+        <w:t>4.1 Depth-Dependent Replacement Tolerance</w:t>
       </w:r>
     </w:p>
     <w:p>
@@ -2098,6 +2216,7 @@
     </w:p>
     <w:p>
       <w:pPr>
+        <w:keepNext/>
         <w:keepLines/>
         <w:spacing w:after="20"/>
         <w:jc w:val="center"/>
@@ -2139,6 +2258,7 @@
     </w:p>
     <w:p>
       <w:pPr>
+        <w:keepLines/>
         <w:spacing w:after="80"/>
         <w:jc w:val="center"/>
       </w:pPr>
@@ -2150,6 +2270,21 @@
           <w:sz w:val="17"/>
         </w:rPr>
         <w:t>Fig. 2. Depth-wise replacement accuracy for ViT-B/16 AugReg and DINOv2 under 25% spatial-patch replacement. Original V1 depths are 5, 7, 8, 9, and 10; depth 6 is a separately recorded follow-up. Each evaluation uses N=1,000 images per model. Error bars show Gaussian seed-level standard deviation; dashed lines mark clean accuracy.</w:t>
+      </w:r>
+    </w:p>
+    <w:p>
+      <w:pPr>
+        <w:pStyle w:val="Heading2"/>
+        <w:keepNext/>
+      </w:pPr>
+      <w:r>
+        <w:rPr>
+          <w:rFonts w:ascii="Times New Roman" w:hAnsi="Times New Roman"/>
+          <w:b/>
+          <w:color w:val="000000"/>
+          <w:sz w:val="23"/>
+        </w:rPr>
+        <w:t>4.2 Geometric and Diversity Constraints</w:t>
       </w:r>
     </w:p>
     <w:p>
@@ -2168,6 +2303,7 @@
     </w:p>
     <w:p>
       <w:pPr>
+        <w:keepNext/>
         <w:keepLines/>
         <w:spacing w:after="20"/>
         <w:jc w:val="center"/>
@@ -2209,6 +2345,7 @@
     </w:p>
     <w:p>
       <w:pPr>
+        <w:keepLines/>
         <w:spacing w:after="80"/>
         <w:jc w:val="center"/>
       </w:pPr>
@@ -2245,10 +2382,25 @@
         <w:rPr>
           <w:rFonts w:ascii="Times New Roman" w:hAnsi="Times New Roman"/>
           <w:b/>
-          <w:color w:val="173D52"/>
+          <w:color w:val="000000"/>
           <w:sz w:val="28"/>
         </w:rPr>
-        <w:t>5. Anisotropic Transmission, Value-Path Cancellation, and End-to-End Geometry</w:t>
+        <w:t>5. Functional Geometry and Attention-Mediated Transmission</w:t>
+      </w:r>
+    </w:p>
+    <w:p>
+      <w:pPr>
+        <w:pStyle w:val="Heading2"/>
+        <w:keepNext/>
+      </w:pPr>
+      <w:r>
+        <w:rPr>
+          <w:rFonts w:ascii="Times New Roman" w:hAnsi="Times New Roman"/>
+          <w:b/>
+          <w:color w:val="000000"/>
+          <w:sz w:val="23"/>
+        </w:rPr>
+        <w:t>5.1 Anisotropy and Functional Geometry</w:t>
       </w:r>
     </w:p>
     <w:p>
@@ -2262,11 +2414,12 @@
           <w:color w:val="202A32"/>
           <w:sz w:val="20"/>
         </w:rPr>
-        <w:t>Functional transmission is direction-dependent. In the attention causal audit (N=100 evaluation images), the frozen-attention Value-only path explains 70.8% of the defined coherence-gap margin effect in DeiT-Small and 102.2% in ViT-B/16 AugReg. The same path reproduces approximately 97.4% and 99.3% of the immediate readout disturbance, respectively. The ratio above 100% in ViT-B/16 AugReg is possible because a secondary contribution partially opposes the Value-path effect. Perturbing patch keys does not change the unperturbed classification-token query in this setup, so the immediate query contribution is zero; key-mediated rerouting remains secondary rather than absent. The frozen-attention algebraic parity check is not independent generalization evidence. Fig. 4 summarizes the audited depth-wise sensitivity pattern, and Fig. 5 compares coherent with sign-varying Value-path transmission.</w:t>
+        <w:t>Functional transmission is direction-dependent. Fig. 4 summarizes the audited depth-wise sensitivity pattern.</w:t>
       </w:r>
     </w:p>
     <w:p>
       <w:pPr>
+        <w:keepNext/>
         <w:keepLines/>
         <w:spacing w:after="20"/>
         <w:jc w:val="center"/>
@@ -2274,7 +2427,7 @@
       <w:r>
         <w:drawing>
           <wp:inline xmlns:a="http://schemas.openxmlformats.org/drawingml/2006/main" xmlns:pic="http://schemas.openxmlformats.org/drawingml/2006/picture">
-            <wp:extent cx="6172200" cy="1942418"/>
+            <wp:extent cx="6172200" cy="1986239"/>
             <wp:docPr id="4" name="Picture 4"/>
             <wp:cNvGraphicFramePr>
               <a:graphicFrameLocks noChangeAspect="1"/>
@@ -2295,7 +2448,7 @@
                   <pic:spPr>
                     <a:xfrm>
                       <a:off x="0" y="0"/>
-                      <a:ext cx="6172200" cy="1942418"/>
+                      <a:ext cx="6172200" cy="1986239"/>
                     </a:xfrm>
                     <a:prstGeom prst="rect"/>
                   </pic:spPr>
@@ -2308,6 +2461,7 @@
     </w:p>
     <w:p>
       <w:pPr>
+        <w:keepLines/>
         <w:spacing w:after="80"/>
         <w:jc w:val="center"/>
       </w:pPr>
@@ -2318,11 +2472,225 @@
           <w:color w:val="4C5963"/>
           <w:sz w:val="17"/>
         </w:rPr>
-        <w:t>Fig. 4. (a) Ratio of downstream sensitivity along PC1 (the activation direction with the largest calibration variance) to sensitivity along the lowest-variance PC (the direction with the smallest calibration variance), across depths in the N=100 functional-geometry pilot. (b) Depth-8 PCA score-density maps for DeiT-Small and ViT-B/16 AugReg. Each observation is a patch activation from the 100-image pilot cohort; axes are standardized per model and component to show the score distributions, so the plotted spread does not represent their raw variance difference. Patch tokens are not independent image samples; downstream sensitivity is measured in (a).</w:t>
+        <w:t>Fig. 4. (a) Ratio of the empirical margin-gradient metric sensitivity vᵀM_ℓv along PC1 to that along PC-bottom across depths in the N=100 functional-geometry pilot. The PCs are eigenvectors of the centered calibration-activation covariance, separate from M_ℓ. (b) Depth-8 PCA score-density maps for DeiT-Small and ViT-B/16 AugReg. Each observation is a patch activation from the 100-image pilot cohort; axes are standardized per model and component to show score distributions, so the plotted spread does not represent their raw variance difference. Patch tokens are not independent image samples; panel (a) is not computed from the full downstream readout Jacobian used in compression.</w:t>
       </w:r>
     </w:p>
     <w:p>
       <w:pPr>
+        <w:spacing w:after="100" w:line="259" w:lineRule="auto"/>
+      </w:pPr>
+      <w:r>
+        <w:rPr>
+          <w:rFonts w:ascii="Times New Roman" w:hAnsi="Times New Roman"/>
+          <w:i w:val="0"/>
+          <w:color w:val="202A32"/>
+          <w:sz w:val="20"/>
+        </w:rPr>
+        <w:t>For image s, let y_s and r_s be the clean predicted and runner-up classes, and let z_s denote its final logits. The functional-geometry pilot differentiates this scalar class margin with respect to each patch feature, then averages the per-patch gradient outer products:</w:t>
+      </w:r>
+    </w:p>
+    <w:tbl>
+      <w:tblPr>
+        <w:tblW w:type="auto" w:w="0"/>
+        <w:jc w:val="center"/>
+        <w:tblLayout w:type="fixed"/>
+        <w:tblLook w:firstColumn="1" w:firstRow="1" w:lastColumn="0" w:lastRow="0" w:noHBand="0" w:noVBand="1" w:val="04A0"/>
+        <w:tblW w:w="9994" w:type="dxa"/>
+        <w:tblBorders>
+          <w:top w:val="nil"/>
+          <w:left w:val="nil"/>
+          <w:bottom w:val="nil"/>
+          <w:right w:val="nil"/>
+          <w:insideH w:val="nil"/>
+          <w:insideV w:val="nil"/>
+        </w:tblBorders>
+      </w:tblPr>
+      <w:tblGrid>
+        <w:gridCol w:w="518"/>
+        <w:gridCol w:w="8957"/>
+        <w:gridCol w:w="518"/>
+      </w:tblGrid>
+      <w:tr>
+        <w:trPr>
+          <w:cantSplit/>
+        </w:trPr>
+        <w:tc>
+          <w:tcPr>
+            <w:tcW w:type="dxa" w:w="518"/>
+            <w:vAlign w:val="center"/>
+            <w:tcMar>
+              <w:top w:w="0" w:type="dxa"/>
+              <w:left w:w="0" w:type="dxa"/>
+              <w:bottom w:w="0" w:type="dxa"/>
+              <w:right w:w="0" w:type="dxa"/>
+            </w:tcMar>
+          </w:tcPr>
+          <w:p>
+            <w:pPr>
+              <w:keepLines/>
+              <w:spacing w:before="40" w:after="80" w:line="240" w:lineRule="auto"/>
+            </w:pPr>
+          </w:p>
+        </w:tc>
+        <w:tc>
+          <w:tcPr>
+            <w:tcW w:type="dxa" w:w="8957"/>
+            <w:vAlign w:val="center"/>
+            <w:tcMar>
+              <w:top w:w="0" w:type="dxa"/>
+              <w:left w:w="0" w:type="dxa"/>
+              <w:bottom w:w="0" w:type="dxa"/>
+              <w:right w:w="0" w:type="dxa"/>
+            </w:tcMar>
+          </w:tcPr>
+          <w:p>
+            <w:pPr>
+              <w:keepLines/>
+              <w:spacing w:before="0" w:after="0" w:line="240" w:lineRule="auto"/>
+              <w:jc w:val="center"/>
+            </w:pPr>
+            <m:oMath>
+              <m:r>
+                <m:t xml:space="preserve">g[s,i]=grad[p[l,s,i]](z[s,y[s]]−z[s,r[s]]),</m:t>
+              </m:r>
+            </m:oMath>
+          </w:p>
+          <w:p>
+            <w:pPr>
+              <w:keepLines/>
+              <w:spacing w:before="0" w:after="0" w:line="240" w:lineRule="auto"/>
+              <w:jc w:val="center"/>
+            </w:pPr>
+            <m:oMath>
+              <m:r>
+                <m:t xml:space="preserve">M[l]=(1/(</m:t>
+              </m:r>
+              <m:sSub>
+                <m:e>
+                  <m:r>
+                    <m:t xml:space="preserve">N</m:t>
+                  </m:r>
+                </m:e>
+                <m:sub>
+                  <m:r>
+                    <m:t xml:space="preserve">img</m:t>
+                  </m:r>
+                </m:sub>
+              </m:sSub>
+              <m:r>
+                <m:t xml:space="preserve"> n_p))Σ[s=1]^</m:t>
+              </m:r>
+              <m:sSub>
+                <m:e>
+                  <m:r>
+                    <m:t xml:space="preserve">N</m:t>
+                  </m:r>
+                </m:e>
+                <m:sub>
+                  <m:r>
+                    <m:t xml:space="preserve">img</m:t>
+                  </m:r>
+                </m:sub>
+              </m:sSub>
+              <m:r>
+                <m:t xml:space="preserve">Σ[i=1]^n_p g[s,i]g[s,i]^T.</m:t>
+              </m:r>
+            </m:oMath>
+          </w:p>
+        </w:tc>
+        <w:tc>
+          <w:tcPr>
+            <w:tcW w:type="dxa" w:w="518"/>
+            <w:vAlign w:val="center"/>
+            <w:tcMar>
+              <w:top w:w="0" w:type="dxa"/>
+              <w:left w:w="0" w:type="dxa"/>
+              <w:bottom w:w="0" w:type="dxa"/>
+              <w:right w:w="0" w:type="dxa"/>
+            </w:tcMar>
+          </w:tcPr>
+          <w:p>
+            <w:pPr>
+              <w:keepLines/>
+              <w:spacing w:before="40" w:after="80" w:line="240" w:lineRule="auto"/>
+              <w:jc w:val="right"/>
+            </w:pPr>
+            <w:r>
+              <w:rPr>
+                <w:rFonts w:ascii="Times New Roman" w:hAnsi="Times New Roman"/>
+                <w:sz w:val="18"/>
+              </w:rPr>
+              <w:t>(2)</w:t>
+            </w:r>
+          </w:p>
+        </w:tc>
+      </w:tr>
+    </w:tbl>
+    <w:p>
+      <w:pPr>
+        <w:spacing w:after="100" w:line="259" w:lineRule="auto"/>
+      </w:pPr>
+      <w:r>
+        <w:rPr>
+          <w:rFonts w:ascii="Times New Roman" w:hAnsi="Times New Roman"/>
+          <w:i w:val="0"/>
+          <w:color w:val="202A32"/>
+          <w:sz w:val="20"/>
+        </w:rPr>
+        <w:t>Here M_ℓ∈ℝ^{D×D} is an uncentered second moment of scalar margin gradients, not J_{ℓ→L}ᵀJ_{ℓ→L}. The pilot counts nonnegative eigenvalues no greater than 10⁻³ times the largest as near-null. Its effective rank is exp(−Σ_{k:p_k&gt;10⁻¹²}p_k log p_k), where p_k is eigenvalue k divided by the eigenvalue sum. Thus M_ℓ pools per-token margin gradients without cross-token or full-logit Jacobian structure. PCA uses the separate sample covariance Σ_{act,ℓ} of centered calibration patch-feature rows, with denominator M_cal−1 for M_cal calibration patch observations. This count is the number of calibration patch tokens, not N</w:t>
+      </w:r>
+      <w:r>
+        <w:rPr>
+          <w:rFonts w:ascii="Times New Roman" w:hAnsi="Times New Roman"/>
+          <w:i w:val="0"/>
+          <w:color w:val="202A32"/>
+          <w:sz w:val="20"/>
+          <w:vertAlign w:val="subscript"/>
+        </w:rPr>
+        <w:t>img</w:t>
+      </w:r>
+      <w:r>
+        <w:rPr>
+          <w:rFonts w:ascii="Times New Roman" w:hAnsi="Times New Roman"/>
+          <w:i w:val="0"/>
+          <w:color w:val="202A32"/>
+          <w:sz w:val="20"/>
+        </w:rPr>
+        <w:t>. This covariance is distinct from both M_ℓ and the readout-space solver Gram matrix H_J.</w:t>
+      </w:r>
+    </w:p>
+    <w:p>
+      <w:pPr>
+        <w:pStyle w:val="Heading2"/>
+        <w:keepNext/>
+      </w:pPr>
+      <w:r>
+        <w:rPr>
+          <w:rFonts w:ascii="Times New Roman" w:hAnsi="Times New Roman"/>
+          <w:b/>
+          <w:color w:val="000000"/>
+          <w:sz w:val="23"/>
+        </w:rPr>
+        <w:t>5.2 Value-Path Coherence and Cancellation</w:t>
+      </w:r>
+    </w:p>
+    <w:p>
+      <w:pPr>
+        <w:spacing w:after="100" w:line="259" w:lineRule="auto"/>
+      </w:pPr>
+      <w:r>
+        <w:rPr>
+          <w:rFonts w:ascii="Times New Roman" w:hAnsi="Times New Roman"/>
+          <w:i w:val="0"/>
+          <w:color w:val="202A32"/>
+          <w:sz w:val="20"/>
+        </w:rPr>
+        <w:t>In the attention causal audit (N=100 evaluation images), the frozen-attention Value-only path explains 70.8% of the defined coherence-gap margin effect in DeiT-Small and 102.2% in ViT-B/16 AugReg. The same path reproduces approximately 97.4% and 99.3% of the immediate readout disturbance, respectively. Because a secondary contribution partially opposes the Value-path effect, the Value-only ratio exceeds 100% in ViT-B/16 AugReg. In this setup, perturbing patch keys leaves the unperturbed classification-token query unchanged, so the immediate query contribution is zero; key-mediated rerouting remains secondary. The frozen-attention parity check verifies algebraic consistency rather than generalization. Fig. 5 compares coherent with sign-varying Value-path transmission.</w:t>
+      </w:r>
+    </w:p>
+    <w:p>
+      <w:pPr>
+        <w:keepNext/>
         <w:keepLines/>
         <w:spacing w:after="20"/>
         <w:jc w:val="center"/>
@@ -2364,6 +2732,7 @@
     </w:p>
     <w:p>
       <w:pPr>
+        <w:keepLines/>
         <w:spacing w:after="80"/>
         <w:jc w:val="center"/>
       </w:pPr>
@@ -2388,23 +2757,116 @@
           <w:color w:val="202A32"/>
           <w:sz w:val="20"/>
         </w:rPr>
-        <w:t>With attention weights frozen, the Value-only contribution to the perturbation of readout token i is</w:t>
+        <w:t>For one image and a CLS readout, let w_{h,i}^{clean} be the clean attention weight from patch i to the readout in head h. The signed attention-weighted token pattern and frozen-attention Value-context change are</w:t>
       </w:r>
     </w:p>
-    <w:p>
-      <w:pPr>
-        <w:keepLines/>
-        <w:spacing w:before="40" w:after="80"/>
+    <w:tbl>
+      <w:tblPr>
+        <w:tblW w:type="auto" w:w="0"/>
         <w:jc w:val="center"/>
-      </w:pPr>
-      <m:oMathPara>
-        <m:oMath>
-          <m:r>
-            <m:t xml:space="preserve">Δhᵢⱽ=WₒΣⱼ₌₁ᴺAᵢⱼWᵥδxⱼ.</m:t>
-          </m:r>
-        </m:oMath>
-      </m:oMathPara>
-    </w:p>
+        <w:tblLayout w:type="fixed"/>
+        <w:tblLook w:firstColumn="1" w:firstRow="1" w:lastColumn="0" w:lastRow="0" w:noHBand="0" w:noVBand="1" w:val="04A0"/>
+        <w:tblW w:w="9994" w:type="dxa"/>
+        <w:tblBorders>
+          <w:top w:val="nil"/>
+          <w:left w:val="nil"/>
+          <w:bottom w:val="nil"/>
+          <w:right w:val="nil"/>
+          <w:insideH w:val="nil"/>
+          <w:insideV w:val="nil"/>
+        </w:tblBorders>
+      </w:tblPr>
+      <w:tblGrid>
+        <w:gridCol w:w="518"/>
+        <w:gridCol w:w="8957"/>
+        <w:gridCol w:w="518"/>
+      </w:tblGrid>
+      <w:tr>
+        <w:trPr>
+          <w:cantSplit/>
+        </w:trPr>
+        <w:tc>
+          <w:tcPr>
+            <w:tcW w:type="dxa" w:w="518"/>
+            <w:vAlign w:val="center"/>
+            <w:tcMar>
+              <w:top w:w="0" w:type="dxa"/>
+              <w:left w:w="0" w:type="dxa"/>
+              <w:bottom w:w="0" w:type="dxa"/>
+              <w:right w:w="0" w:type="dxa"/>
+            </w:tcMar>
+          </w:tcPr>
+          <w:p>
+            <w:pPr>
+              <w:keepLines/>
+              <w:spacing w:before="40" w:after="80" w:line="240" w:lineRule="auto"/>
+            </w:pPr>
+          </w:p>
+        </w:tc>
+        <w:tc>
+          <w:tcPr>
+            <w:tcW w:type="dxa" w:w="8957"/>
+            <w:vAlign w:val="center"/>
+            <w:tcMar>
+              <w:top w:w="0" w:type="dxa"/>
+              <w:left w:w="0" w:type="dxa"/>
+              <w:bottom w:w="0" w:type="dxa"/>
+              <w:right w:w="0" w:type="dxa"/>
+            </w:tcMar>
+          </w:tcPr>
+          <w:p>
+            <w:pPr>
+              <w:keepLines/>
+              <w:spacing w:before="0" w:after="0" w:line="240" w:lineRule="auto"/>
+              <w:jc w:val="center"/>
+            </w:pPr>
+            <m:oMath>
+              <m:r>
+                <m:t xml:space="preserve">Γ[h](a)=Σ[i=1]^n_p w[h,i]^clean a[i],</m:t>
+              </m:r>
+            </m:oMath>
+          </w:p>
+          <w:p>
+            <w:pPr>
+              <w:keepLines/>
+              <w:spacing w:before="0" w:after="0" w:line="240" w:lineRule="auto"/>
+              <w:jc w:val="center"/>
+            </w:pPr>
+            <m:oMath>
+              <m:r>
+                <m:t xml:space="preserve">Δc[h]^(V)=Σ[i=1]^n_p w[h,i]^cleanΔv[h,i]∈R^d[h].</m:t>
+              </m:r>
+            </m:oMath>
+          </w:p>
+        </w:tc>
+        <w:tc>
+          <w:tcPr>
+            <w:tcW w:type="dxa" w:w="518"/>
+            <w:vAlign w:val="center"/>
+            <w:tcMar>
+              <w:top w:w="0" w:type="dxa"/>
+              <w:left w:w="0" w:type="dxa"/>
+              <w:bottom w:w="0" w:type="dxa"/>
+              <w:right w:w="0" w:type="dxa"/>
+            </w:tcMar>
+          </w:tcPr>
+          <w:p>
+            <w:pPr>
+              <w:keepLines/>
+              <w:spacing w:before="40" w:after="80" w:line="240" w:lineRule="auto"/>
+              <w:jc w:val="right"/>
+            </w:pPr>
+            <w:r>
+              <w:rPr>
+                <w:rFonts w:ascii="Times New Roman" w:hAnsi="Times New Roman"/>
+                <w:sz w:val="18"/>
+              </w:rPr>
+              <w:t>(3)</w:t>
+            </w:r>
+          </w:p>
+        </w:tc>
+      </w:tr>
+    </w:tbl>
     <w:p>
       <w:pPr>
         <w:spacing w:after="100" w:line="259" w:lineRule="auto"/>
@@ -2416,7 +2878,22 @@
           <w:color w:val="202A32"/>
           <w:sz w:val="20"/>
         </w:rPr>
-        <w:t>Here, A_{ij} is the fixed attention weight from patch j to readout i, W_V and W_O are the Value and output projections, and δx_j is the patch perturbation. When attention weights are held fixed, similarly directed patch perturbations can add through the value aggregation, while sign-varying perturbations can partly cancel. This equation describes the audited Value path; it does not claim that the full nonlinear transformer is globally linear or that the Value path is the only causal route.</w:t>
+        <w:t>Here Δv_{h,i} is the measured change in the post-normalization Value projection for patch i. Γ_h(a) summarizes how the token pattern aligns with clean attention weights; the second expression retains token-specific Value changes and is the pre-output-projection head context audited in code. With attention frozen, coherent signed contributions can add and varying signs can cancel. This frozen-attention decomposition isolates Value-path transmission while leaving nonlinear attention rerouting and other causal paths outside its scope.</w:t>
+      </w:r>
+    </w:p>
+    <w:p>
+      <w:pPr>
+        <w:pStyle w:val="Heading2"/>
+        <w:keepNext/>
+      </w:pPr>
+      <w:r>
+        <w:rPr>
+          <w:rFonts w:ascii="Times New Roman" w:hAnsi="Times New Roman"/>
+          <w:b/>
+          <w:color w:val="000000"/>
+          <w:sz w:val="23"/>
+        </w:rPr>
+        <w:t>5.3 End-to-End Functional Transmission</w:t>
       </w:r>
     </w:p>
     <w:p>
@@ -2430,11 +2907,144 @@
           <w:color w:val="202A32"/>
           <w:sz w:val="20"/>
         </w:rPr>
-        <w:t>Local geometry is not sufficient to characterize later readout damage. The multi-block operator study evaluates N=100 held-out perturbations. On these held-out perturbations, damage prediction has higher correlation for the multi-block operator (Pearson r=0.975; Spearman ρ=0.945) than for the single-block operator (r=0.753; ρ=0.735). The mean principal angle from block 8 to block 9 is 49.0 degrees in the reported comparison. Fig. 6 shows this local-versus-end-to-end comparison. Separately, the N=100-image functional-geometry pilot finds that the threshold-defined downstream functional near-null subspace expands with depth while effective functional rank declines in late layers. This is consistent with greater late-layer replacement tolerance measured in separate interventions, but remains an empirical mechanistic association rather than a theorem or universal explanation. A distinct joint-stream geometry audit (N=100 images per model) finds that downstream damage depends jointly on feature direction and token-space coherence: sensitive feature directions are most damaging under coherent token patterns, whereas functionally near-null directions remain comparatively tolerated across the tested patterns.</w:t>
+        <w:t>Local geometry is not sufficient to characterize later readout damage. The multi-block operator study evaluates N=100 held-out perturbations. On these held-out perturbations, damage prediction has higher correlation for the multi-block operator (Pearson r=0.975; Spearman ρ=0.945) than for the single-block operator (r=0.753; ρ=0.735). The mean principal angle from block 8 to block 9 is 49.0 degrees in the reported comparison. Fig. 6 shows this local-versus-end-to-end comparison. Separately, the N=100-image functional-geometry pilot finds that the threshold-defined near-null subspace of M_ℓ expands with depth while its entropy effective rank declines in late layers. This is consistent with greater late-layer replacement tolerance measured in separate interventions, but remains an empirical mechanistic association rather than a theorem or universal explanation.</w:t>
       </w:r>
     </w:p>
     <w:p>
       <w:pPr>
+        <w:spacing w:after="100" w:line="259" w:lineRule="auto"/>
+      </w:pPr>
+      <w:r>
+        <w:rPr>
+          <w:rFonts w:ascii="Times New Roman" w:hAnsi="Times New Roman"/>
+          <w:b/>
+          <w:color w:val="202A32"/>
+          <w:sz w:val="20"/>
+        </w:rPr>
+        <w:t>Token–feature interaction.</w:t>
+      </w:r>
+      <w:r>
+        <w:rPr>
+          <w:rFonts w:ascii="Times New Roman" w:hAnsi="Times New Roman"/>
+          <w:i w:val="0"/>
+          <w:color w:val="202A32"/>
+          <w:sz w:val="20"/>
+        </w:rPr>
+        <w:t xml:space="preserve"> A distinct joint-stream geometry audit (N=100 images per model) selects feature directions using its own per-image mean patch-margin-gradient metric, separate from M_ℓ in the functional-geometry pilot and from the full-logit J_{ℓ→L} used in compression. It finds that downstream damage depends jointly on feature direction and token-space coherence: sensitive feature directions are most damaging under coherent token patterns, whereas functionally near-null directions remain comparatively tolerated across the tested patterns. The audit injects the norm-matched rank-one perturbation</w:t>
+      </w:r>
+    </w:p>
+    <w:tbl>
+      <w:tblPr>
+        <w:tblW w:type="auto" w:w="0"/>
+        <w:jc w:val="center"/>
+        <w:tblLayout w:type="fixed"/>
+        <w:tblLook w:firstColumn="1" w:firstRow="1" w:lastColumn="0" w:lastRow="0" w:noHBand="0" w:noVBand="1" w:val="04A0"/>
+        <w:tblW w:w="9994" w:type="dxa"/>
+        <w:tblBorders>
+          <w:top w:val="nil"/>
+          <w:left w:val="nil"/>
+          <w:bottom w:val="nil"/>
+          <w:right w:val="nil"/>
+          <w:insideH w:val="nil"/>
+          <w:insideV w:val="nil"/>
+        </w:tblBorders>
+      </w:tblPr>
+      <w:tblGrid>
+        <w:gridCol w:w="518"/>
+        <w:gridCol w:w="8957"/>
+        <w:gridCol w:w="518"/>
+      </w:tblGrid>
+      <w:tr>
+        <w:trPr>
+          <w:cantSplit/>
+        </w:trPr>
+        <w:tc>
+          <w:tcPr>
+            <w:tcW w:type="dxa" w:w="518"/>
+            <w:vAlign w:val="center"/>
+            <w:tcMar>
+              <w:top w:w="0" w:type="dxa"/>
+              <w:left w:w="0" w:type="dxa"/>
+              <w:bottom w:w="0" w:type="dxa"/>
+              <w:right w:w="0" w:type="dxa"/>
+            </w:tcMar>
+          </w:tcPr>
+          <w:p>
+            <w:pPr>
+              <w:keepLines/>
+              <w:spacing w:before="40" w:after="80" w:line="240" w:lineRule="auto"/>
+            </w:pPr>
+          </w:p>
+        </w:tc>
+        <w:tc>
+          <w:tcPr>
+            <w:tcW w:type="dxa" w:w="8957"/>
+            <w:vAlign w:val="center"/>
+            <w:tcMar>
+              <w:top w:w="0" w:type="dxa"/>
+              <w:left w:w="0" w:type="dxa"/>
+              <w:bottom w:w="0" w:type="dxa"/>
+              <w:right w:w="0" w:type="dxa"/>
+            </w:tcMar>
+          </w:tcPr>
+          <w:p>
+            <w:pPr>
+              <w:keepLines/>
+              <w:spacing w:before="0" w:after="0" w:line="240" w:lineRule="auto"/>
+              <w:jc w:val="center"/>
+            </w:pPr>
+            <m:oMath>
+              <m:r>
+                <m:t xml:space="preserve">ΔP[l]=α a v^T, a∈R^n_p, v∈R^D, ||a||[2]=||v||[2]=1, ||ΔP[l]||[F]=α.</m:t>
+              </m:r>
+            </m:oMath>
+          </w:p>
+        </w:tc>
+        <w:tc>
+          <w:tcPr>
+            <w:tcW w:type="dxa" w:w="518"/>
+            <w:vAlign w:val="center"/>
+            <w:tcMar>
+              <w:top w:w="0" w:type="dxa"/>
+              <w:left w:w="0" w:type="dxa"/>
+              <w:bottom w:w="0" w:type="dxa"/>
+              <w:right w:w="0" w:type="dxa"/>
+            </w:tcMar>
+          </w:tcPr>
+          <w:p>
+            <w:pPr>
+              <w:keepLines/>
+              <w:spacing w:before="40" w:after="80" w:line="240" w:lineRule="auto"/>
+              <w:jc w:val="right"/>
+            </w:pPr>
+            <w:r>
+              <w:rPr>
+                <w:rFonts w:ascii="Times New Roman" w:hAnsi="Times New Roman"/>
+                <w:sz w:val="18"/>
+              </w:rPr>
+              <w:t>(4)</w:t>
+            </w:r>
+          </w:p>
+        </w:tc>
+      </w:tr>
+    </w:tbl>
+    <w:p>
+      <w:pPr>
+        <w:spacing w:after="100" w:line="259" w:lineRule="auto"/>
+      </w:pPr>
+      <w:r>
+        <w:rPr>
+          <w:rFonts w:ascii="Times New Roman" w:hAnsi="Times New Roman"/>
+          <w:i w:val="0"/>
+          <w:color w:val="202A32"/>
+          <w:sz w:val="20"/>
+        </w:rPr>
+        <w:t>with α=sσ_ℓ≥0; consequently α is the Frobenius norm of the injected patch perturbation.</w:t>
+      </w:r>
+    </w:p>
+    <w:p>
+      <w:pPr>
+        <w:keepNext/>
         <w:keepLines/>
         <w:spacing w:after="20"/>
         <w:jc w:val="center"/>
@@ -2476,6 +3086,7 @@
     </w:p>
     <w:p>
       <w:pPr>
+        <w:keepLines/>
         <w:spacing w:after="80"/>
         <w:jc w:val="center"/>
       </w:pPr>
@@ -2500,22 +3111,159 @@
           <w:color w:val="202A32"/>
           <w:sz w:val="20"/>
         </w:rPr>
-        <w:t>The end-to-end linearization used in this comparison is</w:t>
+        <w:t>The end-to-end linearization maps all patch features at layer ℓ to the final classifier-logit vector z∈ℝ^{d_z}:</w:t>
+      </w:r>
+    </w:p>
+    <w:tbl>
+      <w:tblPr>
+        <w:tblW w:type="auto" w:w="0"/>
+        <w:jc w:val="center"/>
+        <w:tblLayout w:type="fixed"/>
+        <w:tblLook w:firstColumn="1" w:firstRow="1" w:lastColumn="0" w:lastRow="0" w:noHBand="0" w:noVBand="1" w:val="04A0"/>
+        <w:tblW w:w="9994" w:type="dxa"/>
+        <w:tblBorders>
+          <w:top w:val="nil"/>
+          <w:left w:val="nil"/>
+          <w:bottom w:val="nil"/>
+          <w:right w:val="nil"/>
+          <w:insideH w:val="nil"/>
+          <w:insideV w:val="nil"/>
+        </w:tblBorders>
+      </w:tblPr>
+      <w:tblGrid>
+        <w:gridCol w:w="518"/>
+        <w:gridCol w:w="8957"/>
+        <w:gridCol w:w="518"/>
+      </w:tblGrid>
+      <w:tr>
+        <w:trPr>
+          <w:cantSplit/>
+        </w:trPr>
+        <w:tc>
+          <w:tcPr>
+            <w:tcW w:type="dxa" w:w="518"/>
+            <w:vAlign w:val="center"/>
+            <w:tcMar>
+              <w:top w:w="0" w:type="dxa"/>
+              <w:left w:w="0" w:type="dxa"/>
+              <w:bottom w:w="0" w:type="dxa"/>
+              <w:right w:w="0" w:type="dxa"/>
+            </w:tcMar>
+          </w:tcPr>
+          <w:p>
+            <w:pPr>
+              <w:keepLines/>
+              <w:spacing w:before="40" w:after="80" w:line="240" w:lineRule="auto"/>
+            </w:pPr>
+          </w:p>
+        </w:tc>
+        <w:tc>
+          <w:tcPr>
+            <w:tcW w:type="dxa" w:w="8957"/>
+            <w:vAlign w:val="center"/>
+            <w:tcMar>
+              <w:top w:w="0" w:type="dxa"/>
+              <w:left w:w="0" w:type="dxa"/>
+              <w:bottom w:w="0" w:type="dxa"/>
+              <w:right w:w="0" w:type="dxa"/>
+            </w:tcMar>
+          </w:tcPr>
+          <w:p>
+            <w:pPr>
+              <w:keepLines/>
+              <w:spacing w:before="0" w:after="0" w:line="240" w:lineRule="auto"/>
+              <w:jc w:val="center"/>
+            </w:pPr>
+            <m:oMath>
+              <m:r>
+                <m:t xml:space="preserve">J[l→L]=∂z/∂rvec(P[l])∈R^d[z] x n_p D, Δz≈J[l→L]rvec(ΔP[l]),</m:t>
+              </m:r>
+            </m:oMath>
+          </w:p>
+          <w:p>
+            <w:pPr>
+              <w:keepLines/>
+              <w:spacing w:before="0" w:after="0" w:line="240" w:lineRule="auto"/>
+              <w:jc w:val="center"/>
+            </w:pPr>
+            <m:oMath>
+              <m:r>
+                <m:t xml:space="preserve">rvec(X)=vec(X^T).</m:t>
+              </m:r>
+            </m:oMath>
+          </w:p>
+        </w:tc>
+        <w:tc>
+          <w:tcPr>
+            <w:tcW w:type="dxa" w:w="518"/>
+            <w:vAlign w:val="center"/>
+            <w:tcMar>
+              <w:top w:w="0" w:type="dxa"/>
+              <w:left w:w="0" w:type="dxa"/>
+              <w:bottom w:w="0" w:type="dxa"/>
+              <w:right w:w="0" w:type="dxa"/>
+            </w:tcMar>
+          </w:tcPr>
+          <w:p>
+            <w:pPr>
+              <w:keepLines/>
+              <w:spacing w:before="40" w:after="80" w:line="240" w:lineRule="auto"/>
+              <w:jc w:val="right"/>
+            </w:pPr>
+            <w:r>
+              <w:rPr>
+                <w:rFonts w:ascii="Times New Roman" w:hAnsi="Times New Roman"/>
+                <w:sz w:val="18"/>
+              </w:rPr>
+              <w:t>(5)</w:t>
+            </w:r>
+          </w:p>
+        </w:tc>
+      </w:tr>
+    </w:tbl>
+    <w:p>
+      <w:pPr>
+        <w:spacing w:after="100" w:line="259" w:lineRule="auto"/>
+      </w:pPr>
+      <w:r>
+        <w:rPr>
+          <w:rFonts w:ascii="Times New Roman" w:hAnsi="Times New Roman"/>
+          <w:i w:val="0"/>
+          <w:color w:val="202A32"/>
+          <w:sz w:val="20"/>
+        </w:rPr>
+        <w:t>The implementation reshapes each n_p×D patch matrix in row-major order, which equals the conventional column-vectorization vec(Xᵀ) used by rvec. In the confirmatory classification runs, d_z is the number of class logits. The Jacobian product is a first-order readout-change approximation at the unperturbed activation, not an exact identity for large perturbations or a universal account of transformer behavior. This full-logit, all-patch Jacobian is distinct from the pooled margin-gradient feature metric M_ℓ in Eq. (2).</w:t>
       </w:r>
     </w:p>
     <w:p>
       <w:pPr>
-        <w:keepLines/>
-        <w:spacing w:before="40" w:after="80"/>
-        <w:jc w:val="center"/>
+        <w:pStyle w:val="Heading1"/>
+        <w:keepNext/>
       </w:pPr>
-      <m:oMathPara>
-        <m:oMath>
-          <m:r>
-            <m:t xml:space="preserve">Jₗ→ᴸ=∂z/∂flat(Pₗ), Δz≈Jₗ→ᴸ flat(ΔPₗ).</m:t>
-          </m:r>
-        </m:oMath>
-      </m:oMathPara>
+      <w:r>
+        <w:rPr>
+          <w:rFonts w:ascii="Times New Roman" w:hAnsi="Times New Roman"/>
+          <w:b/>
+          <w:color w:val="000000"/>
+          <w:sz w:val="28"/>
+        </w:rPr>
+        <w:t>6. Operator-Aware Token Compression</w:t>
+      </w:r>
+    </w:p>
+    <w:p>
+      <w:pPr>
+        <w:pStyle w:val="Heading2"/>
+        <w:keepNext/>
+      </w:pPr>
+      <w:r>
+        <w:rPr>
+          <w:rFonts w:ascii="Times New Roman" w:hAnsi="Times New Roman"/>
+          <w:b/>
+          <w:color w:val="000000"/>
+          <w:sz w:val="23"/>
+        </w:rPr>
+        <w:t>6.1 Carrier Grouping and Optimization</w:t>
+      </w:r>
     </w:p>
     <w:p>
       <w:pPr>
@@ -2528,22 +3276,652 @@
           <w:color w:val="202A32"/>
           <w:sz w:val="20"/>
         </w:rPr>
-        <w:t>Here, z is the measured downstream readout, and flat(·) denotes the row-major vectorization used by the implementation. The first expression defines the local Jacobian; multiplying it by a flattened perturbation gives the first-order readout-change approximation in the second expression. This is an empirical model of transmission for the tested perturbations, not an exact identity for large perturbations or a universal explanation of transformer behavior.</w:t>
+        <w:t>For each image, n_p patch tokens are assigned to B carriers. Let S∈{0,1}^{n_p×B} be the assignment matrix, with exactly one nonzero per row, and let C∈ℝ^{B×D} contain the carrier vectors. The reconstructed patch matrix is P̂=SC. The set G_j contains the patch indices assigned to carrier j, and m_j=|G_j| is its membership count. The Group Mean baseline sets each carrier to the average of the patches assigned to that group:</w:t>
+      </w:r>
+    </w:p>
+    <w:tbl>
+      <w:tblPr>
+        <w:tblW w:type="auto" w:w="0"/>
+        <w:jc w:val="center"/>
+        <w:tblLayout w:type="fixed"/>
+        <w:tblLook w:firstColumn="1" w:firstRow="1" w:lastColumn="0" w:lastRow="0" w:noHBand="0" w:noVBand="1" w:val="04A0"/>
+        <w:tblW w:w="9994" w:type="dxa"/>
+        <w:tblBorders>
+          <w:top w:val="nil"/>
+          <w:left w:val="nil"/>
+          <w:bottom w:val="nil"/>
+          <w:right w:val="nil"/>
+          <w:insideH w:val="nil"/>
+          <w:insideV w:val="nil"/>
+        </w:tblBorders>
+      </w:tblPr>
+      <w:tblGrid>
+        <w:gridCol w:w="518"/>
+        <w:gridCol w:w="8957"/>
+        <w:gridCol w:w="518"/>
+      </w:tblGrid>
+      <w:tr>
+        <w:trPr>
+          <w:cantSplit/>
+        </w:trPr>
+        <w:tc>
+          <w:tcPr>
+            <w:tcW w:type="dxa" w:w="518"/>
+            <w:vAlign w:val="center"/>
+            <w:tcMar>
+              <w:top w:w="0" w:type="dxa"/>
+              <w:left w:w="0" w:type="dxa"/>
+              <w:bottom w:w="0" w:type="dxa"/>
+              <w:right w:w="0" w:type="dxa"/>
+            </w:tcMar>
+          </w:tcPr>
+          <w:p>
+            <w:pPr>
+              <w:keepLines/>
+              <w:spacing w:before="40" w:after="80" w:line="240" w:lineRule="auto"/>
+            </w:pPr>
+          </w:p>
+        </w:tc>
+        <w:tc>
+          <w:tcPr>
+            <w:tcW w:type="dxa" w:w="8957"/>
+            <w:vAlign w:val="center"/>
+            <w:tcMar>
+              <w:top w:w="0" w:type="dxa"/>
+              <w:left w:w="0" w:type="dxa"/>
+              <w:bottom w:w="0" w:type="dxa"/>
+              <w:right w:w="0" w:type="dxa"/>
+            </w:tcMar>
+          </w:tcPr>
+          <w:p>
+            <w:pPr>
+              <w:keepLines/>
+              <w:spacing w:before="0" w:after="0" w:line="240" w:lineRule="auto"/>
+              <w:jc w:val="center"/>
+            </w:pPr>
+            <m:oMath>
+              <m:r>
+                <m:t xml:space="preserve">c[j]^mean=(1/m[j])Σ[i∈G[j]]p[i], m[j]=|G[j]|.</m:t>
+              </m:r>
+            </m:oMath>
+          </w:p>
+        </w:tc>
+        <w:tc>
+          <w:tcPr>
+            <w:tcW w:type="dxa" w:w="518"/>
+            <w:vAlign w:val="center"/>
+            <w:tcMar>
+              <w:top w:w="0" w:type="dxa"/>
+              <w:left w:w="0" w:type="dxa"/>
+              <w:bottom w:w="0" w:type="dxa"/>
+              <w:right w:w="0" w:type="dxa"/>
+            </w:tcMar>
+          </w:tcPr>
+          <w:p>
+            <w:pPr>
+              <w:keepLines/>
+              <w:spacing w:before="40" w:after="80" w:line="240" w:lineRule="auto"/>
+              <w:jc w:val="right"/>
+            </w:pPr>
+            <w:r>
+              <w:rPr>
+                <w:rFonts w:ascii="Times New Roman" w:hAnsi="Times New Roman"/>
+                <w:sz w:val="18"/>
+              </w:rPr>
+              <w:t>(6)</w:t>
+            </w:r>
+          </w:p>
+        </w:tc>
+      </w:tr>
+    </w:tbl>
+    <w:p>
+      <w:pPr>
+        <w:spacing w:after="100" w:line="259" w:lineRule="auto"/>
+      </w:pPr>
+      <w:r>
+        <w:rPr>
+          <w:rFonts w:ascii="Times New Roman" w:hAnsi="Times New Roman"/>
+          <w:i w:val="0"/>
+          <w:color w:val="202A32"/>
+          <w:sz w:val="20"/>
+        </w:rPr>
+        <w:t xml:space="preserve">The residual matrix E=P−SC is the difference between the original and reconstructed patch features. </w:t>
+      </w:r>
+      <w:r>
+        <w:rPr>
+          <w:rFonts w:ascii="Times New Roman" w:hAnsi="Times New Roman"/>
+          <w:b/>
+          <w:color w:val="202A32"/>
+          <w:sz w:val="20"/>
+        </w:rPr>
+        <w:t>Low-rank operator approximation.</w:t>
+      </w:r>
+      <w:r>
+        <w:rPr>
+          <w:rFonts w:ascii="Times New Roman" w:hAnsi="Times New Roman"/>
+          <w:i w:val="0"/>
+          <w:color w:val="202A32"/>
+          <w:sz w:val="20"/>
+        </w:rPr>
+        <w:t xml:space="preserve"> The full-J oracle uses J_s=J_{ℓ→L}; for a rank-r approximation, the solver instead uses J_s=U_rᵀJ_{ℓ→L}, where U_r contains the leading left singular vectors. In either case, the solver minimizes</w:t>
+      </w:r>
+    </w:p>
+    <w:tbl>
+      <w:tblPr>
+        <w:tblW w:type="auto" w:w="0"/>
+        <w:jc w:val="center"/>
+        <w:tblLayout w:type="fixed"/>
+        <w:tblLook w:firstColumn="1" w:firstRow="1" w:lastColumn="0" w:lastRow="0" w:noHBand="0" w:noVBand="1" w:val="04A0"/>
+        <w:tblW w:w="9994" w:type="dxa"/>
+        <w:tblBorders>
+          <w:top w:val="nil"/>
+          <w:left w:val="nil"/>
+          <w:bottom w:val="nil"/>
+          <w:right w:val="nil"/>
+          <w:insideH w:val="nil"/>
+          <w:insideV w:val="nil"/>
+        </w:tblBorders>
+      </w:tblPr>
+      <w:tblGrid>
+        <w:gridCol w:w="518"/>
+        <w:gridCol w:w="8957"/>
+        <w:gridCol w:w="518"/>
+      </w:tblGrid>
+      <w:tr>
+        <w:trPr>
+          <w:cantSplit/>
+        </w:trPr>
+        <w:tc>
+          <w:tcPr>
+            <w:tcW w:type="dxa" w:w="518"/>
+            <w:vAlign w:val="center"/>
+            <w:tcMar>
+              <w:top w:w="0" w:type="dxa"/>
+              <w:left w:w="0" w:type="dxa"/>
+              <w:bottom w:w="0" w:type="dxa"/>
+              <w:right w:w="0" w:type="dxa"/>
+            </w:tcMar>
+          </w:tcPr>
+          <w:p>
+            <w:pPr>
+              <w:keepLines/>
+              <w:spacing w:before="40" w:after="80" w:line="240" w:lineRule="auto"/>
+            </w:pPr>
+          </w:p>
+        </w:tc>
+        <w:tc>
+          <w:tcPr>
+            <w:tcW w:type="dxa" w:w="8957"/>
+            <w:vAlign w:val="center"/>
+            <w:tcMar>
+              <w:top w:w="0" w:type="dxa"/>
+              <w:left w:w="0" w:type="dxa"/>
+              <w:bottom w:w="0" w:type="dxa"/>
+              <w:right w:w="0" w:type="dxa"/>
+            </w:tcMar>
+          </w:tcPr>
+          <w:p>
+            <w:pPr>
+              <w:keepLines/>
+              <w:spacing w:before="0" w:after="0" w:line="240" w:lineRule="auto"/>
+              <w:jc w:val="center"/>
+            </w:pPr>
+            <m:oMath>
+              <m:r>
+                <m:t xml:space="preserve">C^*=arg min[C] ||J[s] rvec(P−SC)||[2]^2 + λ||P−SC||[F]^2.</m:t>
+              </m:r>
+            </m:oMath>
+          </w:p>
+        </w:tc>
+        <w:tc>
+          <w:tcPr>
+            <w:tcW w:type="dxa" w:w="518"/>
+            <w:vAlign w:val="center"/>
+            <w:tcMar>
+              <w:top w:w="0" w:type="dxa"/>
+              <w:left w:w="0" w:type="dxa"/>
+              <w:bottom w:w="0" w:type="dxa"/>
+              <w:right w:w="0" w:type="dxa"/>
+            </w:tcMar>
+          </w:tcPr>
+          <w:p>
+            <w:pPr>
+              <w:keepLines/>
+              <w:spacing w:before="40" w:after="80" w:line="240" w:lineRule="auto"/>
+              <w:jc w:val="right"/>
+            </w:pPr>
+            <w:r>
+              <w:rPr>
+                <w:rFonts w:ascii="Times New Roman" w:hAnsi="Times New Roman"/>
+                <w:sz w:val="18"/>
+              </w:rPr>
+              <w:t>(7)</w:t>
+            </w:r>
+          </w:p>
+        </w:tc>
+      </w:tr>
+    </w:tbl>
+    <w:p>
+      <w:pPr>
+        <w:spacing w:after="100" w:line="259" w:lineRule="auto"/>
+      </w:pPr>
+      <w:r>
+        <w:rPr>
+          <w:rFonts w:ascii="Times New Roman" w:hAnsi="Times New Roman"/>
+          <w:i w:val="0"/>
+          <w:color w:val="202A32"/>
+          <w:sz w:val="20"/>
+        </w:rPr>
+        <w:t>The first term penalizes the readout change predicted by the selected operator, while the second is a trace-scaled Tikhonov penalty. Let d_s be the row dimension of J_s (d_z for the full operator and r for a rank-r solve), and let (J_s)_i be its D-column block for patch i. The solver constructs the readout-space Gram matrix and regularization scale</w:t>
+      </w:r>
+    </w:p>
+    <w:tbl>
+      <w:tblPr>
+        <w:tblW w:type="auto" w:w="0"/>
+        <w:jc w:val="center"/>
+        <w:tblLayout w:type="fixed"/>
+        <w:tblLook w:firstColumn="1" w:firstRow="1" w:lastColumn="0" w:lastRow="0" w:noHBand="0" w:noVBand="1" w:val="04A0"/>
+        <w:tblW w:w="9994" w:type="dxa"/>
+        <w:tblBorders>
+          <w:top w:val="nil"/>
+          <w:left w:val="nil"/>
+          <w:bottom w:val="nil"/>
+          <w:right w:val="nil"/>
+          <w:insideH w:val="nil"/>
+          <w:insideV w:val="nil"/>
+        </w:tblBorders>
+      </w:tblPr>
+      <w:tblGrid>
+        <w:gridCol w:w="518"/>
+        <w:gridCol w:w="8957"/>
+        <w:gridCol w:w="518"/>
+      </w:tblGrid>
+      <w:tr>
+        <w:trPr>
+          <w:cantSplit/>
+        </w:trPr>
+        <w:tc>
+          <w:tcPr>
+            <w:tcW w:type="dxa" w:w="518"/>
+            <w:vAlign w:val="center"/>
+            <w:tcMar>
+              <w:top w:w="0" w:type="dxa"/>
+              <w:left w:w="0" w:type="dxa"/>
+              <w:bottom w:w="0" w:type="dxa"/>
+              <w:right w:w="0" w:type="dxa"/>
+            </w:tcMar>
+          </w:tcPr>
+          <w:p>
+            <w:pPr>
+              <w:keepLines/>
+              <w:spacing w:before="40" w:after="80" w:line="240" w:lineRule="auto"/>
+            </w:pPr>
+          </w:p>
+        </w:tc>
+        <w:tc>
+          <w:tcPr>
+            <w:tcW w:type="dxa" w:w="8957"/>
+            <w:vAlign w:val="center"/>
+            <w:tcMar>
+              <w:top w:w="0" w:type="dxa"/>
+              <w:left w:w="0" w:type="dxa"/>
+              <w:bottom w:w="0" w:type="dxa"/>
+              <w:right w:w="0" w:type="dxa"/>
+            </w:tcMar>
+          </w:tcPr>
+          <w:p>
+            <w:pPr>
+              <w:keepLines/>
+              <w:spacing w:before="0" w:after="0" w:line="240" w:lineRule="auto"/>
+              <w:jc w:val="center"/>
+            </w:pPr>
+            <m:oMath>
+              <m:r>
+                <m:t xml:space="preserve">K[j]=Σ[i∈G[j]](J[s])[i], H[J]=Σ[j=1]^B(1/m[j])K[j]K[j]^T,</m:t>
+              </m:r>
+            </m:oMath>
+          </w:p>
+          <w:p>
+            <w:pPr>
+              <w:keepLines/>
+              <w:spacing w:before="0" w:after="0" w:line="240" w:lineRule="auto"/>
+              <w:jc w:val="center"/>
+            </w:pPr>
+            <m:oMath>
+              <m:r>
+                <m:t xml:space="preserve">λ=10*tr(H[J])/d[s].</m:t>
+              </m:r>
+            </m:oMath>
+          </w:p>
+        </w:tc>
+        <w:tc>
+          <w:tcPr>
+            <w:tcW w:type="dxa" w:w="518"/>
+            <w:vAlign w:val="center"/>
+            <w:tcMar>
+              <w:top w:w="0" w:type="dxa"/>
+              <w:left w:w="0" w:type="dxa"/>
+              <w:bottom w:w="0" w:type="dxa"/>
+              <w:right w:w="0" w:type="dxa"/>
+            </w:tcMar>
+          </w:tcPr>
+          <w:p>
+            <w:pPr>
+              <w:keepLines/>
+              <w:spacing w:before="40" w:after="80" w:line="240" w:lineRule="auto"/>
+              <w:jc w:val="right"/>
+            </w:pPr>
+            <w:r>
+              <w:rPr>
+                <w:rFonts w:ascii="Times New Roman" w:hAnsi="Times New Roman"/>
+                <w:sz w:val="18"/>
+              </w:rPr>
+              <w:t>(8)</w:t>
+            </w:r>
+          </w:p>
+        </w:tc>
+      </w:tr>
+    </w:tbl>
+    <w:p>
+      <w:pPr>
+        <w:spacing w:after="100" w:line="259" w:lineRule="auto"/>
+      </w:pPr>
+      <w:r>
+        <w:rPr>
+          <w:rFonts w:ascii="Times New Roman" w:hAnsi="Times New Roman"/>
+          <w:i w:val="0"/>
+          <w:color w:val="202A32"/>
+          <w:sz w:val="20"/>
+        </w:rPr>
+        <w:t>H_J is a positive-semidefinite Gram matrix of grouped Jacobian blocks, not a feature-activation covariance. It is distinct from the centered calibration-activation covariance that defines PCA directions. The per-image closed-form carrier update is</w:t>
+      </w:r>
+    </w:p>
+    <w:tbl>
+      <w:tblPr>
+        <w:tblW w:type="auto" w:w="0"/>
+        <w:jc w:val="center"/>
+        <w:tblLayout w:type="fixed"/>
+        <w:tblLook w:firstColumn="1" w:firstRow="1" w:lastColumn="0" w:lastRow="0" w:noHBand="0" w:noVBand="1" w:val="04A0"/>
+        <w:tblW w:w="9994" w:type="dxa"/>
+        <w:tblBorders>
+          <w:top w:val="nil"/>
+          <w:left w:val="nil"/>
+          <w:bottom w:val="nil"/>
+          <w:right w:val="nil"/>
+          <w:insideH w:val="nil"/>
+          <w:insideV w:val="nil"/>
+        </w:tblBorders>
+      </w:tblPr>
+      <w:tblGrid>
+        <w:gridCol w:w="518"/>
+        <w:gridCol w:w="8957"/>
+        <w:gridCol w:w="518"/>
+      </w:tblGrid>
+      <w:tr>
+        <w:trPr>
+          <w:cantSplit/>
+        </w:trPr>
+        <w:tc>
+          <w:tcPr>
+            <w:tcW w:type="dxa" w:w="518"/>
+            <w:vAlign w:val="center"/>
+            <w:tcMar>
+              <w:top w:w="0" w:type="dxa"/>
+              <w:left w:w="0" w:type="dxa"/>
+              <w:bottom w:w="0" w:type="dxa"/>
+              <w:right w:w="0" w:type="dxa"/>
+            </w:tcMar>
+          </w:tcPr>
+          <w:p>
+            <w:pPr>
+              <w:keepLines/>
+              <w:spacing w:before="40" w:after="80" w:line="240" w:lineRule="auto"/>
+            </w:pPr>
+          </w:p>
+        </w:tc>
+        <w:tc>
+          <w:tcPr>
+            <w:tcW w:type="dxa" w:w="8957"/>
+            <w:vAlign w:val="center"/>
+            <w:tcMar>
+              <w:top w:w="0" w:type="dxa"/>
+              <w:left w:w="0" w:type="dxa"/>
+              <w:bottom w:w="0" w:type="dxa"/>
+              <w:right w:w="0" w:type="dxa"/>
+            </w:tcMar>
+          </w:tcPr>
+          <w:p>
+            <w:pPr>
+              <w:keepLines/>
+              <w:spacing w:before="0" w:after="0" w:line="240" w:lineRule="auto"/>
+              <w:jc w:val="center"/>
+            </w:pPr>
+            <m:oMath>
+              <m:r>
+                <m:t xml:space="preserve">r[mean]=J[s] rvec(E[mean]),</m:t>
+              </m:r>
+            </m:oMath>
+          </w:p>
+          <w:p>
+            <w:pPr>
+              <w:keepLines/>
+              <w:spacing w:before="0" w:after="0" w:line="240" w:lineRule="auto"/>
+              <w:jc w:val="center"/>
+            </w:pPr>
+            <m:oMath>
+              <m:r>
+                <m:t xml:space="preserve">c[j]^*=c[j]^mean+(1/m[j])K[j]^T(H[J]+λI[d[s]])^-1r[mean].</m:t>
+              </m:r>
+            </m:oMath>
+          </w:p>
+        </w:tc>
+        <w:tc>
+          <w:tcPr>
+            <w:tcW w:type="dxa" w:w="518"/>
+            <w:vAlign w:val="center"/>
+            <w:tcMar>
+              <w:top w:w="0" w:type="dxa"/>
+              <w:left w:w="0" w:type="dxa"/>
+              <w:bottom w:w="0" w:type="dxa"/>
+              <w:right w:w="0" w:type="dxa"/>
+            </w:tcMar>
+          </w:tcPr>
+          <w:p>
+            <w:pPr>
+              <w:keepLines/>
+              <w:spacing w:before="40" w:after="80" w:line="240" w:lineRule="auto"/>
+              <w:jc w:val="right"/>
+            </w:pPr>
+            <w:r>
+              <w:rPr>
+                <w:rFonts w:ascii="Times New Roman" w:hAnsi="Times New Roman"/>
+                <w:sz w:val="18"/>
+              </w:rPr>
+              <w:t>(9)</w:t>
+            </w:r>
+          </w:p>
+        </w:tc>
+      </w:tr>
+    </w:tbl>
+    <w:p>
+      <w:pPr>
+        <w:spacing w:after="100" w:line="259" w:lineRule="auto"/>
+      </w:pPr>
+      <w:r>
+        <w:rPr>
+          <w:rFonts w:ascii="Times New Roman" w:hAnsi="Times New Roman"/>
+          <w:i w:val="0"/>
+          <w:color w:val="202A32"/>
+          <w:sz w:val="20"/>
+        </w:rPr>
+        <w:t>Because the Group Mean residual sums to zero within each group, these normal equations give the exact minimizer of the stated quadratic objective. This exactness applies to the local linearized objective, not to the nonlinear classifier loss. The full-J solution is computed per image and is an offline oracle; low-rank solves are evaluated against the full J on the same confirmatory cohort.</w:t>
       </w:r>
     </w:p>
     <w:p>
       <w:pPr>
-        <w:pStyle w:val="Heading1"/>
+        <w:spacing w:after="100" w:line="259" w:lineRule="auto"/>
+      </w:pPr>
+      <w:r>
+        <w:rPr>
+          <w:rFonts w:ascii="Times New Roman" w:hAnsi="Times New Roman"/>
+          <w:i w:val="0"/>
+          <w:color w:val="202A32"/>
+          <w:sz w:val="20"/>
+        </w:rPr>
+        <w:t>Each compressed key also carries the number s_t of original tokens represented by that key. With T=B+1 compressed tokens and d_h dimensions per head, the compressed attention adds log multiplicity to each key's attention logit:</w:t>
+      </w:r>
+    </w:p>
+    <w:tbl>
+      <w:tblPr>
+        <w:tblW w:type="auto" w:w="0"/>
+        <w:jc w:val="center"/>
+        <w:tblLayout w:type="fixed"/>
+        <w:tblLook w:firstColumn="1" w:firstRow="1" w:lastColumn="0" w:lastRow="0" w:noHBand="0" w:noVBand="1" w:val="04A0"/>
+        <w:tblW w:w="9994" w:type="dxa"/>
+        <w:tblBorders>
+          <w:top w:val="nil"/>
+          <w:left w:val="nil"/>
+          <w:bottom w:val="nil"/>
+          <w:right w:val="nil"/>
+          <w:insideH w:val="nil"/>
+          <w:insideV w:val="nil"/>
+        </w:tblBorders>
+      </w:tblPr>
+      <w:tblGrid>
+        <w:gridCol w:w="518"/>
+        <w:gridCol w:w="8957"/>
+        <w:gridCol w:w="518"/>
+      </w:tblGrid>
+      <w:tr>
+        <w:trPr>
+          <w:cantSplit/>
+        </w:trPr>
+        <w:tc>
+          <w:tcPr>
+            <w:tcW w:type="dxa" w:w="518"/>
+            <w:vAlign w:val="center"/>
+            <w:tcMar>
+              <w:top w:w="0" w:type="dxa"/>
+              <w:left w:w="0" w:type="dxa"/>
+              <w:bottom w:w="0" w:type="dxa"/>
+              <w:right w:w="0" w:type="dxa"/>
+            </w:tcMar>
+          </w:tcPr>
+          <w:p>
+            <w:pPr>
+              <w:keepLines/>
+              <w:spacing w:before="40" w:after="80" w:line="240" w:lineRule="auto"/>
+            </w:pPr>
+          </w:p>
+        </w:tc>
+        <w:tc>
+          <w:tcPr>
+            <w:tcW w:type="dxa" w:w="8957"/>
+            <w:vAlign w:val="center"/>
+            <w:tcMar>
+              <w:top w:w="0" w:type="dxa"/>
+              <w:left w:w="0" w:type="dxa"/>
+              <w:bottom w:w="0" w:type="dxa"/>
+              <w:right w:w="0" w:type="dxa"/>
+            </w:tcMar>
+          </w:tcPr>
+          <w:p>
+            <w:pPr>
+              <w:keepLines/>
+              <w:spacing w:before="0" w:after="0" w:line="240" w:lineRule="auto"/>
+              <w:jc w:val="center"/>
+            </w:pPr>
+            <m:oMath>
+              <m:r>
+                <m:t xml:space="preserve">A^(h)=softmax[key](Q^(h)K^(h)^T/sqrt(d[h])+1[T](log s)^T), s[0]=1,</m:t>
+              </m:r>
+            </m:oMath>
+          </w:p>
+          <w:p>
+            <w:pPr>
+              <w:keepLines/>
+              <w:spacing w:before="0" w:after="0" w:line="240" w:lineRule="auto"/>
+              <w:jc w:val="center"/>
+            </w:pPr>
+            <m:oMath>
+              <m:r>
+                <m:t xml:space="preserve">s[j]=m[j].</m:t>
+              </m:r>
+            </m:oMath>
+          </w:p>
+        </w:tc>
+        <w:tc>
+          <w:tcPr>
+            <w:tcW w:type="dxa" w:w="518"/>
+            <w:vAlign w:val="center"/>
+            <w:tcMar>
+              <w:top w:w="0" w:type="dxa"/>
+              <w:left w:w="0" w:type="dxa"/>
+              <w:bottom w:w="0" w:type="dxa"/>
+              <w:right w:w="0" w:type="dxa"/>
+            </w:tcMar>
+          </w:tcPr>
+          <w:p>
+            <w:pPr>
+              <w:keepLines/>
+              <w:spacing w:before="40" w:after="80" w:line="240" w:lineRule="auto"/>
+              <w:jc w:val="right"/>
+            </w:pPr>
+            <w:r>
+              <w:rPr>
+                <w:rFonts w:ascii="Times New Roman" w:hAnsi="Times New Roman"/>
+                <w:sz w:val="18"/>
+              </w:rPr>
+              <w:t>(10)</w:t>
+            </w:r>
+          </w:p>
+        </w:tc>
+      </w:tr>
+    </w:tbl>
+    <w:p>
+      <w:pPr>
+        <w:spacing w:after="100" w:line="259" w:lineRule="auto"/>
+      </w:pPr>
+      <w:r>
+        <w:rPr>
+          <w:rFonts w:ascii="Times New Roman" w:hAnsi="Times New Roman"/>
+          <w:i w:val="0"/>
+          <w:color w:val="202A32"/>
+          <w:sz w:val="20"/>
+        </w:rPr>
+        <w:t xml:space="preserve">The vector s includes multiplicity one for the class token and m_j=|G_j| for patch carriers; 1_T broadcasts the log-size bias over query positions. This proportional-attention correction is used in Token Merging (ToMe) to account for merged-token size </w:t>
+      </w:r>
+      <w:r>
+        <w:rPr>
+          <w:rFonts w:ascii="Times New Roman" w:hAnsi="Times New Roman"/>
+          <w:color w:val="202A32"/>
+          <w:sz w:val="20"/>
+        </w:rPr>
+        <w:t>[13]</w:t>
+      </w:r>
+      <w:r>
+        <w:rPr>
+          <w:rFonts w:ascii="Times New Roman" w:hAnsi="Times New Roman"/>
+          <w:i w:val="0"/>
+          <w:color w:val="202A32"/>
+          <w:sz w:val="20"/>
+        </w:rPr>
+        <w:t>. The implementation applies the same key bias in each compressed downstream attention block.</w:t>
+      </w:r>
+    </w:p>
+    <w:p>
+      <w:pPr>
+        <w:pStyle w:val="Heading2"/>
         <w:keepNext/>
       </w:pPr>
       <w:r>
         <w:rPr>
           <w:rFonts w:ascii="Times New Roman" w:hAnsi="Times New Roman"/>
           <w:b/>
-          <w:color w:val="173D52"/>
-          <w:sz w:val="28"/>
+          <w:color w:val="000000"/>
+          <w:sz w:val="23"/>
         </w:rPr>
-        <w:t>6. Confirmatory Operator-Aware Token Compression</w:t>
+        <w:t>6.2 Confirmatory Compression Results</w:t>
       </w:r>
     </w:p>
     <w:p>
@@ -3750,6 +5128,7 @@
     </w:p>
     <w:p>
       <w:pPr>
+        <w:keepLines/>
         <w:spacing w:after="80"/>
         <w:jc w:val="center"/>
       </w:pPr>
@@ -3774,159 +5153,12 @@
           <w:color w:val="202A32"/>
           <w:sz w:val="20"/>
         </w:rPr>
-        <w:t>For each image, N patch tokens are assigned to B carriers. Let S∈{0,1}^{N×B} be the assignment matrix, with exactly one nonzero per row, and let C∈ℝ^{B×D} contain the carrier vectors. The reconstructed patch matrix is P̂=SC. The set G_j contains the patch indices assigned to carrier j, and m_j=|G_j| is its membership count. The Group Mean baseline sets each carrier to the average of the patches assigned to that group:</w:t>
+        <w:t>Across 30,000 method/budget/seed condition rows per architecture, the same 1,000 held-out images are reused across conditions. Operator residual ‖J E‖ is associated with measured logit-L2 distortion: per-architecture Pearson r ranges from 0.739 to 0.866, and Spearman ρ ranges from 0.792 to 0.916. These are condition-level associations, not 120,000 independent images. Rank-16 and rank-32 outcomes vary by architecture and budget; the confirmatory data do not support a universal recovery fraction. Fig. 7 reports the measured accuracy-token curves, while Table II lists rank-16 and rank-32 Top-1 at each architecture's most aggressive tested budget.</w:t>
       </w:r>
     </w:p>
     <w:p>
       <w:pPr>
-        <w:keepLines/>
-        <w:spacing w:before="40" w:after="80"/>
-        <w:jc w:val="center"/>
-      </w:pPr>
-      <m:oMathPara>
-        <m:oMath>
-          <m:r>
-            <m:t xml:space="preserve">cⱼᵐᵉᵃⁿ=(1/mⱼ)Σᵢ∈Gⱼpᵢ, mⱼ=|Gⱼ|.</m:t>
-          </m:r>
-        </m:oMath>
-      </m:oMathPara>
-    </w:p>
-    <w:p>
-      <w:pPr>
-        <w:spacing w:after="100" w:line="259" w:lineRule="auto"/>
-      </w:pPr>
-      <w:r>
-        <w:rPr>
-          <w:rFonts w:ascii="Times New Roman" w:hAnsi="Times New Roman"/>
-          <w:i w:val="0"/>
-          <w:color w:val="202A32"/>
-          <w:sz w:val="20"/>
-        </w:rPr>
-        <w:t>The residual matrix E=P−SC contains the difference between the original and reconstructed patches. The operator-aware oracle adjusts the carriers to reduce the Jacobian-predicted effect of this residual on the downstream readout:</w:t>
-      </w:r>
-    </w:p>
-    <w:p>
-      <w:pPr>
-        <w:keepLines/>
-        <w:spacing w:before="40" w:after="80"/>
-        <w:jc w:val="center"/>
-      </w:pPr>
-      <m:oMathPara>
-        <m:oMath>
-          <m:sSup>
-            <m:e>
-              <m:r>
-                <m:t xml:space="preserve">C</m:t>
-              </m:r>
-            </m:e>
-            <m:sup>
-              <m:r>
-                <m:t xml:space="preserve">*</m:t>
-              </m:r>
-            </m:sup>
-          </m:sSup>
-          <m:r>
-            <m:t xml:space="preserve">=</m:t>
-          </m:r>
-          <m:r>
-            <m:t xml:space="preserve">arg </m:t>
-          </m:r>
-          <m:sSub>
-            <m:e>
-              <m:r>
-                <m:t xml:space="preserve">min</m:t>
-              </m:r>
-            </m:e>
-            <m:sub>
-              <m:r>
-                <m:t xml:space="preserve">C</m:t>
-              </m:r>
-            </m:sub>
-          </m:sSub>
-          <m:r>
-            <m:t xml:space="preserve"> ‖Jₗ→ᴸ flat(P−SC)‖₂² + λ</m:t>
-          </m:r>
-          <m:sSubSup>
-            <m:e>
-              <m:r>
-                <m:t xml:space="preserve">‖P−SC‖</m:t>
-              </m:r>
-            </m:e>
-            <m:sub>
-              <m:r>
-                <m:t xml:space="preserve">F</m:t>
-              </m:r>
-            </m:sub>
-            <m:sup>
-              <m:r>
-                <m:t xml:space="preserve">2</m:t>
-              </m:r>
-            </m:sup>
-          </m:sSubSup>
-          <m:r>
-            <m:t xml:space="preserve">.</m:t>
-          </m:r>
-        </m:oMath>
-      </m:oMathPara>
-    </w:p>
-    <w:p>
-      <w:pPr>
-        <w:spacing w:after="100" w:line="259" w:lineRule="auto"/>
-      </w:pPr>
-      <w:r>
-        <w:rPr>
-          <w:rFonts w:ascii="Times New Roman" w:hAnsi="Times New Roman"/>
-          <w:i w:val="0"/>
-          <w:color w:val="202A32"/>
-          <w:sz w:val="20"/>
-        </w:rPr>
-        <w:t>The first term penalizes the readout change predicted by the full downstream Jacobian; the second is a trace-scaled Tikhonov penalty that stabilizes the carrier correction. In the implementation, K_j=Σ_{i∈G_j}J_i is the sum of the Jacobian blocks for patches assigned to carrier j, and Σ=Σ_j K_jK_jᵀ/m_j is the group-size-normalized covariance used to scale regularization. The covariance and regularization scale are</w:t>
-      </w:r>
-    </w:p>
-    <w:p>
-      <w:pPr>
-        <w:keepLines/>
-        <w:spacing w:before="40" w:after="80"/>
-        <w:jc w:val="center"/>
-      </w:pPr>
-      <m:oMathPara>
-        <m:oMath>
-          <m:r>
-            <m:t xml:space="preserve">Kⱼ=Σᵢ∈GⱼJᵢ, Σ=Σⱼ(KⱼKⱼᵀ/mⱼ), λ=10·tr(Σ)/dim(z).</m:t>
-          </m:r>
-        </m:oMath>
-      </m:oMathPara>
-    </w:p>
-    <w:p>
-      <w:pPr>
-        <w:spacing w:after="100" w:line="259" w:lineRule="auto"/>
-      </w:pPr>
-      <w:r>
-        <w:rPr>
-          <w:rFonts w:ascii="Times New Roman" w:hAnsi="Times New Roman"/>
-          <w:i w:val="0"/>
-          <w:color w:val="202A32"/>
-          <w:sz w:val="20"/>
-        </w:rPr>
-        <w:t>Here, J_i is the Jacobian block for patch i, the sum runs over all B carrier groups, and dim(z) is the readout dimension. Thus the penalty scale follows the trace of the operator-space covariance and the readout dimension. The full-J solution is computed per image and is an offline oracle, not a deployable inference method. Low-rank approximations reduce the operator basis and are evaluated on the same confirmatory cohort.</w:t>
-      </w:r>
-    </w:p>
-    <w:p>
-      <w:pPr>
-        <w:spacing w:after="100" w:line="259" w:lineRule="auto"/>
-      </w:pPr>
-      <w:r>
-        <w:rPr>
-          <w:rFonts w:ascii="Times New Roman" w:hAnsi="Times New Roman"/>
-          <w:i w:val="0"/>
-          <w:color w:val="202A32"/>
-          <w:sz w:val="20"/>
-        </w:rPr>
-        <w:t>Across 30,000 method/budget/seed condition rows per architecture, the same 1,000 held-out images are reused across conditions. Operator residual ‖J E‖ is associated with measured logit-L2 distortion: per-architecture Pearson r ranges from 0.739 to 0.866, and Spearman ρ ranges from 0.792 to 0.916. These are condition-level associations, not 120,000 independent images. Rank-16 and rank-32 approximations retain more than 98% of the Group-Mean-to-full-J-oracle compression benefit. This denominator is the benefit from Group Mean to the full-J oracle; it is not an accuracy-recovery ratio, retained spectral energy, practical-predictor recovery, restricted-carrier-oracle recovery, or static-alpha recovery. Fig. 7 reports the confirmatory curves and the audited benefit denominator.</w:t>
-      </w:r>
-    </w:p>
-    <w:p>
-      <w:pPr>
+        <w:keepNext/>
         <w:keepLines/>
         <w:spacing w:after="20"/>
         <w:jc w:val="center"/>
@@ -3968,6 +5200,7 @@
     </w:p>
     <w:p>
       <w:pPr>
+        <w:keepLines/>
         <w:spacing w:after="80"/>
         <w:jc w:val="center"/>
       </w:pPr>
@@ -3978,7 +5211,7 @@
           <w:color w:val="4C5963"/>
           <w:sz w:val="17"/>
         </w:rPr>
-        <w:t>Fig. 7. Confirmatory Top-1 accuracy versus retained patch-token fraction for four architectures and the audited rank-16/32 benefit result. The &gt;98% denominator is the Group-Mean-to-full-J-oracle compression benefit, not an accuracy ratio or spectral energy. Each architecture uses N=1,000 held-out images.</w:t>
+        <w:t>Fig. 7. Confirmatory Top-1 accuracy versus retained patch-token fraction for four architectures. Curves show pruning, Group Mean, ToMe, the full-J oracle, and rank-32; rank-16 Top-1 is listed in Table II at the most aggressive tested budget. Each architecture uses N=1,000 held-out images.</w:t>
       </w:r>
     </w:p>
     <w:p>
@@ -3990,10 +5223,25 @@
         <w:rPr>
           <w:rFonts w:ascii="Times New Roman" w:hAnsi="Times New Roman"/>
           <w:b/>
-          <w:color w:val="173D52"/>
+          <w:color w:val="000000"/>
           <w:sz w:val="28"/>
         </w:rPr>
-        <w:t>7. Carrier-Space Results and Practical Boundary</w:t>
+        <w:t>7. Limits of Practical Carrier Corrections</w:t>
+      </w:r>
+    </w:p>
+    <w:p>
+      <w:pPr>
+        <w:pStyle w:val="Heading2"/>
+        <w:keepNext/>
+      </w:pPr>
+      <w:r>
+        <w:rPr>
+          <w:rFonts w:ascii="Times New Roman" w:hAnsi="Times New Roman"/>
+          <w:b/>
+          <w:color w:val="000000"/>
+          <w:sz w:val="23"/>
+        </w:rPr>
+        <w:t>7.1 Static Feature-PCA Corrections</w:t>
       </w:r>
     </w:p>
     <w:p>
@@ -4007,7 +5255,36 @@
           <w:color w:val="202A32"/>
           <w:sz w:val="20"/>
         </w:rPr>
-        <w:t>The separate carrier branch tests whether corrections can be amortized in a compact feature-PCA basis. Here, q is the number of feature directions in the correction basis, extracted from calibration patch activations; these directions are not obtained from the Jacobian. Separately, calibration uses a low-rank subspace derived from downstream-Jacobian targets to estimate a fixed coefficient vector α, which sets the correction weight along each PCA direction. For held-out classifier evaluation, the basis and coefficients are frozen, and no per-image Jacobian or evaluation-label fitting is used. The operator-space experiment uses N=100 held-out operator-space images and does not measure classification. For DeiT-Small at q=16, static Feature-PCA recovers 54.91% of the restricted-oracle ‖J E‖ gain; this remains linearized operator-space evidence only. Table III reports the separate real classifier-carrier results at the selected budgets.</w:t>
+        <w:t>The separate carrier branch tests whether corrections can be amortized in a compact feature-PCA basis. Here, q is the number of feature directions in the correction basis, extracted from centered calibration patch activations with covariance Σ_{act,ℓ}; these directions are not obtained from the Jacobian. This feature-space covariance is distinct from the readout-space solver Gram matrix H_J in Eq. (8). Separately, calibration uses a low-rank subspace derived from downstream-Jacobian targets to estimate a fixed coefficient vector α, which sets the correction weight along each PCA direction. For held-out classifier evaluation, the basis and coefficients are frozen, and no per-image Jacobian or evaluation-label fitting is used. The operator-space experiment uses N=100 held-out operator-space images and does not measure classification. For DeiT-Small at q=16, static Feature-PCA recovers 54.91% of the restricted-oracle ‖J E‖ gain; this remains linearized operator-space evidence only.</w:t>
+      </w:r>
+    </w:p>
+    <w:p>
+      <w:pPr>
+        <w:pStyle w:val="Heading2"/>
+        <w:keepNext/>
+      </w:pPr>
+      <w:r>
+        <w:rPr>
+          <w:rFonts w:ascii="Times New Roman" w:hAnsi="Times New Roman"/>
+          <w:b/>
+          <w:color w:val="000000"/>
+          <w:sz w:val="23"/>
+        </w:rPr>
+        <w:t>7.2 Classification and Deployment Boundaries</w:t>
+      </w:r>
+    </w:p>
+    <w:p>
+      <w:pPr>
+        <w:spacing w:after="100" w:line="259" w:lineRule="auto"/>
+      </w:pPr>
+      <w:r>
+        <w:rPr>
+          <w:rFonts w:ascii="Times New Roman" w:hAnsi="Times New Roman"/>
+          <w:i w:val="0"/>
+          <w:color w:val="202A32"/>
+          <w:sz w:val="20"/>
+        </w:rPr>
+        <w:t>The real-final benchmark evaluates actual model predictions on N=1,000 held-out images per architecture. Table III reports the separate real classifier-carrier results at the selected budgets.</w:t>
       </w:r>
     </w:p>
     <w:p>
@@ -4774,6 +6051,7 @@
     </w:p>
     <w:p>
       <w:pPr>
+        <w:keepLines/>
         <w:spacing w:after="80"/>
         <w:jc w:val="center"/>
       </w:pPr>
@@ -4784,7 +6062,7 @@
           <w:color w:val="4C5963"/>
           <w:sz w:val="17"/>
         </w:rPr>
-        <w:t>Table III. Correct predictions out of 1,000 held-out images and Top-1 accuracy for the separate real classifier-carrier benchmark. Parenthetical differences are percentage-point (pp) changes from Hybrid Group Mean at the same architecture and budget. These rows are not the N=100 operator-space experiment.</w:t>
+        <w:t>Table III. Correct predictions out of 1,000 held-out images and Top-1 accuracy for the separate real classifier-carrier benchmark. Parenthetical differences are percentage-point (pp) changes from Hybrid Group Mean at the same architecture and budget. This benchmark is distinct from the N=100 operator-space study.</w:t>
       </w:r>
     </w:p>
     <w:p>
@@ -4798,11 +6076,12 @@
           <w:color w:val="202A32"/>
           <w:sz w:val="20"/>
         </w:rPr>
-        <w:t>The real-final benchmark evaluates actual model predictions on N=1,000 held-out images per architecture. Compact Feature-PCA corrections do not consistently improve classification: both DeiT-Small budgets and the aggressive DINOv2 budget are at or below Hybrid Group Mean, while ViT-B/16 AugReg has a limited positive case. Fig. S1 shows the separate full-model throughput boundary; it does not establish a general deployment improvement.</w:t>
+        <w:t>Compact Feature-PCA corrections do not consistently improve classification: both DeiT-Small budgets and the aggressive DINOv2 budget are at or below Hybrid Group Mean, while ViT-B/16 AugReg has a limited positive case. Fig. S1 shows the separate full-model throughput boundary; it does not establish a general deployment improvement.</w:t>
       </w:r>
     </w:p>
     <w:p>
       <w:pPr>
+        <w:keepNext/>
         <w:keepLines/>
         <w:spacing w:after="20"/>
         <w:jc w:val="center"/>
@@ -4844,6 +6123,7 @@
     </w:p>
     <w:p>
       <w:pPr>
+        <w:keepLines/>
         <w:spacing w:after="80"/>
         <w:jc w:val="center"/>
       </w:pPr>
@@ -4868,24 +6148,7 @@
           <w:color w:val="202A32"/>
           <w:sz w:val="20"/>
         </w:rPr>
-        <w:t xml:space="preserve">Selective risk gating is also bounded. Its historical operator-space area under the receiver operating characteristic curve (AUROC) is 0.784 and is exploratory; the calibration-frozen real classifier gate does not consistently improve accuracy (DeiT-Small budget 98: 75.8% versus Hybrid Group Mean 76.4%; DINOv2 budget 42: 58.5% versus Hybrid Group Mean 61.3%). For the measured accuracy-throughput frontier, we use only </w:t>
-      </w:r>
-      <w:r>
-        <w:rPr>
-          <w:rFonts w:ascii="Consolas" w:hAnsi="Consolas"/>
-          <w:color w:val="34495E"/>
-          <w:sz w:val="18"/>
-        </w:rPr>
-        <w:t>outputs/fungibility_real_final/real_accuracy_throughput_frontier.csv</w:t>
-      </w:r>
-      <w:r>
-        <w:rPr>
-          <w:rFonts w:ascii="Times New Roman" w:hAnsi="Times New Roman"/>
-          <w:i w:val="0"/>
-          <w:color w:val="202A32"/>
-          <w:sz w:val="20"/>
-        </w:rPr>
-        <w:t>: Clean is non-dominated in several regimes, Group Mean is a practical batched baseline, and static q=16 adds a narrow ViT-B/16 AugReg point at some batch sizes. q=32 and selective q=16 do not establish a general frontier improvement. Full-call measurements are not isolated operator overhead.</w:t>
+        <w:t>Selective risk gating is also bounded. Its historical operator-space area under the receiver operating characteristic curve (AUROC) is 0.784 and is exploratory; the calibration-frozen real classifier gate does not consistently improve accuracy (DeiT-Small budget 98: 75.8% versus Hybrid Group Mean 76.4%; DINOv2 budget 42: 58.5% versus Hybrid Group Mean 61.3%). In the measured accuracy-throughput frontier, Clean is non-dominated in several regimes, Group Mean is a practical batched baseline, and static q=16 adds a narrow ViT-B/16 AugReg point at some batch sizes. q=32 and selective q=16 do not establish a general frontier improvement. Full-call measurements are not isolated operator overhead.</w:t>
       </w:r>
     </w:p>
     <w:p>
@@ -4899,7 +6162,7 @@
           <w:color w:val="202A32"/>
           <w:sz w:val="20"/>
         </w:rPr>
-        <w:t>These results distinguish replaceability from compressibility. Single-token carrier attempts fail; scalar layer prediction does not generalize; a compact shared linear envelope with K≤64 captures little of the tested operator subspace; dynamic alpha prediction fails out of sample; and dynamic operator prediction is costly. Static Feature-PCA may improve linearized operator error without improving Top-1 accuracy, while the selective gate has no general deployment-frontier result. These are negative or bounded findings, not another optimization claim.</w:t>
+        <w:t>These results distinguish replaceability from compressibility. Single-token carrier attempts fail; scalar layer prediction does not generalize; a compact shared linear envelope with K≤64 captures little of the tested operator subspace; dynamic alpha prediction fails out of sample; and dynamic operator prediction is costly. Static Feature-PCA may improve linearized operator error without improving Top-1 accuracy, while the selective gate has no general deployment-frontier result. Together, these negative and bounded findings limit the scope for practical carrier-based optimization.</w:t>
       </w:r>
     </w:p>
     <w:p>
@@ -4911,7 +6174,7 @@
         <w:rPr>
           <w:rFonts w:ascii="Times New Roman" w:hAnsi="Times New Roman"/>
           <w:b/>
-          <w:color w:val="173D52"/>
+          <w:color w:val="000000"/>
           <w:sz w:val="28"/>
         </w:rPr>
         <w:t>8. Limitations</w:t>
@@ -4940,7 +6203,7 @@
         <w:rPr>
           <w:rFonts w:ascii="Times New Roman" w:hAnsi="Times New Roman"/>
           <w:b/>
-          <w:color w:val="173D52"/>
+          <w:color w:val="000000"/>
           <w:sz w:val="28"/>
         </w:rPr>
         <w:t>9. Conclusion</w:t>
@@ -4957,7 +6220,7 @@
           <w:color w:val="202A32"/>
           <w:sz w:val="20"/>
         </w:rPr>
-        <w:t>Late patch activations can be replaceable under constrained geometry and diversity, but that property alone does not imply token deletion or practical acceleration. N=100 mechanism audits connect coherent Value-path transmission and downstream subspace rotation to the need for an end-to-end operator. A strict N=1,000-per-architecture evaluation shows that operator-aware token compression improves over pruning and shifts strong-merging frontiers on three of four architectures, with rank-16/32 retaining more than 98% of the full-J oracle compression benefit. Compact carrier corrections improve operator-space metrics but do not reliably improve classifier accuracy or yield a general measured frontier. This evidence supports a mechanistic result and a bounded constructive compression result, with explicit limits on practical translation.</w:t>
+        <w:t>Late patch activations can be replaceable under constrained geometry and diversity, but that property alone does not imply token deletion or practical acceleration. N=100 mechanism audits connect coherent Value-path transmission and downstream subspace rotation to the need for an end-to-end operator. A strict N=1,000-per-architecture evaluation shows that operator-aware token compression improves over pruning and shifts strong-merging frontiers on three of four architectures; rank-16/32 classifier outcomes remain dependent on architecture and token budget. Compact carrier corrections improve operator-space metrics but do not reliably improve classifier accuracy or yield a general measured frontier. This evidence supports a mechanistic result and a bounded constructive compression result, with explicit limits on practical translation.</w:t>
       </w:r>
     </w:p>
     <w:p>
@@ -4969,7 +6232,7 @@
         <w:rPr>
           <w:rFonts w:ascii="Times New Roman" w:hAnsi="Times New Roman"/>
           <w:b/>
-          <w:color w:val="173D52"/>
+          <w:color w:val="000000"/>
           <w:sz w:val="28"/>
         </w:rPr>
         <w:t>Reproducibility and Evidence</w:t>
@@ -4986,7 +6249,7 @@
           <w:color w:val="202A32"/>
           <w:sz w:val="20"/>
         </w:rPr>
-        <w:t>The canonical repository is [Patch-Content-Fungibility](https://github.com/nhatminh-115/Patch-Content-Fungibility). Confirmatory compression outputs are in outputs/fungibility_operator_compression_confirmatory/; real classifier-carrier accuracy and full-call timings are in outputs/fungibility_real_final/. The figure and number traceability maps identify source files and sample units. Historical proxy-backed consolidation tables are not empirical support for this manuscript.</w:t>
+        <w:t>Code and audited data supporting the confirmatory compression and real classifier-carrier benchmarks are available in the [Patch-Content-Fungibility repository](https://github.com/nhatminh-115/Patch-Content-Fungibility).</w:t>
       </w:r>
     </w:p>
     <w:p>
@@ -6138,7 +7401,7 @@
       <w:rFonts w:asciiTheme="majorHAnsi" w:eastAsiaTheme="majorEastAsia" w:hAnsiTheme="majorHAnsi" w:cstheme="majorBidi" w:ascii="Times New Roman" w:hAnsi="Times New Roman"/>
       <w:b/>
       <w:bCs/>
-      <w:color w:val="173D52"/>
+      <w:color w:val="000000"/>
       <w:sz w:val="28"/>
       <w:szCs w:val="28"/>
     </w:rPr>
@@ -6162,7 +7425,7 @@
       <w:rFonts w:asciiTheme="majorHAnsi" w:eastAsiaTheme="majorEastAsia" w:hAnsiTheme="majorHAnsi" w:cstheme="majorBidi" w:ascii="Times New Roman" w:hAnsi="Times New Roman"/>
       <w:b/>
       <w:bCs/>
-      <w:color w:val="246B8E"/>
+      <w:color w:val="000000"/>
       <w:sz w:val="23"/>
       <w:szCs w:val="26"/>
     </w:rPr>
@@ -6417,15 +7680,12 @@
     <w:qFormat/>
     <w:rsid w:val="00FC693F"/>
     <w:pPr>
-      <w:pBdr>
-        <w:bottom w:val="single" w:sz="8" w:space="4" w:color="4F81BD" w:themeColor="accent1"/>
-      </w:pBdr>
       <w:spacing w:after="300" w:line="240" w:lineRule="auto"/>
       <w:contextualSpacing/>
     </w:pPr>
     <w:rPr>
       <w:rFonts w:asciiTheme="majorHAnsi" w:eastAsiaTheme="majorEastAsia" w:hAnsiTheme="majorHAnsi" w:cstheme="majorBidi" w:ascii="Times New Roman" w:hAnsi="Times New Roman"/>
-      <w:color w:val="17232D"/>
+      <w:color w:val="000000"/>
       <w:spacing w:val="5"/>
       <w:kern w:val="28"/>
       <w:sz w:val="36"/>

</xml_diff>

<commit_message>
Render manuscript subscripts and superscripts properly
</commit_message>
<xml_diff>
--- a/docs/PAPER_DRAFT_v4_synced.docx
+++ b/docs/PAPER_DRAFT_v4_synced.docx
@@ -436,7 +436,26 @@
           <w:color w:val="202A32"/>
           <w:sz w:val="20"/>
         </w:rPr>
-        <w:t xml:space="preserve">. Adaptive Token Sampling (ATS) and Interpretability-Aware Redundancy Reduction (IA-RED²) select tokens using sampling or redundancy criteria </w:t>
+        <w:t>. Adaptive Token Sampling (ATS) and Interpretability-Aware Redundancy Reduction (IA-RED</w:t>
+      </w:r>
+      <w:r>
+        <w:rPr>
+          <w:rFonts w:ascii="Times New Roman" w:hAnsi="Times New Roman"/>
+          <w:i w:val="0"/>
+          <w:color w:val="202A32"/>
+          <w:sz w:val="20"/>
+          <w:vertAlign w:val="superscript"/>
+        </w:rPr>
+        <w:t>2</w:t>
+      </w:r>
+      <w:r>
+        <w:rPr>
+          <w:rFonts w:ascii="Times New Roman" w:hAnsi="Times New Roman"/>
+          <w:i w:val="0"/>
+          <w:color w:val="202A32"/>
+          <w:sz w:val="20"/>
+        </w:rPr>
+        <w:t xml:space="preserve">) select tokens using sampling or redundancy criteria </w:t>
       </w:r>
       <w:r>
         <w:rPr>
@@ -2044,7 +2063,195 @@
           <w:color w:val="202A32"/>
           <w:sz w:val="20"/>
         </w:rPr>
-        <w:t xml:space="preserve"> denotes the number of image samples, n_p the number of spatial patch slots, and D the feature dimension; Table I reports N alongside each study's sampling unit. For the fixed-slot intervention, let P_ℓ∈ℝ^{n_p×D} contain the patch activations at layer ℓ, with p_{ℓ,i}∈ℝ^D as row i and r_{ℓ,i} its class-agnostic calibration surrogate. The binary indicator u_i selects the slots to replace:</w:t>
+        <w:t xml:space="preserve"> denotes the number of image samples, </w:t>
+      </w:r>
+      <m:oMath>
+        <m:sSub>
+          <m:e>
+            <m:r>
+              <m:t xml:space="preserve">n</m:t>
+            </m:r>
+          </m:e>
+          <m:sub>
+            <m:r>
+              <m:t xml:space="preserve">p</m:t>
+            </m:r>
+          </m:sub>
+        </m:sSub>
+      </m:oMath>
+      <w:r>
+        <w:rPr>
+          <w:rFonts w:ascii="Times New Roman" w:hAnsi="Times New Roman"/>
+          <w:i w:val="0"/>
+          <w:color w:val="202A32"/>
+          <w:sz w:val="20"/>
+        </w:rPr>
+        <w:t xml:space="preserve"> the number of spatial patch slots, and D the feature dimension; Table I reports N alongside each study's sampling unit. For the fixed-slot intervention, let </w:t>
+      </w:r>
+      <m:oMath>
+        <m:sSub>
+          <m:e>
+            <m:r>
+              <m:t xml:space="preserve">P</m:t>
+            </m:r>
+          </m:e>
+          <m:sub>
+            <m:r>
+              <m:t xml:space="preserve">ℓ</m:t>
+            </m:r>
+          </m:sub>
+        </m:sSub>
+      </m:oMath>
+      <w:r>
+        <w:rPr>
+          <w:rFonts w:ascii="Times New Roman" w:hAnsi="Times New Roman"/>
+          <w:i w:val="0"/>
+          <w:color w:val="202A32"/>
+          <w:sz w:val="20"/>
+        </w:rPr>
+        <w:t>∈</w:t>
+      </w:r>
+      <m:oMath>
+        <m:sSup>
+          <m:e>
+            <m:r>
+              <m:t xml:space="preserve">ℝ</m:t>
+            </m:r>
+          </m:e>
+          <m:sup>
+            <m:sSub>
+              <m:e>
+                <m:r>
+                  <m:t xml:space="preserve">n</m:t>
+                </m:r>
+              </m:e>
+              <m:sub>
+                <m:r>
+                  <m:t xml:space="preserve">p</m:t>
+                </m:r>
+              </m:sub>
+            </m:sSub>
+            <m:r>
+              <m:t xml:space="preserve">×</m:t>
+            </m:r>
+            <m:r>
+              <m:t xml:space="preserve">D</m:t>
+            </m:r>
+          </m:sup>
+        </m:sSup>
+      </m:oMath>
+      <w:r>
+        <w:rPr>
+          <w:rFonts w:ascii="Times New Roman" w:hAnsi="Times New Roman"/>
+          <w:i w:val="0"/>
+          <w:color w:val="202A32"/>
+          <w:sz w:val="20"/>
+        </w:rPr>
+        <w:t xml:space="preserve"> contain the patch activations at layer ℓ, with </w:t>
+      </w:r>
+      <m:oMath>
+        <m:sSub>
+          <m:e>
+            <m:r>
+              <m:t xml:space="preserve">p</m:t>
+            </m:r>
+          </m:e>
+          <m:sub>
+            <m:r>
+              <m:t xml:space="preserve">ℓ</m:t>
+            </m:r>
+            <m:r>
+              <m:t xml:space="preserve">,</m:t>
+            </m:r>
+            <m:r>
+              <m:t xml:space="preserve">i</m:t>
+            </m:r>
+          </m:sub>
+        </m:sSub>
+      </m:oMath>
+      <w:r>
+        <w:rPr>
+          <w:rFonts w:ascii="Times New Roman" w:hAnsi="Times New Roman"/>
+          <w:i w:val="0"/>
+          <w:color w:val="202A32"/>
+          <w:sz w:val="20"/>
+        </w:rPr>
+        <w:t>∈</w:t>
+      </w:r>
+      <m:oMath>
+        <m:sSup>
+          <m:e>
+            <m:r>
+              <m:t xml:space="preserve">ℝ</m:t>
+            </m:r>
+          </m:e>
+          <m:sup>
+            <m:r>
+              <m:t xml:space="preserve">D</m:t>
+            </m:r>
+          </m:sup>
+        </m:sSup>
+      </m:oMath>
+      <w:r>
+        <w:rPr>
+          <w:rFonts w:ascii="Times New Roman" w:hAnsi="Times New Roman"/>
+          <w:i w:val="0"/>
+          <w:color w:val="202A32"/>
+          <w:sz w:val="20"/>
+        </w:rPr>
+        <w:t xml:space="preserve"> as row i and </w:t>
+      </w:r>
+      <m:oMath>
+        <m:sSub>
+          <m:e>
+            <m:r>
+              <m:t xml:space="preserve">r</m:t>
+            </m:r>
+          </m:e>
+          <m:sub>
+            <m:r>
+              <m:t xml:space="preserve">ℓ</m:t>
+            </m:r>
+            <m:r>
+              <m:t xml:space="preserve">,</m:t>
+            </m:r>
+            <m:r>
+              <m:t xml:space="preserve">i</m:t>
+            </m:r>
+          </m:sub>
+        </m:sSub>
+      </m:oMath>
+      <w:r>
+        <w:rPr>
+          <w:rFonts w:ascii="Times New Roman" w:hAnsi="Times New Roman"/>
+          <w:i w:val="0"/>
+          <w:color w:val="202A32"/>
+          <w:sz w:val="20"/>
+        </w:rPr>
+        <w:t xml:space="preserve"> its class-agnostic calibration surrogate. The binary indicator </w:t>
+      </w:r>
+      <m:oMath>
+        <m:sSub>
+          <m:e>
+            <m:r>
+              <m:t xml:space="preserve">u</m:t>
+            </m:r>
+          </m:e>
+          <m:sub>
+            <m:r>
+              <m:t xml:space="preserve">i</m:t>
+            </m:r>
+          </m:sub>
+        </m:sSub>
+      </m:oMath>
+      <w:r>
+        <w:rPr>
+          <w:rFonts w:ascii="Times New Roman" w:hAnsi="Times New Roman"/>
+          <w:i w:val="0"/>
+          <w:color w:val="202A32"/>
+          <w:sz w:val="20"/>
+        </w:rPr>
+        <w:t xml:space="preserve"> selects the slots to replace:</w:t>
       </w:r>
     </w:p>
     <w:tbl>
@@ -2109,7 +2316,187 @@
             </w:pPr>
             <m:oMath>
               <m:r>
-                <m:t xml:space="preserve">p~[l,i]=(1−u[i])p[l,i]+u[i] r[l,i], u[i]∈{0,1}, i=1, …, n_p.</m:t>
+                <m:t xml:space="preserve">p</m:t>
+              </m:r>
+              <m:sSub>
+                <m:e>
+                  <m:r>
+                    <m:t xml:space="preserve">~</m:t>
+                  </m:r>
+                </m:e>
+                <m:sub>
+                  <m:r>
+                    <m:t xml:space="preserve">l</m:t>
+                  </m:r>
+                  <m:r>
+                    <m:t xml:space="preserve">,</m:t>
+                  </m:r>
+                  <m:r>
+                    <m:t xml:space="preserve">i</m:t>
+                  </m:r>
+                </m:sub>
+              </m:sSub>
+              <m:r>
+                <m:t xml:space="preserve">=</m:t>
+              </m:r>
+              <m:r>
+                <m:t xml:space="preserve">(</m:t>
+              </m:r>
+              <m:r>
+                <m:t xml:space="preserve">1</m:t>
+              </m:r>
+              <m:r>
+                <m:t xml:space="preserve">−</m:t>
+              </m:r>
+              <m:sSub>
+                <m:e>
+                  <m:r>
+                    <m:t xml:space="preserve">u</m:t>
+                  </m:r>
+                </m:e>
+                <m:sub>
+                  <m:r>
+                    <m:t xml:space="preserve">i</m:t>
+                  </m:r>
+                </m:sub>
+              </m:sSub>
+              <m:r>
+                <m:t xml:space="preserve">)</m:t>
+              </m:r>
+              <m:sSub>
+                <m:e>
+                  <m:r>
+                    <m:t xml:space="preserve">p</m:t>
+                  </m:r>
+                </m:e>
+                <m:sub>
+                  <m:r>
+                    <m:t xml:space="preserve">l</m:t>
+                  </m:r>
+                  <m:r>
+                    <m:t xml:space="preserve">,</m:t>
+                  </m:r>
+                  <m:r>
+                    <m:t xml:space="preserve">i</m:t>
+                  </m:r>
+                </m:sub>
+              </m:sSub>
+              <m:r>
+                <m:t xml:space="preserve">+</m:t>
+              </m:r>
+              <m:sSub>
+                <m:e>
+                  <m:r>
+                    <m:t xml:space="preserve">u</m:t>
+                  </m:r>
+                </m:e>
+                <m:sub>
+                  <m:r>
+                    <m:t xml:space="preserve">i</m:t>
+                  </m:r>
+                </m:sub>
+              </m:sSub>
+              <m:r>
+                <m:t xml:space="preserve"> </m:t>
+              </m:r>
+              <m:sSub>
+                <m:e>
+                  <m:r>
+                    <m:t xml:space="preserve">r</m:t>
+                  </m:r>
+                </m:e>
+                <m:sub>
+                  <m:r>
+                    <m:t xml:space="preserve">l</m:t>
+                  </m:r>
+                  <m:r>
+                    <m:t xml:space="preserve">,</m:t>
+                  </m:r>
+                  <m:r>
+                    <m:t xml:space="preserve">i</m:t>
+                  </m:r>
+                </m:sub>
+              </m:sSub>
+              <m:r>
+                <m:t xml:space="preserve">,</m:t>
+              </m:r>
+              <m:r>
+                <m:t xml:space="preserve"> </m:t>
+              </m:r>
+              <m:sSub>
+                <m:e>
+                  <m:r>
+                    <m:t xml:space="preserve">u</m:t>
+                  </m:r>
+                </m:e>
+                <m:sub>
+                  <m:r>
+                    <m:t xml:space="preserve">i</m:t>
+                  </m:r>
+                </m:sub>
+              </m:sSub>
+              <m:r>
+                <m:t xml:space="preserve">∈</m:t>
+              </m:r>
+              <m:r>
+                <m:t xml:space="preserve">{</m:t>
+              </m:r>
+              <m:r>
+                <m:t xml:space="preserve">0</m:t>
+              </m:r>
+              <m:r>
+                <m:t xml:space="preserve">,</m:t>
+              </m:r>
+              <m:r>
+                <m:t xml:space="preserve">1</m:t>
+              </m:r>
+              <m:r>
+                <m:t xml:space="preserve">}</m:t>
+              </m:r>
+              <m:r>
+                <m:t xml:space="preserve">,</m:t>
+              </m:r>
+              <m:r>
+                <m:t xml:space="preserve"> </m:t>
+              </m:r>
+              <m:r>
+                <m:t xml:space="preserve">i</m:t>
+              </m:r>
+              <m:r>
+                <m:t xml:space="preserve">=</m:t>
+              </m:r>
+              <m:r>
+                <m:t xml:space="preserve">1</m:t>
+              </m:r>
+              <m:r>
+                <m:t xml:space="preserve">,</m:t>
+              </m:r>
+              <m:r>
+                <m:t xml:space="preserve"> </m:t>
+              </m:r>
+              <m:r>
+                <m:t xml:space="preserve">…</m:t>
+              </m:r>
+              <m:r>
+                <m:t xml:space="preserve">,</m:t>
+              </m:r>
+              <m:r>
+                <m:t xml:space="preserve"> </m:t>
+              </m:r>
+              <m:sSub>
+                <m:e>
+                  <m:r>
+                    <m:t xml:space="preserve">n</m:t>
+                  </m:r>
+                </m:e>
+                <m:sub>
+                  <m:r>
+                    <m:t xml:space="preserve">p</m:t>
+                  </m:r>
+                </m:sub>
+              </m:sSub>
+              <m:r>
+                <m:t xml:space="preserve">.</m:t>
               </m:r>
             </m:oMath>
           </w:p>
@@ -2153,7 +2540,53 @@
           <w:color w:val="202A32"/>
           <w:sz w:val="20"/>
         </w:rPr>
-        <w:t>Thus, when u_i=0 the original activation remains, and when u_i=1 it is replaced by the corresponding surrogate. The class token, position indices, number of rows, model weights, and subsequent computation remain unchanged. The intervention isolates dependence on image-specific content while keeping token slots fixed.</w:t>
+        <w:t xml:space="preserve">Thus, when </w:t>
+      </w:r>
+      <m:oMath>
+        <m:sSub>
+          <m:e>
+            <m:r>
+              <m:t xml:space="preserve">u</m:t>
+            </m:r>
+          </m:e>
+          <m:sub>
+            <m:r>
+              <m:t xml:space="preserve">i</m:t>
+            </m:r>
+          </m:sub>
+        </m:sSub>
+      </m:oMath>
+      <w:r>
+        <w:rPr>
+          <w:rFonts w:ascii="Times New Roman" w:hAnsi="Times New Roman"/>
+          <w:i w:val="0"/>
+          <w:color w:val="202A32"/>
+          <w:sz w:val="20"/>
+        </w:rPr>
+        <w:t xml:space="preserve">=0 the original activation remains, and when </w:t>
+      </w:r>
+      <m:oMath>
+        <m:sSub>
+          <m:e>
+            <m:r>
+              <m:t xml:space="preserve">u</m:t>
+            </m:r>
+          </m:e>
+          <m:sub>
+            <m:r>
+              <m:t xml:space="preserve">i</m:t>
+            </m:r>
+          </m:sub>
+        </m:sSub>
+      </m:oMath>
+      <w:r>
+        <w:rPr>
+          <w:rFonts w:ascii="Times New Roman" w:hAnsi="Times New Roman"/>
+          <w:i w:val="0"/>
+          <w:color w:val="202A32"/>
+          <w:sz w:val="20"/>
+        </w:rPr>
+        <w:t>=1 it is replaced by the corresponding surrogate. The class token, position indices, number of rows, model weights, and subsequent computation remain unchanged. The intervention isolates dependence on image-specific content while keeping token slots fixed.</w:t>
       </w:r>
     </w:p>
     <w:p>
@@ -2472,7 +2905,67 @@
           <w:color w:val="4C5963"/>
           <w:sz w:val="17"/>
         </w:rPr>
-        <w:t>Fig. 4. (a) Ratio of the empirical margin-gradient metric sensitivity vᵀM_ℓv along PC1 to that along PC-bottom across depths in the N=100 functional-geometry pilot. The PCs are eigenvectors of the centered calibration-activation covariance, separate from M_ℓ. (b) Depth-8 PCA score-density maps for DeiT-Small and ViT-B/16 AugReg. Each observation is a patch activation from the 100-image pilot cohort; axes are standardized per model and component to show score distributions, so the plotted spread does not represent their raw variance difference. Patch tokens are not independent image samples; panel (a) is not computed from the full downstream readout Jacobian used in compression.</w:t>
+        <w:t xml:space="preserve">Fig. 4. (a) Ratio of the empirical margin-gradient metric sensitivity </w:t>
+      </w:r>
+      <m:oMath>
+        <m:sSup>
+          <m:e>
+            <m:r>
+              <m:t xml:space="preserve">v</m:t>
+            </m:r>
+          </m:e>
+          <m:sup>
+            <m:r>
+              <m:t xml:space="preserve">T</m:t>
+            </m:r>
+          </m:sup>
+        </m:sSup>
+      </m:oMath>
+      <m:oMath>
+        <m:sSub>
+          <m:e>
+            <m:r>
+              <m:t xml:space="preserve">M</m:t>
+            </m:r>
+          </m:e>
+          <m:sub>
+            <m:r>
+              <m:t xml:space="preserve">ℓ</m:t>
+            </m:r>
+          </m:sub>
+        </m:sSub>
+      </m:oMath>
+      <w:r>
+        <w:rPr>
+          <w:rFonts w:ascii="Times New Roman" w:hAnsi="Times New Roman"/>
+          <w:i/>
+          <w:color w:val="4C5963"/>
+          <w:sz w:val="17"/>
+        </w:rPr>
+        <w:t xml:space="preserve">v along PC1 to that along PC-bottom across depths in the N=100 functional-geometry pilot. The PCs are eigenvectors of the centered calibration-activation covariance, separate from </w:t>
+      </w:r>
+      <m:oMath>
+        <m:sSub>
+          <m:e>
+            <m:r>
+              <m:t xml:space="preserve">M</m:t>
+            </m:r>
+          </m:e>
+          <m:sub>
+            <m:r>
+              <m:t xml:space="preserve">ℓ</m:t>
+            </m:r>
+          </m:sub>
+        </m:sSub>
+      </m:oMath>
+      <w:r>
+        <w:rPr>
+          <w:rFonts w:ascii="Times New Roman" w:hAnsi="Times New Roman"/>
+          <w:i/>
+          <w:color w:val="4C5963"/>
+          <w:sz w:val="17"/>
+        </w:rPr>
+        <w:t>. (b) Depth-8 PCA score-density maps for DeiT-Small and ViT-B/16 AugReg. Each observation is a patch activation from the 100-image pilot cohort; axes are standardized per model and component to show score distributions, so the plotted spread does not represent their raw variance difference. Patch tokens are not independent image samples; panel (a) is not computed from the full downstream readout Jacobian used in compression.</w:t>
       </w:r>
     </w:p>
     <w:p>
@@ -2486,7 +2979,76 @@
           <w:color w:val="202A32"/>
           <w:sz w:val="20"/>
         </w:rPr>
-        <w:t>For image s, let y_s and r_s be the clean predicted and runner-up classes, and let z_s denote its final logits. The functional-geometry pilot differentiates this scalar class margin with respect to each patch feature, then averages the per-patch gradient outer products:</w:t>
+        <w:t xml:space="preserve">For image s, let </w:t>
+      </w:r>
+      <m:oMath>
+        <m:sSub>
+          <m:e>
+            <m:r>
+              <m:t xml:space="preserve">y</m:t>
+            </m:r>
+          </m:e>
+          <m:sub>
+            <m:r>
+              <m:t xml:space="preserve">s</m:t>
+            </m:r>
+          </m:sub>
+        </m:sSub>
+      </m:oMath>
+      <w:r>
+        <w:rPr>
+          <w:rFonts w:ascii="Times New Roman" w:hAnsi="Times New Roman"/>
+          <w:i w:val="0"/>
+          <w:color w:val="202A32"/>
+          <w:sz w:val="20"/>
+        </w:rPr>
+        <w:t xml:space="preserve"> and </w:t>
+      </w:r>
+      <m:oMath>
+        <m:sSub>
+          <m:e>
+            <m:r>
+              <m:t xml:space="preserve">r</m:t>
+            </m:r>
+          </m:e>
+          <m:sub>
+            <m:r>
+              <m:t xml:space="preserve">s</m:t>
+            </m:r>
+          </m:sub>
+        </m:sSub>
+      </m:oMath>
+      <w:r>
+        <w:rPr>
+          <w:rFonts w:ascii="Times New Roman" w:hAnsi="Times New Roman"/>
+          <w:i w:val="0"/>
+          <w:color w:val="202A32"/>
+          <w:sz w:val="20"/>
+        </w:rPr>
+        <w:t xml:space="preserve"> be the clean predicted and runner-up classes, and let </w:t>
+      </w:r>
+      <m:oMath>
+        <m:sSub>
+          <m:e>
+            <m:r>
+              <m:t xml:space="preserve">z</m:t>
+            </m:r>
+          </m:e>
+          <m:sub>
+            <m:r>
+              <m:t xml:space="preserve">s</m:t>
+            </m:r>
+          </m:sub>
+        </m:sSub>
+      </m:oMath>
+      <w:r>
+        <w:rPr>
+          <w:rFonts w:ascii="Times New Roman" w:hAnsi="Times New Roman"/>
+          <w:i w:val="0"/>
+          <w:color w:val="202A32"/>
+          <w:sz w:val="20"/>
+        </w:rPr>
+        <w:t xml:space="preserve"> denote its final logits. The functional-geometry pilot differentiates this scalar class margin with respect to each patch feature, then averages the per-patch gradient outer products:</w:t>
       </w:r>
     </w:p>
     <w:tbl>
@@ -2550,8 +3112,125 @@
               <w:jc w:val="center"/>
             </w:pPr>
             <m:oMath>
+              <m:sSub>
+                <m:e>
+                  <m:r>
+                    <m:t xml:space="preserve">g</m:t>
+                  </m:r>
+                </m:e>
+                <m:sub>
+                  <m:r>
+                    <m:t xml:space="preserve">s</m:t>
+                  </m:r>
+                  <m:r>
+                    <m:t xml:space="preserve">,</m:t>
+                  </m:r>
+                  <m:r>
+                    <m:t xml:space="preserve">i</m:t>
+                  </m:r>
+                </m:sub>
+              </m:sSub>
               <m:r>
-                <m:t xml:space="preserve">g[s,i]=grad[p[l,s,i]](z[s,y[s]]−z[s,r[s]]),</m:t>
+                <m:t xml:space="preserve">=</m:t>
+              </m:r>
+              <m:sSub>
+                <m:e>
+                  <m:r>
+                    <m:t xml:space="preserve">grad</m:t>
+                  </m:r>
+                </m:e>
+                <m:sub>
+                  <m:sSub>
+                    <m:e>
+                      <m:r>
+                        <m:t xml:space="preserve">p</m:t>
+                      </m:r>
+                    </m:e>
+                    <m:sub>
+                      <m:r>
+                        <m:t xml:space="preserve">l</m:t>
+                      </m:r>
+                      <m:r>
+                        <m:t xml:space="preserve">,</m:t>
+                      </m:r>
+                      <m:r>
+                        <m:t xml:space="preserve">s</m:t>
+                      </m:r>
+                      <m:r>
+                        <m:t xml:space="preserve">,</m:t>
+                      </m:r>
+                      <m:r>
+                        <m:t xml:space="preserve">i</m:t>
+                      </m:r>
+                    </m:sub>
+                  </m:sSub>
+                </m:sub>
+              </m:sSub>
+              <m:r>
+                <m:t xml:space="preserve">(</m:t>
+              </m:r>
+              <m:sSub>
+                <m:e>
+                  <m:r>
+                    <m:t xml:space="preserve">z</m:t>
+                  </m:r>
+                </m:e>
+                <m:sub>
+                  <m:r>
+                    <m:t xml:space="preserve">s</m:t>
+                  </m:r>
+                  <m:r>
+                    <m:t xml:space="preserve">,</m:t>
+                  </m:r>
+                  <m:sSub>
+                    <m:e>
+                      <m:r>
+                        <m:t xml:space="preserve">y</m:t>
+                      </m:r>
+                    </m:e>
+                    <m:sub>
+                      <m:r>
+                        <m:t xml:space="preserve">s</m:t>
+                      </m:r>
+                    </m:sub>
+                  </m:sSub>
+                </m:sub>
+              </m:sSub>
+              <m:r>
+                <m:t xml:space="preserve">−</m:t>
+              </m:r>
+              <m:sSub>
+                <m:e>
+                  <m:r>
+                    <m:t xml:space="preserve">z</m:t>
+                  </m:r>
+                </m:e>
+                <m:sub>
+                  <m:r>
+                    <m:t xml:space="preserve">s</m:t>
+                  </m:r>
+                  <m:r>
+                    <m:t xml:space="preserve">,</m:t>
+                  </m:r>
+                  <m:sSub>
+                    <m:e>
+                      <m:r>
+                        <m:t xml:space="preserve">r</m:t>
+                      </m:r>
+                    </m:e>
+                    <m:sub>
+                      <m:r>
+                        <m:t xml:space="preserve">s</m:t>
+                      </m:r>
+                    </m:sub>
+                  </m:sSub>
+                </m:sub>
+              </m:sSub>
+              <m:r>
+                <m:t xml:space="preserve">)</m:t>
+              </m:r>
+              <m:r>
+                <m:t xml:space="preserve">,</m:t>
               </m:r>
             </m:oMath>
           </w:p>
@@ -2562,8 +3241,32 @@
               <w:jc w:val="center"/>
             </w:pPr>
             <m:oMath>
+              <m:sSub>
+                <m:e>
+                  <m:r>
+                    <m:t xml:space="preserve">M</m:t>
+                  </m:r>
+                </m:e>
+                <m:sub>
+                  <m:r>
+                    <m:t xml:space="preserve">l</m:t>
+                  </m:r>
+                </m:sub>
+              </m:sSub>
               <m:r>
-                <m:t xml:space="preserve">M[l]=(1/(</m:t>
+                <m:t xml:space="preserve">=</m:t>
+              </m:r>
+              <m:r>
+                <m:t xml:space="preserve">(</m:t>
+              </m:r>
+              <m:r>
+                <m:t xml:space="preserve">1</m:t>
+              </m:r>
+              <m:r>
+                <m:t xml:space="preserve">/</m:t>
+              </m:r>
+              <m:r>
+                <m:t xml:space="preserve">(</m:t>
               </m:r>
               <m:sSub>
                 <m:e>
@@ -2578,22 +3281,136 @@
                 </m:sub>
               </m:sSub>
               <m:r>
-                <m:t xml:space="preserve"> n_p))Σ[s=1]^</m:t>
+                <m:t xml:space="preserve"> </m:t>
               </m:r>
               <m:sSub>
                 <m:e>
                   <m:r>
-                    <m:t xml:space="preserve">N</m:t>
+                    <m:t xml:space="preserve">n</m:t>
                   </m:r>
                 </m:e>
                 <m:sub>
                   <m:r>
-                    <m:t xml:space="preserve">img</m:t>
+                    <m:t xml:space="preserve">p</m:t>
                   </m:r>
                 </m:sub>
               </m:sSub>
               <m:r>
-                <m:t xml:space="preserve">Σ[i=1]^n_p g[s,i]g[s,i]^T.</m:t>
+                <m:t xml:space="preserve">)</m:t>
+              </m:r>
+              <m:r>
+                <m:t xml:space="preserve">)</m:t>
+              </m:r>
+              <m:sSubSup>
+                <m:e>
+                  <m:r>
+                    <m:t xml:space="preserve">Σ</m:t>
+                  </m:r>
+                </m:e>
+                <m:sub>
+                  <m:r>
+                    <m:t xml:space="preserve">s</m:t>
+                  </m:r>
+                  <m:r>
+                    <m:t xml:space="preserve">=</m:t>
+                  </m:r>
+                  <m:r>
+                    <m:t xml:space="preserve">1</m:t>
+                  </m:r>
+                </m:sub>
+                <m:sup>
+                  <m:sSub>
+                    <m:e>
+                      <m:r>
+                        <m:t xml:space="preserve">N</m:t>
+                      </m:r>
+                    </m:e>
+                    <m:sub>
+                      <m:r>
+                        <m:t xml:space="preserve">img</m:t>
+                      </m:r>
+                    </m:sub>
+                  </m:sSub>
+                </m:sup>
+              </m:sSubSup>
+              <m:sSubSup>
+                <m:e>
+                  <m:r>
+                    <m:t xml:space="preserve">Σ</m:t>
+                  </m:r>
+                </m:e>
+                <m:sub>
+                  <m:r>
+                    <m:t xml:space="preserve">i</m:t>
+                  </m:r>
+                  <m:r>
+                    <m:t xml:space="preserve">=</m:t>
+                  </m:r>
+                  <m:r>
+                    <m:t xml:space="preserve">1</m:t>
+                  </m:r>
+                </m:sub>
+                <m:sup>
+                  <m:sSub>
+                    <m:e>
+                      <m:r>
+                        <m:t xml:space="preserve">n</m:t>
+                      </m:r>
+                    </m:e>
+                    <m:sub>
+                      <m:r>
+                        <m:t xml:space="preserve">p</m:t>
+                      </m:r>
+                    </m:sub>
+                  </m:sSub>
+                </m:sup>
+              </m:sSubSup>
+              <m:sSub>
+                <m:e>
+                  <m:r>
+                    <m:t xml:space="preserve">g</m:t>
+                  </m:r>
+                </m:e>
+                <m:sub>
+                  <m:r>
+                    <m:t xml:space="preserve">s</m:t>
+                  </m:r>
+                  <m:r>
+                    <m:t xml:space="preserve">,</m:t>
+                  </m:r>
+                  <m:r>
+                    <m:t xml:space="preserve">i</m:t>
+                  </m:r>
+                </m:sub>
+              </m:sSub>
+              <m:r>
+                <m:t xml:space="preserve"> </m:t>
+              </m:r>
+              <m:sSubSup>
+                <m:e>
+                  <m:r>
+                    <m:t xml:space="preserve">g</m:t>
+                  </m:r>
+                </m:e>
+                <m:sub>
+                  <m:r>
+                    <m:t xml:space="preserve">s</m:t>
+                  </m:r>
+                  <m:r>
+                    <m:t xml:space="preserve">,</m:t>
+                  </m:r>
+                  <m:r>
+                    <m:t xml:space="preserve">i</m:t>
+                  </m:r>
+                </m:sub>
+                <m:sup>
+                  <m:r>
+                    <m:t xml:space="preserve">T</m:t>
+                  </m:r>
+                </m:sup>
+              </m:sSubSup>
+              <m:r>
+                <m:t xml:space="preserve">.</m:t>
               </m:r>
             </m:oMath>
           </w:p>
@@ -2637,7 +3454,347 @@
           <w:color w:val="202A32"/>
           <w:sz w:val="20"/>
         </w:rPr>
-        <w:t>Here M_ℓ∈ℝ^{D×D} is an uncentered second moment of scalar margin gradients, not J_{ℓ→L}ᵀJ_{ℓ→L}. The pilot counts nonnegative eigenvalues no greater than 10⁻³ times the largest as near-null. Its effective rank is exp(−Σ_{k:p_k&gt;10⁻¹²}p_k log p_k), where p_k is eigenvalue k divided by the eigenvalue sum. Thus M_ℓ pools per-token margin gradients without cross-token or full-logit Jacobian structure. PCA uses the separate sample covariance Σ_{act,ℓ} of centered calibration patch-feature rows, with denominator M_cal−1 for M_cal calibration patch observations. This count is the number of calibration patch tokens, not N</w:t>
+        <w:t xml:space="preserve">Here </w:t>
+      </w:r>
+      <m:oMath>
+        <m:sSub>
+          <m:e>
+            <m:r>
+              <m:t xml:space="preserve">M</m:t>
+            </m:r>
+          </m:e>
+          <m:sub>
+            <m:r>
+              <m:t xml:space="preserve">ℓ</m:t>
+            </m:r>
+          </m:sub>
+        </m:sSub>
+      </m:oMath>
+      <w:r>
+        <w:rPr>
+          <w:rFonts w:ascii="Times New Roman" w:hAnsi="Times New Roman"/>
+          <w:i w:val="0"/>
+          <w:color w:val="202A32"/>
+          <w:sz w:val="20"/>
+        </w:rPr>
+        <w:t>∈</w:t>
+      </w:r>
+      <m:oMath>
+        <m:sSup>
+          <m:e>
+            <m:r>
+              <m:t xml:space="preserve">ℝ</m:t>
+            </m:r>
+          </m:e>
+          <m:sup>
+            <m:r>
+              <m:t xml:space="preserve">D</m:t>
+            </m:r>
+            <m:r>
+              <m:t xml:space="preserve">×</m:t>
+            </m:r>
+            <m:r>
+              <m:t xml:space="preserve">D</m:t>
+            </m:r>
+          </m:sup>
+        </m:sSup>
+      </m:oMath>
+      <w:r>
+        <w:rPr>
+          <w:rFonts w:ascii="Times New Roman" w:hAnsi="Times New Roman"/>
+          <w:i w:val="0"/>
+          <w:color w:val="202A32"/>
+          <w:sz w:val="20"/>
+        </w:rPr>
+        <w:t xml:space="preserve"> is an uncentered second moment of scalar margin gradients, not </w:t>
+      </w:r>
+      <m:oMath>
+        <m:sSubSup>
+          <m:e>
+            <m:r>
+              <m:t xml:space="preserve">J</m:t>
+            </m:r>
+          </m:e>
+          <m:sub>
+            <m:r>
+              <m:t xml:space="preserve">ℓ</m:t>
+            </m:r>
+            <m:r>
+              <m:t xml:space="preserve">→</m:t>
+            </m:r>
+            <m:r>
+              <m:t xml:space="preserve">L</m:t>
+            </m:r>
+          </m:sub>
+          <m:sup>
+            <m:r>
+              <m:t xml:space="preserve">T</m:t>
+            </m:r>
+          </m:sup>
+        </m:sSubSup>
+      </m:oMath>
+      <m:oMath>
+        <m:sSub>
+          <m:e>
+            <m:r>
+              <m:t xml:space="preserve">J</m:t>
+            </m:r>
+          </m:e>
+          <m:sub>
+            <m:r>
+              <m:t xml:space="preserve">ℓ</m:t>
+            </m:r>
+            <m:r>
+              <m:t xml:space="preserve">→</m:t>
+            </m:r>
+            <m:r>
+              <m:t xml:space="preserve">L</m:t>
+            </m:r>
+          </m:sub>
+        </m:sSub>
+      </m:oMath>
+      <w:r>
+        <w:rPr>
+          <w:rFonts w:ascii="Times New Roman" w:hAnsi="Times New Roman"/>
+          <w:i w:val="0"/>
+          <w:color w:val="202A32"/>
+          <w:sz w:val="20"/>
+        </w:rPr>
+        <w:t xml:space="preserve">. The pilot counts nonnegative eigenvalues no greater than </w:t>
+      </w:r>
+      <m:oMath>
+        <m:sSup>
+          <m:e>
+            <m:r>
+              <m:t xml:space="preserve">10</m:t>
+            </m:r>
+          </m:e>
+          <m:sup>
+            <m:r>
+              <m:t xml:space="preserve">-</m:t>
+            </m:r>
+            <m:r>
+              <m:t xml:space="preserve">3</m:t>
+            </m:r>
+          </m:sup>
+        </m:sSup>
+      </m:oMath>
+      <w:r>
+        <w:rPr>
+          <w:rFonts w:ascii="Times New Roman" w:hAnsi="Times New Roman"/>
+          <w:i w:val="0"/>
+          <w:color w:val="202A32"/>
+          <w:sz w:val="20"/>
+        </w:rPr>
+        <w:t xml:space="preserve"> times the largest as near-null. Its effective rank is exp(−</w:t>
+      </w:r>
+      <m:oMath>
+        <m:sSub>
+          <m:e>
+            <m:r>
+              <m:t xml:space="preserve">Σ</m:t>
+            </m:r>
+          </m:e>
+          <m:sub>
+            <m:r>
+              <m:t xml:space="preserve">k</m:t>
+            </m:r>
+            <m:r>
+              <m:t xml:space="preserve">:</m:t>
+            </m:r>
+            <m:sSub>
+              <m:e>
+                <m:r>
+                  <m:t xml:space="preserve">p</m:t>
+                </m:r>
+              </m:e>
+              <m:sub>
+                <m:r>
+                  <m:t xml:space="preserve">k</m:t>
+                </m:r>
+              </m:sub>
+            </m:sSub>
+            <m:r>
+              <m:t xml:space="preserve">&gt;</m:t>
+            </m:r>
+            <m:r>
+              <m:t xml:space="preserve">10</m:t>
+            </m:r>
+            <m:r>
+              <m:t xml:space="preserve">-</m:t>
+            </m:r>
+            <m:r>
+              <m:t xml:space="preserve">12</m:t>
+            </m:r>
+          </m:sub>
+        </m:sSub>
+      </m:oMath>
+      <m:oMath>
+        <m:sSub>
+          <m:e>
+            <m:r>
+              <m:t xml:space="preserve">p</m:t>
+            </m:r>
+          </m:e>
+          <m:sub>
+            <m:r>
+              <m:t xml:space="preserve">k</m:t>
+            </m:r>
+          </m:sub>
+        </m:sSub>
+      </m:oMath>
+      <w:r>
+        <w:rPr>
+          <w:rFonts w:ascii="Times New Roman" w:hAnsi="Times New Roman"/>
+          <w:i w:val="0"/>
+          <w:color w:val="202A32"/>
+          <w:sz w:val="20"/>
+        </w:rPr>
+        <w:t xml:space="preserve"> log </w:t>
+      </w:r>
+      <m:oMath>
+        <m:sSub>
+          <m:e>
+            <m:r>
+              <m:t xml:space="preserve">p</m:t>
+            </m:r>
+          </m:e>
+          <m:sub>
+            <m:r>
+              <m:t xml:space="preserve">k</m:t>
+            </m:r>
+          </m:sub>
+        </m:sSub>
+      </m:oMath>
+      <w:r>
+        <w:rPr>
+          <w:rFonts w:ascii="Times New Roman" w:hAnsi="Times New Roman"/>
+          <w:i w:val="0"/>
+          <w:color w:val="202A32"/>
+          <w:sz w:val="20"/>
+        </w:rPr>
+        <w:t xml:space="preserve">), where </w:t>
+      </w:r>
+      <m:oMath>
+        <m:sSub>
+          <m:e>
+            <m:r>
+              <m:t xml:space="preserve">p</m:t>
+            </m:r>
+          </m:e>
+          <m:sub>
+            <m:r>
+              <m:t xml:space="preserve">k</m:t>
+            </m:r>
+          </m:sub>
+        </m:sSub>
+      </m:oMath>
+      <w:r>
+        <w:rPr>
+          <w:rFonts w:ascii="Times New Roman" w:hAnsi="Times New Roman"/>
+          <w:i w:val="0"/>
+          <w:color w:val="202A32"/>
+          <w:sz w:val="20"/>
+        </w:rPr>
+        <w:t xml:space="preserve"> is eigenvalue k divided by the eigenvalue sum. Thus </w:t>
+      </w:r>
+      <m:oMath>
+        <m:sSub>
+          <m:e>
+            <m:r>
+              <m:t xml:space="preserve">M</m:t>
+            </m:r>
+          </m:e>
+          <m:sub>
+            <m:r>
+              <m:t xml:space="preserve">ℓ</m:t>
+            </m:r>
+          </m:sub>
+        </m:sSub>
+      </m:oMath>
+      <w:r>
+        <w:rPr>
+          <w:rFonts w:ascii="Times New Roman" w:hAnsi="Times New Roman"/>
+          <w:i w:val="0"/>
+          <w:color w:val="202A32"/>
+          <w:sz w:val="20"/>
+        </w:rPr>
+        <w:t xml:space="preserve"> pools per-token margin gradients without cross-token or full-logit Jacobian structure. PCA uses the separate sample covariance </w:t>
+      </w:r>
+      <m:oMath>
+        <m:sSub>
+          <m:e>
+            <m:r>
+              <m:t xml:space="preserve">Σ</m:t>
+            </m:r>
+          </m:e>
+          <m:sub>
+            <m:r>
+              <m:t xml:space="preserve">act</m:t>
+            </m:r>
+            <m:r>
+              <m:t xml:space="preserve">,</m:t>
+            </m:r>
+            <m:r>
+              <m:t xml:space="preserve">ℓ</m:t>
+            </m:r>
+          </m:sub>
+        </m:sSub>
+      </m:oMath>
+      <w:r>
+        <w:rPr>
+          <w:rFonts w:ascii="Times New Roman" w:hAnsi="Times New Roman"/>
+          <w:i w:val="0"/>
+          <w:color w:val="202A32"/>
+          <w:sz w:val="20"/>
+        </w:rPr>
+        <w:t xml:space="preserve"> of centered calibration patch-feature rows, with denominator </w:t>
+      </w:r>
+      <m:oMath>
+        <m:sSub>
+          <m:e>
+            <m:r>
+              <m:t xml:space="preserve">M</m:t>
+            </m:r>
+          </m:e>
+          <m:sub>
+            <m:r>
+              <m:t xml:space="preserve">c</m:t>
+            </m:r>
+          </m:sub>
+        </m:sSub>
+      </m:oMath>
+      <w:r>
+        <w:rPr>
+          <w:rFonts w:ascii="Times New Roman" w:hAnsi="Times New Roman"/>
+          <w:i w:val="0"/>
+          <w:color w:val="202A32"/>
+          <w:sz w:val="20"/>
+        </w:rPr>
+        <w:t xml:space="preserve">al−1 for </w:t>
+      </w:r>
+      <m:oMath>
+        <m:sSub>
+          <m:e>
+            <m:r>
+              <m:t xml:space="preserve">M</m:t>
+            </m:r>
+          </m:e>
+          <m:sub>
+            <m:r>
+              <m:t xml:space="preserve">c</m:t>
+            </m:r>
+          </m:sub>
+        </m:sSub>
+      </m:oMath>
+      <w:r>
+        <w:rPr>
+          <w:rFonts w:ascii="Times New Roman" w:hAnsi="Times New Roman"/>
+          <w:i w:val="0"/>
+          <w:color w:val="202A32"/>
+          <w:sz w:val="20"/>
+        </w:rPr>
+        <w:t>al calibration patch observations. This count is the number of calibration patch tokens, not N</w:t>
       </w:r>
       <w:r>
         <w:rPr>
@@ -2656,7 +3813,53 @@
           <w:color w:val="202A32"/>
           <w:sz w:val="20"/>
         </w:rPr>
-        <w:t>. This covariance is distinct from both M_ℓ and the readout-space solver Gram matrix H_J.</w:t>
+        <w:t xml:space="preserve">. This covariance is distinct from both </w:t>
+      </w:r>
+      <m:oMath>
+        <m:sSub>
+          <m:e>
+            <m:r>
+              <m:t xml:space="preserve">M</m:t>
+            </m:r>
+          </m:e>
+          <m:sub>
+            <m:r>
+              <m:t xml:space="preserve">ℓ</m:t>
+            </m:r>
+          </m:sub>
+        </m:sSub>
+      </m:oMath>
+      <w:r>
+        <w:rPr>
+          <w:rFonts w:ascii="Times New Roman" w:hAnsi="Times New Roman"/>
+          <w:i w:val="0"/>
+          <w:color w:val="202A32"/>
+          <w:sz w:val="20"/>
+        </w:rPr>
+        <w:t xml:space="preserve"> and the readout-space solver Gram matrix </w:t>
+      </w:r>
+      <m:oMath>
+        <m:sSub>
+          <m:e>
+            <m:r>
+              <m:t xml:space="preserve">H</m:t>
+            </m:r>
+          </m:e>
+          <m:sub>
+            <m:r>
+              <m:t xml:space="preserve">J</m:t>
+            </m:r>
+          </m:sub>
+        </m:sSub>
+      </m:oMath>
+      <w:r>
+        <w:rPr>
+          <w:rFonts w:ascii="Times New Roman" w:hAnsi="Times New Roman"/>
+          <w:i w:val="0"/>
+          <w:color w:val="202A32"/>
+          <w:sz w:val="20"/>
+        </w:rPr>
+        <w:t>.</w:t>
       </w:r>
     </w:p>
     <w:p>
@@ -2757,7 +3960,41 @@
           <w:color w:val="202A32"/>
           <w:sz w:val="20"/>
         </w:rPr>
-        <w:t>For one image and a CLS readout, let w_{h,i}^{clean} be the clean attention weight from patch i to the readout in head h. The signed attention-weighted token pattern and frozen-attention Value-context change are</w:t>
+        <w:t xml:space="preserve">For one image and a CLS readout, let </w:t>
+      </w:r>
+      <m:oMath>
+        <m:sSubSup>
+          <m:e>
+            <m:r>
+              <m:t xml:space="preserve">w</m:t>
+            </m:r>
+          </m:e>
+          <m:sub>
+            <m:r>
+              <m:t xml:space="preserve">h</m:t>
+            </m:r>
+            <m:r>
+              <m:t xml:space="preserve">,</m:t>
+            </m:r>
+            <m:r>
+              <m:t xml:space="preserve">i</m:t>
+            </m:r>
+          </m:sub>
+          <m:sup>
+            <m:r>
+              <m:t xml:space="preserve">clean</m:t>
+            </m:r>
+          </m:sup>
+        </m:sSubSup>
+      </m:oMath>
+      <w:r>
+        <w:rPr>
+          <w:rFonts w:ascii="Times New Roman" w:hAnsi="Times New Roman"/>
+          <w:i w:val="0"/>
+          <w:color w:val="202A32"/>
+          <w:sz w:val="20"/>
+        </w:rPr>
+        <w:t xml:space="preserve"> be the clean attention weight from patch i to the readout in head h. The signed attention-weighted token pattern and frozen-attention Value-context change are</w:t>
       </w:r>
     </w:p>
     <w:tbl>
@@ -2821,8 +4058,99 @@
               <w:jc w:val="center"/>
             </w:pPr>
             <m:oMath>
+              <m:sSub>
+                <m:e>
+                  <m:r>
+                    <m:t xml:space="preserve">Γ</m:t>
+                  </m:r>
+                </m:e>
+                <m:sub>
+                  <m:r>
+                    <m:t xml:space="preserve">h</m:t>
+                  </m:r>
+                </m:sub>
+              </m:sSub>
               <m:r>
-                <m:t xml:space="preserve">Γ[h](a)=Σ[i=1]^n_p w[h,i]^clean a[i],</m:t>
+                <m:t xml:space="preserve">(</m:t>
+              </m:r>
+              <m:r>
+                <m:t xml:space="preserve">a</m:t>
+              </m:r>
+              <m:r>
+                <m:t xml:space="preserve">)</m:t>
+              </m:r>
+              <m:r>
+                <m:t xml:space="preserve">=</m:t>
+              </m:r>
+              <m:sSubSup>
+                <m:e>
+                  <m:r>
+                    <m:t xml:space="preserve">Σ</m:t>
+                  </m:r>
+                </m:e>
+                <m:sub>
+                  <m:r>
+                    <m:t xml:space="preserve">i</m:t>
+                  </m:r>
+                  <m:r>
+                    <m:t xml:space="preserve">=</m:t>
+                  </m:r>
+                  <m:r>
+                    <m:t xml:space="preserve">1</m:t>
+                  </m:r>
+                </m:sub>
+                <m:sup>
+                  <m:sSub>
+                    <m:e>
+                      <m:r>
+                        <m:t xml:space="preserve">n</m:t>
+                      </m:r>
+                    </m:e>
+                    <m:sub>
+                      <m:r>
+                        <m:t xml:space="preserve">p</m:t>
+                      </m:r>
+                    </m:sub>
+                  </m:sSub>
+                </m:sup>
+              </m:sSubSup>
+              <m:sSubSup>
+                <m:e>
+                  <m:r>
+                    <m:t xml:space="preserve">w</m:t>
+                  </m:r>
+                </m:e>
+                <m:sub>
+                  <m:r>
+                    <m:t xml:space="preserve">h</m:t>
+                  </m:r>
+                  <m:r>
+                    <m:t xml:space="preserve">,</m:t>
+                  </m:r>
+                  <m:r>
+                    <m:t xml:space="preserve">i</m:t>
+                  </m:r>
+                </m:sub>
+                <m:sup>
+                  <m:r>
+                    <m:t xml:space="preserve">clean</m:t>
+                  </m:r>
+                </m:sup>
+              </m:sSubSup>
+              <m:sSub>
+                <m:e>
+                  <m:r>
+                    <m:t xml:space="preserve">a</m:t>
+                  </m:r>
+                </m:e>
+                <m:sub>
+                  <m:r>
+                    <m:t xml:space="preserve">i</m:t>
+                  </m:r>
+                </m:sub>
+              </m:sSub>
+              <m:r>
+                <m:t xml:space="preserve">,</m:t>
               </m:r>
             </m:oMath>
           </w:p>
@@ -2833,8 +4161,131 @@
               <w:jc w:val="center"/>
             </w:pPr>
             <m:oMath>
+              <m:sSubSup>
+                <m:e>
+                  <m:r>
+                    <m:t xml:space="preserve">Δc</m:t>
+                  </m:r>
+                </m:e>
+                <m:sub>
+                  <m:r>
+                    <m:t xml:space="preserve">h</m:t>
+                  </m:r>
+                </m:sub>
+                <m:sup>
+                  <m:r>
+                    <m:t xml:space="preserve">(</m:t>
+                  </m:r>
+                  <m:r>
+                    <m:t xml:space="preserve">V</m:t>
+                  </m:r>
+                  <m:r>
+                    <m:t xml:space="preserve">)</m:t>
+                  </m:r>
+                </m:sup>
+              </m:sSubSup>
               <m:r>
-                <m:t xml:space="preserve">Δc[h]^(V)=Σ[i=1]^n_p w[h,i]^cleanΔv[h,i]∈R^d[h].</m:t>
+                <m:t xml:space="preserve">=</m:t>
+              </m:r>
+              <m:sSubSup>
+                <m:e>
+                  <m:r>
+                    <m:t xml:space="preserve">Σ</m:t>
+                  </m:r>
+                </m:e>
+                <m:sub>
+                  <m:r>
+                    <m:t xml:space="preserve">i</m:t>
+                  </m:r>
+                  <m:r>
+                    <m:t xml:space="preserve">=</m:t>
+                  </m:r>
+                  <m:r>
+                    <m:t xml:space="preserve">1</m:t>
+                  </m:r>
+                </m:sub>
+                <m:sup>
+                  <m:sSub>
+                    <m:e>
+                      <m:r>
+                        <m:t xml:space="preserve">n</m:t>
+                      </m:r>
+                    </m:e>
+                    <m:sub>
+                      <m:r>
+                        <m:t xml:space="preserve">p</m:t>
+                      </m:r>
+                    </m:sub>
+                  </m:sSub>
+                </m:sup>
+              </m:sSubSup>
+              <m:sSubSup>
+                <m:e>
+                  <m:r>
+                    <m:t xml:space="preserve">w</m:t>
+                  </m:r>
+                </m:e>
+                <m:sub>
+                  <m:r>
+                    <m:t xml:space="preserve">h</m:t>
+                  </m:r>
+                  <m:r>
+                    <m:t xml:space="preserve">,</m:t>
+                  </m:r>
+                  <m:r>
+                    <m:t xml:space="preserve">i</m:t>
+                  </m:r>
+                </m:sub>
+                <m:sup>
+                  <m:r>
+                    <m:t xml:space="preserve">clean</m:t>
+                  </m:r>
+                </m:sup>
+              </m:sSubSup>
+              <m:sSub>
+                <m:e>
+                  <m:r>
+                    <m:t xml:space="preserve">Δv</m:t>
+                  </m:r>
+                </m:e>
+                <m:sub>
+                  <m:r>
+                    <m:t xml:space="preserve">h</m:t>
+                  </m:r>
+                  <m:r>
+                    <m:t xml:space="preserve">,</m:t>
+                  </m:r>
+                  <m:r>
+                    <m:t xml:space="preserve">i</m:t>
+                  </m:r>
+                </m:sub>
+              </m:sSub>
+              <m:r>
+                <m:t xml:space="preserve">∈</m:t>
+              </m:r>
+              <m:sSup>
+                <m:e>
+                  <m:r>
+                    <m:t xml:space="preserve">R</m:t>
+                  </m:r>
+                </m:e>
+                <m:sup>
+                  <m:sSub>
+                    <m:e>
+                      <m:r>
+                        <m:t xml:space="preserve">d</m:t>
+                      </m:r>
+                    </m:e>
+                    <m:sub>
+                      <m:r>
+                        <m:t xml:space="preserve">h</m:t>
+                      </m:r>
+                    </m:sub>
+                  </m:sSub>
+                </m:sup>
+              </m:sSup>
+              <m:r>
+                <m:t xml:space="preserve">.</m:t>
               </m:r>
             </m:oMath>
           </w:p>
@@ -2878,7 +4329,59 @@
           <w:color w:val="202A32"/>
           <w:sz w:val="20"/>
         </w:rPr>
-        <w:t>Here Δv_{h,i} is the measured change in the post-normalization Value projection for patch i. Γ_h(a) summarizes how the token pattern aligns with clean attention weights; the second expression retains token-specific Value changes and is the pre-output-projection head context audited in code. With attention frozen, coherent signed contributions can add and varying signs can cancel. This frozen-attention decomposition isolates Value-path transmission while leaving nonlinear attention rerouting and other causal paths outside its scope.</w:t>
+        <w:t xml:space="preserve">Here </w:t>
+      </w:r>
+      <m:oMath>
+        <m:sSub>
+          <m:e>
+            <m:r>
+              <m:t xml:space="preserve">Δv</m:t>
+            </m:r>
+          </m:e>
+          <m:sub>
+            <m:r>
+              <m:t xml:space="preserve">h</m:t>
+            </m:r>
+            <m:r>
+              <m:t xml:space="preserve">,</m:t>
+            </m:r>
+            <m:r>
+              <m:t xml:space="preserve">i</m:t>
+            </m:r>
+          </m:sub>
+        </m:sSub>
+      </m:oMath>
+      <w:r>
+        <w:rPr>
+          <w:rFonts w:ascii="Times New Roman" w:hAnsi="Times New Roman"/>
+          <w:i w:val="0"/>
+          <w:color w:val="202A32"/>
+          <w:sz w:val="20"/>
+        </w:rPr>
+        <w:t xml:space="preserve"> is the measured change in the post-normalization Value projection for patch i. </w:t>
+      </w:r>
+      <m:oMath>
+        <m:sSub>
+          <m:e>
+            <m:r>
+              <m:t xml:space="preserve">Γ</m:t>
+            </m:r>
+          </m:e>
+          <m:sub>
+            <m:r>
+              <m:t xml:space="preserve">h</m:t>
+            </m:r>
+          </m:sub>
+        </m:sSub>
+      </m:oMath>
+      <w:r>
+        <w:rPr>
+          <w:rFonts w:ascii="Times New Roman" w:hAnsi="Times New Roman"/>
+          <w:i w:val="0"/>
+          <w:color w:val="202A32"/>
+          <w:sz w:val="20"/>
+        </w:rPr>
+        <w:t>(a) summarizes how the token pattern aligns with clean attention weights; the second expression retains token-specific Value changes and is the pre-output-projection head context audited in code. With attention frozen, coherent signed contributions can add and varying signs can cancel. This frozen-attention decomposition isolates Value-path transmission while leaving nonlinear attention rerouting and other causal paths outside its scope.</w:t>
       </w:r>
     </w:p>
     <w:p>
@@ -2907,7 +4410,30 @@
           <w:color w:val="202A32"/>
           <w:sz w:val="20"/>
         </w:rPr>
-        <w:t>Local geometry is not sufficient to characterize later readout damage. The multi-block operator study evaluates N=100 held-out perturbations. On these held-out perturbations, damage prediction has higher correlation for the multi-block operator (Pearson r=0.975; Spearman ρ=0.945) than for the single-block operator (r=0.753; ρ=0.735). The mean principal angle from block 8 to block 9 is 49.0 degrees in the reported comparison. Fig. 6 shows this local-versus-end-to-end comparison. Separately, the N=100-image functional-geometry pilot finds that the threshold-defined near-null subspace of M_ℓ expands with depth while its entropy effective rank declines in late layers. This is consistent with greater late-layer replacement tolerance measured in separate interventions, but remains an empirical mechanistic association rather than a theorem or universal explanation.</w:t>
+        <w:t xml:space="preserve">Local geometry is not sufficient to characterize later readout damage. The multi-block operator study evaluates N=100 held-out perturbations. On these held-out perturbations, damage prediction has higher correlation for the multi-block operator (Pearson r=0.975; Spearman ρ=0.945) than for the single-block operator (r=0.753; ρ=0.735). The mean principal angle from block 8 to block 9 is 49.0 degrees in the reported comparison. Fig. 6 shows this local-versus-end-to-end comparison. Separately, the N=100-image functional-geometry pilot finds that the threshold-defined near-null subspace of </w:t>
+      </w:r>
+      <m:oMath>
+        <m:sSub>
+          <m:e>
+            <m:r>
+              <m:t xml:space="preserve">M</m:t>
+            </m:r>
+          </m:e>
+          <m:sub>
+            <m:r>
+              <m:t xml:space="preserve">ℓ</m:t>
+            </m:r>
+          </m:sub>
+        </m:sSub>
+      </m:oMath>
+      <w:r>
+        <w:rPr>
+          <w:rFonts w:ascii="Times New Roman" w:hAnsi="Times New Roman"/>
+          <w:i w:val="0"/>
+          <w:color w:val="202A32"/>
+          <w:sz w:val="20"/>
+        </w:rPr>
+        <w:t xml:space="preserve"> expands with depth while its entropy effective rank declines in late layers. This is consistent with greater late-layer replacement tolerance measured in separate interventions, but remains an empirical mechanistic association rather than a theorem or universal explanation.</w:t>
       </w:r>
     </w:p>
     <w:p>
@@ -2930,7 +4456,59 @@
           <w:color w:val="202A32"/>
           <w:sz w:val="20"/>
         </w:rPr>
-        <w:t xml:space="preserve"> A distinct joint-stream geometry audit (N=100 images per model) selects feature directions using its own per-image mean patch-margin-gradient metric, separate from M_ℓ in the functional-geometry pilot and from the full-logit J_{ℓ→L} used in compression. It finds that downstream damage depends jointly on feature direction and token-space coherence: sensitive feature directions are most damaging under coherent token patterns, whereas functionally near-null directions remain comparatively tolerated across the tested patterns. The audit injects the norm-matched rank-one perturbation</w:t>
+        <w:t xml:space="preserve"> A distinct joint-stream geometry audit (N=100 images per model) selects feature directions using its own per-image mean patch-margin-gradient metric, separate from </w:t>
+      </w:r>
+      <m:oMath>
+        <m:sSub>
+          <m:e>
+            <m:r>
+              <m:t xml:space="preserve">M</m:t>
+            </m:r>
+          </m:e>
+          <m:sub>
+            <m:r>
+              <m:t xml:space="preserve">ℓ</m:t>
+            </m:r>
+          </m:sub>
+        </m:sSub>
+      </m:oMath>
+      <w:r>
+        <w:rPr>
+          <w:rFonts w:ascii="Times New Roman" w:hAnsi="Times New Roman"/>
+          <w:i w:val="0"/>
+          <w:color w:val="202A32"/>
+          <w:sz w:val="20"/>
+        </w:rPr>
+        <w:t xml:space="preserve"> in the functional-geometry pilot and from the full-logit </w:t>
+      </w:r>
+      <m:oMath>
+        <m:sSub>
+          <m:e>
+            <m:r>
+              <m:t xml:space="preserve">J</m:t>
+            </m:r>
+          </m:e>
+          <m:sub>
+            <m:r>
+              <m:t xml:space="preserve">ℓ</m:t>
+            </m:r>
+            <m:r>
+              <m:t xml:space="preserve">→</m:t>
+            </m:r>
+            <m:r>
+              <m:t xml:space="preserve">L</m:t>
+            </m:r>
+          </m:sub>
+        </m:sSub>
+      </m:oMath>
+      <w:r>
+        <w:rPr>
+          <w:rFonts w:ascii="Times New Roman" w:hAnsi="Times New Roman"/>
+          <w:i w:val="0"/>
+          <w:color w:val="202A32"/>
+          <w:sz w:val="20"/>
+        </w:rPr>
+        <w:t xml:space="preserve"> used in compression. It finds that downstream damage depends jointly on feature direction and token-space coherence: sensitive feature directions are most damaging under coherent token patterns, whereas functionally near-null directions remain comparatively tolerated across the tested patterns. The audit injects the norm-matched rank-one perturbation</w:t>
       </w:r>
     </w:p>
     <w:tbl>
@@ -2994,8 +4572,182 @@
               <w:jc w:val="center"/>
             </w:pPr>
             <m:oMath>
+              <m:sSub>
+                <m:e>
+                  <m:r>
+                    <m:t xml:space="preserve">ΔP</m:t>
+                  </m:r>
+                </m:e>
+                <m:sub>
+                  <m:r>
+                    <m:t xml:space="preserve">l</m:t>
+                  </m:r>
+                </m:sub>
+              </m:sSub>
               <m:r>
-                <m:t xml:space="preserve">ΔP[l]=α a v^T, a∈R^n_p, v∈R^D, ||a||[2]=||v||[2]=1, ||ΔP[l]||[F]=α.</m:t>
+                <m:t xml:space="preserve">=</m:t>
+              </m:r>
+              <m:sSup>
+                <m:e>
+                  <m:r>
+                    <m:t xml:space="preserve">αav</m:t>
+                  </m:r>
+                </m:e>
+                <m:sup>
+                  <m:r>
+                    <m:t xml:space="preserve">T</m:t>
+                  </m:r>
+                </m:sup>
+              </m:sSup>
+              <m:r>
+                <m:t xml:space="preserve">,</m:t>
+              </m:r>
+              <m:r>
+                <m:t xml:space="preserve"> </m:t>
+              </m:r>
+              <m:r>
+                <m:t xml:space="preserve">a</m:t>
+              </m:r>
+              <m:r>
+                <m:t xml:space="preserve">∈</m:t>
+              </m:r>
+              <m:sSup>
+                <m:e>
+                  <m:r>
+                    <m:t xml:space="preserve">R</m:t>
+                  </m:r>
+                </m:e>
+                <m:sup>
+                  <m:sSub>
+                    <m:e>
+                      <m:r>
+                        <m:t xml:space="preserve">n</m:t>
+                      </m:r>
+                    </m:e>
+                    <m:sub>
+                      <m:r>
+                        <m:t xml:space="preserve">p</m:t>
+                      </m:r>
+                    </m:sub>
+                  </m:sSub>
+                </m:sup>
+              </m:sSup>
+              <m:r>
+                <m:t xml:space="preserve">,</m:t>
+              </m:r>
+              <m:r>
+                <m:t xml:space="preserve"> </m:t>
+              </m:r>
+              <m:r>
+                <m:t xml:space="preserve">v</m:t>
+              </m:r>
+              <m:r>
+                <m:t xml:space="preserve">∈</m:t>
+              </m:r>
+              <m:sSup>
+                <m:e>
+                  <m:r>
+                    <m:t xml:space="preserve">R</m:t>
+                  </m:r>
+                </m:e>
+                <m:sup>
+                  <m:r>
+                    <m:t xml:space="preserve">D</m:t>
+                  </m:r>
+                </m:sup>
+              </m:sSup>
+              <m:r>
+                <m:t xml:space="preserve">,</m:t>
+              </m:r>
+              <m:r>
+                <m:t xml:space="preserve"> </m:t>
+              </m:r>
+              <m:r>
+                <m:t xml:space="preserve">‖</m:t>
+              </m:r>
+              <m:r>
+                <m:t xml:space="preserve">a</m:t>
+              </m:r>
+              <m:sSub>
+                <m:e>
+                  <m:r>
+                    <m:t xml:space="preserve">‖</m:t>
+                  </m:r>
+                </m:e>
+                <m:sub>
+                  <m:r>
+                    <m:t xml:space="preserve">2</m:t>
+                  </m:r>
+                </m:sub>
+              </m:sSub>
+              <m:r>
+                <m:t xml:space="preserve">=</m:t>
+              </m:r>
+              <m:r>
+                <m:t xml:space="preserve">‖</m:t>
+              </m:r>
+              <m:r>
+                <m:t xml:space="preserve">v</m:t>
+              </m:r>
+              <m:sSub>
+                <m:e>
+                  <m:r>
+                    <m:t xml:space="preserve">‖</m:t>
+                  </m:r>
+                </m:e>
+                <m:sub>
+                  <m:r>
+                    <m:t xml:space="preserve">2</m:t>
+                  </m:r>
+                </m:sub>
+              </m:sSub>
+              <m:r>
+                <m:t xml:space="preserve">=</m:t>
+              </m:r>
+              <m:r>
+                <m:t xml:space="preserve">1</m:t>
+              </m:r>
+              <m:r>
+                <m:t xml:space="preserve">,</m:t>
+              </m:r>
+              <m:r>
+                <m:t xml:space="preserve"> </m:t>
+              </m:r>
+              <m:r>
+                <m:t xml:space="preserve">‖</m:t>
+              </m:r>
+              <m:sSub>
+                <m:e>
+                  <m:r>
+                    <m:t xml:space="preserve">ΔP</m:t>
+                  </m:r>
+                </m:e>
+                <m:sub>
+                  <m:r>
+                    <m:t xml:space="preserve">l</m:t>
+                  </m:r>
+                </m:sub>
+              </m:sSub>
+              <m:sSub>
+                <m:e>
+                  <m:r>
+                    <m:t xml:space="preserve">‖</m:t>
+                  </m:r>
+                </m:e>
+                <m:sub>
+                  <m:r>
+                    <m:t xml:space="preserve">F</m:t>
+                  </m:r>
+                </m:sub>
+              </m:sSub>
+              <m:r>
+                <m:t xml:space="preserve">=</m:t>
+              </m:r>
+              <m:r>
+                <m:t xml:space="preserve">α</m:t>
+              </m:r>
+              <m:r>
+                <m:t xml:space="preserve">.</m:t>
               </m:r>
             </m:oMath>
           </w:p>
@@ -3039,7 +4791,30 @@
           <w:color w:val="202A32"/>
           <w:sz w:val="20"/>
         </w:rPr>
-        <w:t>with α=sσ_ℓ≥0; consequently α is the Frobenius norm of the injected patch perturbation.</w:t>
+        <w:t>with α=</w:t>
+      </w:r>
+      <m:oMath>
+        <m:sSub>
+          <m:e>
+            <m:r>
+              <m:t xml:space="preserve">sσ</m:t>
+            </m:r>
+          </m:e>
+          <m:sub>
+            <m:r>
+              <m:t xml:space="preserve">ℓ</m:t>
+            </m:r>
+          </m:sub>
+        </m:sSub>
+      </m:oMath>
+      <w:r>
+        <w:rPr>
+          <w:rFonts w:ascii="Times New Roman" w:hAnsi="Times New Roman"/>
+          <w:i w:val="0"/>
+          <w:color w:val="202A32"/>
+          <w:sz w:val="20"/>
+        </w:rPr>
+        <w:t>≥0; consequently α is the Frobenius norm of the injected patch perturbation.</w:t>
       </w:r>
     </w:p>
     <w:p>
@@ -3097,7 +4872,64 @@
           <w:color w:val="4C5963"/>
           <w:sz w:val="17"/>
         </w:rPr>
-        <w:t>Fig. 6. Pearson and Spearman correlations between the single-block operator A₈ and end-to-end Jacobian J₈→₁₂ predictions and measured final-logit L2 damage on N=100 held-out perturbations. J₈→₁₂ composes blocks 9–12 and the final normalization/CLS readout. The mean principal angle from block 8 to block 9 is 49.0°.</w:t>
+        <w:t>Fig. 6. Pearson and Spearman correlations between the single-block operator A</w:t>
+      </w:r>
+      <w:r>
+        <w:rPr>
+          <w:rFonts w:ascii="Times New Roman" w:hAnsi="Times New Roman"/>
+          <w:i/>
+          <w:color w:val="4C5963"/>
+          <w:sz w:val="17"/>
+          <w:vertAlign w:val="subscript"/>
+        </w:rPr>
+        <w:t>8</w:t>
+      </w:r>
+      <w:r>
+        <w:rPr>
+          <w:rFonts w:ascii="Times New Roman" w:hAnsi="Times New Roman"/>
+          <w:i/>
+          <w:color w:val="4C5963"/>
+          <w:sz w:val="17"/>
+        </w:rPr>
+        <w:t xml:space="preserve"> and end-to-end Jacobian J</w:t>
+      </w:r>
+      <w:r>
+        <w:rPr>
+          <w:rFonts w:ascii="Times New Roman" w:hAnsi="Times New Roman"/>
+          <w:i/>
+          <w:color w:val="4C5963"/>
+          <w:sz w:val="17"/>
+          <w:vertAlign w:val="subscript"/>
+        </w:rPr>
+        <w:t>8→12</w:t>
+      </w:r>
+      <w:r>
+        <w:rPr>
+          <w:rFonts w:ascii="Times New Roman" w:hAnsi="Times New Roman"/>
+          <w:i/>
+          <w:color w:val="4C5963"/>
+          <w:sz w:val="17"/>
+        </w:rPr>
+        <w:t xml:space="preserve"> predictions and measured final-logit L2 damage on N=100 held-out perturbations. J</w:t>
+      </w:r>
+      <w:r>
+        <w:rPr>
+          <w:rFonts w:ascii="Times New Roman" w:hAnsi="Times New Roman"/>
+          <w:i/>
+          <w:color w:val="4C5963"/>
+          <w:sz w:val="17"/>
+          <w:vertAlign w:val="subscript"/>
+        </w:rPr>
+        <w:t>8→12</w:t>
+      </w:r>
+      <w:r>
+        <w:rPr>
+          <w:rFonts w:ascii="Times New Roman" w:hAnsi="Times New Roman"/>
+          <w:i/>
+          <w:color w:val="4C5963"/>
+          <w:sz w:val="17"/>
+        </w:rPr>
+        <w:t xml:space="preserve"> composes blocks 9–12 and the final normalization/CLS readout. The mean principal angle from block 8 to block 9 is 49.0°.</w:t>
       </w:r>
     </w:p>
     <w:p>
@@ -3111,7 +4943,39 @@
           <w:color w:val="202A32"/>
           <w:sz w:val="20"/>
         </w:rPr>
-        <w:t>The end-to-end linearization maps all patch features at layer ℓ to the final classifier-logit vector z∈ℝ^{d_z}:</w:t>
+        <w:t>The end-to-end linearization maps all patch features at layer ℓ to the final classifier-logit vector z∈</w:t>
+      </w:r>
+      <m:oMath>
+        <m:sSup>
+          <m:e>
+            <m:r>
+              <m:t xml:space="preserve">ℝ</m:t>
+            </m:r>
+          </m:e>
+          <m:sup>
+            <m:sSub>
+              <m:e>
+                <m:r>
+                  <m:t xml:space="preserve">d</m:t>
+                </m:r>
+              </m:e>
+              <m:sub>
+                <m:r>
+                  <m:t xml:space="preserve">z</m:t>
+                </m:r>
+              </m:sub>
+            </m:sSub>
+          </m:sup>
+        </m:sSup>
+      </m:oMath>
+      <w:r>
+        <w:rPr>
+          <w:rFonts w:ascii="Times New Roman" w:hAnsi="Times New Roman"/>
+          <w:i w:val="0"/>
+          <w:color w:val="202A32"/>
+          <w:sz w:val="20"/>
+        </w:rPr>
+        <w:t>:</w:t>
       </w:r>
     </w:p>
     <w:tbl>
@@ -3175,8 +5039,161 @@
               <w:jc w:val="center"/>
             </w:pPr>
             <m:oMath>
+              <m:sSub>
+                <m:e>
+                  <m:r>
+                    <m:t xml:space="preserve">J</m:t>
+                  </m:r>
+                </m:e>
+                <m:sub>
+                  <m:r>
+                    <m:t xml:space="preserve">l</m:t>
+                  </m:r>
+                  <m:r>
+                    <m:t xml:space="preserve">→</m:t>
+                  </m:r>
+                  <m:r>
+                    <m:t xml:space="preserve">L</m:t>
+                  </m:r>
+                </m:sub>
+              </m:sSub>
               <m:r>
-                <m:t xml:space="preserve">J[l→L]=∂z/∂rvec(P[l])∈R^d[z] x n_p D, Δz≈J[l→L]rvec(ΔP[l]),</m:t>
+                <m:t xml:space="preserve">=</m:t>
+              </m:r>
+              <m:r>
+                <m:t xml:space="preserve">∂</m:t>
+              </m:r>
+              <m:r>
+                <m:t xml:space="preserve">z</m:t>
+              </m:r>
+              <m:r>
+                <m:t xml:space="preserve">/</m:t>
+              </m:r>
+              <m:r>
+                <m:t xml:space="preserve">∂</m:t>
+              </m:r>
+              <m:r>
+                <m:t xml:space="preserve">rvec</m:t>
+              </m:r>
+              <m:r>
+                <m:t xml:space="preserve">(</m:t>
+              </m:r>
+              <m:sSub>
+                <m:e>
+                  <m:r>
+                    <m:t xml:space="preserve">P</m:t>
+                  </m:r>
+                </m:e>
+                <m:sub>
+                  <m:r>
+                    <m:t xml:space="preserve">l</m:t>
+                  </m:r>
+                </m:sub>
+              </m:sSub>
+              <m:r>
+                <m:t xml:space="preserve">)</m:t>
+              </m:r>
+              <m:r>
+                <m:t xml:space="preserve">∈</m:t>
+              </m:r>
+              <m:sSup>
+                <m:e>
+                  <m:r>
+                    <m:t xml:space="preserve">R</m:t>
+                  </m:r>
+                </m:e>
+                <m:sup>
+                  <m:sSub>
+                    <m:e>
+                      <m:r>
+                        <m:t xml:space="preserve">d</m:t>
+                      </m:r>
+                    </m:e>
+                    <m:sub>
+                      <m:r>
+                        <m:t xml:space="preserve">z</m:t>
+                      </m:r>
+                    </m:sub>
+                  </m:sSub>
+                  <m:r>
+                    <m:t xml:space="preserve">×</m:t>
+                  </m:r>
+                  <m:sSub>
+                    <m:e>
+                      <m:r>
+                        <m:t xml:space="preserve">n</m:t>
+                      </m:r>
+                    </m:e>
+                    <m:sub>
+                      <m:r>
+                        <m:t xml:space="preserve">p</m:t>
+                      </m:r>
+                    </m:sub>
+                  </m:sSub>
+                  <m:r>
+                    <m:t xml:space="preserve"> </m:t>
+                  </m:r>
+                  <m:r>
+                    <m:t xml:space="preserve">D</m:t>
+                  </m:r>
+                </m:sup>
+              </m:sSup>
+              <m:r>
+                <m:t xml:space="preserve">,</m:t>
+              </m:r>
+              <m:r>
+                <m:t xml:space="preserve"> </m:t>
+              </m:r>
+              <m:r>
+                <m:t xml:space="preserve">Δz</m:t>
+              </m:r>
+              <m:r>
+                <m:t xml:space="preserve">≈</m:t>
+              </m:r>
+              <m:sSub>
+                <m:e>
+                  <m:r>
+                    <m:t xml:space="preserve">J</m:t>
+                  </m:r>
+                </m:e>
+                <m:sub>
+                  <m:r>
+                    <m:t xml:space="preserve">l</m:t>
+                  </m:r>
+                  <m:r>
+                    <m:t xml:space="preserve">→</m:t>
+                  </m:r>
+                  <m:r>
+                    <m:t xml:space="preserve">L</m:t>
+                  </m:r>
+                </m:sub>
+              </m:sSub>
+              <m:r>
+                <m:t xml:space="preserve"> </m:t>
+              </m:r>
+              <m:r>
+                <m:t xml:space="preserve">rvec</m:t>
+              </m:r>
+              <m:r>
+                <m:t xml:space="preserve">(</m:t>
+              </m:r>
+              <m:sSub>
+                <m:e>
+                  <m:r>
+                    <m:t xml:space="preserve">ΔP</m:t>
+                  </m:r>
+                </m:e>
+                <m:sub>
+                  <m:r>
+                    <m:t xml:space="preserve">l</m:t>
+                  </m:r>
+                </m:sub>
+              </m:sSub>
+              <m:r>
+                <m:t xml:space="preserve">)</m:t>
+              </m:r>
+              <m:r>
+                <m:t xml:space="preserve">,</m:t>
               </m:r>
             </m:oMath>
           </w:p>
@@ -3188,7 +5205,43 @@
             </w:pPr>
             <m:oMath>
               <m:r>
-                <m:t xml:space="preserve">rvec(X)=vec(X^T).</m:t>
+                <m:t xml:space="preserve">rvec</m:t>
+              </m:r>
+              <m:r>
+                <m:t xml:space="preserve">(</m:t>
+              </m:r>
+              <m:r>
+                <m:t xml:space="preserve">X</m:t>
+              </m:r>
+              <m:r>
+                <m:t xml:space="preserve">)</m:t>
+              </m:r>
+              <m:r>
+                <m:t xml:space="preserve">=</m:t>
+              </m:r>
+              <m:r>
+                <m:t xml:space="preserve">vec</m:t>
+              </m:r>
+              <m:r>
+                <m:t xml:space="preserve">(</m:t>
+              </m:r>
+              <m:sSup>
+                <m:e>
+                  <m:r>
+                    <m:t xml:space="preserve">X</m:t>
+                  </m:r>
+                </m:e>
+                <m:sup>
+                  <m:r>
+                    <m:t xml:space="preserve">T</m:t>
+                  </m:r>
+                </m:sup>
+              </m:sSup>
+              <m:r>
+                <m:t xml:space="preserve">)</m:t>
+              </m:r>
+              <m:r>
+                <m:t xml:space="preserve">.</m:t>
               </m:r>
             </m:oMath>
           </w:p>
@@ -3232,7 +5285,99 @@
           <w:color w:val="202A32"/>
           <w:sz w:val="20"/>
         </w:rPr>
-        <w:t>The implementation reshapes each n_p×D patch matrix in row-major order, which equals the conventional column-vectorization vec(Xᵀ) used by rvec. In the confirmatory classification runs, d_z is the number of class logits. The Jacobian product is a first-order readout-change approximation at the unperturbed activation, not an exact identity for large perturbations or a universal account of transformer behavior. This full-logit, all-patch Jacobian is distinct from the pooled margin-gradient feature metric M_ℓ in Eq. (2).</w:t>
+        <w:t xml:space="preserve">The implementation reshapes each </w:t>
+      </w:r>
+      <m:oMath>
+        <m:sSub>
+          <m:e>
+            <m:r>
+              <m:t xml:space="preserve">n</m:t>
+            </m:r>
+          </m:e>
+          <m:sub>
+            <m:r>
+              <m:t xml:space="preserve">p</m:t>
+            </m:r>
+          </m:sub>
+        </m:sSub>
+      </m:oMath>
+      <w:r>
+        <w:rPr>
+          <w:rFonts w:ascii="Times New Roman" w:hAnsi="Times New Roman"/>
+          <w:i w:val="0"/>
+          <w:color w:val="202A32"/>
+          <w:sz w:val="20"/>
+        </w:rPr>
+        <w:t>×D patch matrix in row-major order, which equals the conventional column-vectorization vec(</w:t>
+      </w:r>
+      <m:oMath>
+        <m:sSup>
+          <m:e>
+            <m:r>
+              <m:t xml:space="preserve">X</m:t>
+            </m:r>
+          </m:e>
+          <m:sup>
+            <m:r>
+              <m:t xml:space="preserve">T</m:t>
+            </m:r>
+          </m:sup>
+        </m:sSup>
+      </m:oMath>
+      <w:r>
+        <w:rPr>
+          <w:rFonts w:ascii="Times New Roman" w:hAnsi="Times New Roman"/>
+          <w:i w:val="0"/>
+          <w:color w:val="202A32"/>
+          <w:sz w:val="20"/>
+        </w:rPr>
+        <w:t xml:space="preserve">) used by rvec. In the confirmatory classification runs, </w:t>
+      </w:r>
+      <m:oMath>
+        <m:sSub>
+          <m:e>
+            <m:r>
+              <m:t xml:space="preserve">d</m:t>
+            </m:r>
+          </m:e>
+          <m:sub>
+            <m:r>
+              <m:t xml:space="preserve">z</m:t>
+            </m:r>
+          </m:sub>
+        </m:sSub>
+      </m:oMath>
+      <w:r>
+        <w:rPr>
+          <w:rFonts w:ascii="Times New Roman" w:hAnsi="Times New Roman"/>
+          <w:i w:val="0"/>
+          <w:color w:val="202A32"/>
+          <w:sz w:val="20"/>
+        </w:rPr>
+        <w:t xml:space="preserve"> is the number of class logits. The Jacobian product is a first-order readout-change approximation at the unperturbed activation, not an exact identity for large perturbations or a universal account of transformer behavior. This full-logit, all-patch Jacobian is distinct from the pooled margin-gradient feature metric </w:t>
+      </w:r>
+      <m:oMath>
+        <m:sSub>
+          <m:e>
+            <m:r>
+              <m:t xml:space="preserve">M</m:t>
+            </m:r>
+          </m:e>
+          <m:sub>
+            <m:r>
+              <m:t xml:space="preserve">ℓ</m:t>
+            </m:r>
+          </m:sub>
+        </m:sSub>
+      </m:oMath>
+      <w:r>
+        <w:rPr>
+          <w:rFonts w:ascii="Times New Roman" w:hAnsi="Times New Roman"/>
+          <w:i w:val="0"/>
+          <w:color w:val="202A32"/>
+          <w:sz w:val="20"/>
+        </w:rPr>
+        <w:t xml:space="preserve"> in Eq. (2).</w:t>
       </w:r>
     </w:p>
     <w:p>
@@ -3276,7 +5421,178 @@
           <w:color w:val="202A32"/>
           <w:sz w:val="20"/>
         </w:rPr>
-        <w:t>For each image, n_p patch tokens are assigned to B carriers. Let S∈{0,1}^{n_p×B} be the assignment matrix, with exactly one nonzero per row, and let C∈ℝ^{B×D} contain the carrier vectors. The reconstructed patch matrix is P̂=SC. The set G_j contains the patch indices assigned to carrier j, and m_j=|G_j| is its membership count. The Group Mean baseline sets each carrier to the average of the patches assigned to that group:</w:t>
+        <w:t xml:space="preserve">For each image, </w:t>
+      </w:r>
+      <m:oMath>
+        <m:sSub>
+          <m:e>
+            <m:r>
+              <m:t xml:space="preserve">n</m:t>
+            </m:r>
+          </m:e>
+          <m:sub>
+            <m:r>
+              <m:t xml:space="preserve">p</m:t>
+            </m:r>
+          </m:sub>
+        </m:sSub>
+      </m:oMath>
+      <w:r>
+        <w:rPr>
+          <w:rFonts w:ascii="Times New Roman" w:hAnsi="Times New Roman"/>
+          <w:i w:val="0"/>
+          <w:color w:val="202A32"/>
+          <w:sz w:val="20"/>
+        </w:rPr>
+        <w:t xml:space="preserve"> patch tokens are assigned to B carriers. Let S∈</w:t>
+      </w:r>
+      <m:oMath>
+        <m:sSup>
+          <m:e>
+            <m:r>
+              <m:t xml:space="preserve">{</m:t>
+            </m:r>
+            <m:r>
+              <m:t xml:space="preserve">0</m:t>
+            </m:r>
+            <m:r>
+              <m:t xml:space="preserve">,</m:t>
+            </m:r>
+            <m:r>
+              <m:t xml:space="preserve">1</m:t>
+            </m:r>
+            <m:r>
+              <m:t xml:space="preserve">}</m:t>
+            </m:r>
+          </m:e>
+          <m:sup>
+            <m:sSub>
+              <m:e>
+                <m:r>
+                  <m:t xml:space="preserve">n</m:t>
+                </m:r>
+              </m:e>
+              <m:sub>
+                <m:r>
+                  <m:t xml:space="preserve">p</m:t>
+                </m:r>
+              </m:sub>
+            </m:sSub>
+            <m:r>
+              <m:t xml:space="preserve">×</m:t>
+            </m:r>
+            <m:r>
+              <m:t xml:space="preserve">B</m:t>
+            </m:r>
+          </m:sup>
+        </m:sSup>
+      </m:oMath>
+      <w:r>
+        <w:rPr>
+          <w:rFonts w:ascii="Times New Roman" w:hAnsi="Times New Roman"/>
+          <w:i w:val="0"/>
+          <w:color w:val="202A32"/>
+          <w:sz w:val="20"/>
+        </w:rPr>
+        <w:t xml:space="preserve"> be the assignment matrix, with exactly one nonzero per row, and let C∈</w:t>
+      </w:r>
+      <m:oMath>
+        <m:sSup>
+          <m:e>
+            <m:r>
+              <m:t xml:space="preserve">ℝ</m:t>
+            </m:r>
+          </m:e>
+          <m:sup>
+            <m:r>
+              <m:t xml:space="preserve">B</m:t>
+            </m:r>
+            <m:r>
+              <m:t xml:space="preserve">×</m:t>
+            </m:r>
+            <m:r>
+              <m:t xml:space="preserve">D</m:t>
+            </m:r>
+          </m:sup>
+        </m:sSup>
+      </m:oMath>
+      <w:r>
+        <w:rPr>
+          <w:rFonts w:ascii="Times New Roman" w:hAnsi="Times New Roman"/>
+          <w:i w:val="0"/>
+          <w:color w:val="202A32"/>
+          <w:sz w:val="20"/>
+        </w:rPr>
+        <w:t xml:space="preserve"> contain the carrier vectors. The reconstructed patch matrix is P̂=SC. The set </w:t>
+      </w:r>
+      <m:oMath>
+        <m:sSub>
+          <m:e>
+            <m:r>
+              <m:t xml:space="preserve">G</m:t>
+            </m:r>
+          </m:e>
+          <m:sub>
+            <m:r>
+              <m:t xml:space="preserve">j</m:t>
+            </m:r>
+          </m:sub>
+        </m:sSub>
+      </m:oMath>
+      <w:r>
+        <w:rPr>
+          <w:rFonts w:ascii="Times New Roman" w:hAnsi="Times New Roman"/>
+          <w:i w:val="0"/>
+          <w:color w:val="202A32"/>
+          <w:sz w:val="20"/>
+        </w:rPr>
+        <w:t xml:space="preserve"> contains the patch indices assigned to carrier j, and </w:t>
+      </w:r>
+      <m:oMath>
+        <m:sSub>
+          <m:e>
+            <m:r>
+              <m:t xml:space="preserve">m</m:t>
+            </m:r>
+          </m:e>
+          <m:sub>
+            <m:r>
+              <m:t xml:space="preserve">j</m:t>
+            </m:r>
+          </m:sub>
+        </m:sSub>
+      </m:oMath>
+      <w:r>
+        <w:rPr>
+          <w:rFonts w:ascii="Times New Roman" w:hAnsi="Times New Roman"/>
+          <w:i w:val="0"/>
+          <w:color w:val="202A32"/>
+          <w:sz w:val="20"/>
+        </w:rPr>
+        <w:t>=|</w:t>
+      </w:r>
+      <m:oMath>
+        <m:sSub>
+          <m:e>
+            <m:r>
+              <m:t xml:space="preserve">G</m:t>
+            </m:r>
+          </m:e>
+          <m:sub>
+            <m:r>
+              <m:t xml:space="preserve">j</m:t>
+            </m:r>
+          </m:sub>
+        </m:sSub>
+      </m:oMath>
+      <w:r>
+        <w:rPr>
+          <w:rFonts w:ascii="Times New Roman" w:hAnsi="Times New Roman"/>
+          <w:i w:val="0"/>
+          <w:color w:val="202A32"/>
+          <w:sz w:val="20"/>
+        </w:rPr>
+        <w:t>| is its membership count. The Group Mean baseline sets each carrier to the average of the patches assigned to that group:</w:t>
       </w:r>
     </w:p>
     <w:tbl>
@@ -3340,8 +5656,133 @@
               <w:jc w:val="center"/>
             </w:pPr>
             <m:oMath>
+              <m:sSubSup>
+                <m:e>
+                  <m:r>
+                    <m:t xml:space="preserve">c</m:t>
+                  </m:r>
+                </m:e>
+                <m:sub>
+                  <m:r>
+                    <m:t xml:space="preserve">j</m:t>
+                  </m:r>
+                </m:sub>
+                <m:sup>
+                  <m:r>
+                    <m:t xml:space="preserve">mean</m:t>
+                  </m:r>
+                </m:sup>
+              </m:sSubSup>
               <m:r>
-                <m:t xml:space="preserve">c[j]^mean=(1/m[j])Σ[i∈G[j]]p[i], m[j]=|G[j]|.</m:t>
+                <m:t xml:space="preserve">=</m:t>
+              </m:r>
+              <m:r>
+                <m:t xml:space="preserve">(</m:t>
+              </m:r>
+              <m:r>
+                <m:t xml:space="preserve">1</m:t>
+              </m:r>
+              <m:r>
+                <m:t xml:space="preserve">/</m:t>
+              </m:r>
+              <m:sSub>
+                <m:e>
+                  <m:r>
+                    <m:t xml:space="preserve">m</m:t>
+                  </m:r>
+                </m:e>
+                <m:sub>
+                  <m:r>
+                    <m:t xml:space="preserve">j</m:t>
+                  </m:r>
+                </m:sub>
+              </m:sSub>
+              <m:r>
+                <m:t xml:space="preserve">)</m:t>
+              </m:r>
+              <m:sSub>
+                <m:e>
+                  <m:r>
+                    <m:t xml:space="preserve">Σ</m:t>
+                  </m:r>
+                </m:e>
+                <m:sub>
+                  <m:r>
+                    <m:t xml:space="preserve">i</m:t>
+                  </m:r>
+                  <m:r>
+                    <m:t xml:space="preserve">∈</m:t>
+                  </m:r>
+                  <m:sSub>
+                    <m:e>
+                      <m:r>
+                        <m:t xml:space="preserve">G</m:t>
+                      </m:r>
+                    </m:e>
+                    <m:sub>
+                      <m:r>
+                        <m:t xml:space="preserve">j</m:t>
+                      </m:r>
+                    </m:sub>
+                  </m:sSub>
+                </m:sub>
+              </m:sSub>
+              <m:r>
+                <m:t xml:space="preserve"> </m:t>
+              </m:r>
+              <m:sSub>
+                <m:e>
+                  <m:r>
+                    <m:t xml:space="preserve">p</m:t>
+                  </m:r>
+                </m:e>
+                <m:sub>
+                  <m:r>
+                    <m:t xml:space="preserve">i</m:t>
+                  </m:r>
+                </m:sub>
+              </m:sSub>
+              <m:r>
+                <m:t xml:space="preserve">,</m:t>
+              </m:r>
+              <m:r>
+                <m:t xml:space="preserve"> </m:t>
+              </m:r>
+              <m:sSub>
+                <m:e>
+                  <m:r>
+                    <m:t xml:space="preserve">m</m:t>
+                  </m:r>
+                </m:e>
+                <m:sub>
+                  <m:r>
+                    <m:t xml:space="preserve">j</m:t>
+                  </m:r>
+                </m:sub>
+              </m:sSub>
+              <m:r>
+                <m:t xml:space="preserve">=</m:t>
+              </m:r>
+              <m:r>
+                <m:t xml:space="preserve">|</m:t>
+              </m:r>
+              <m:sSub>
+                <m:e>
+                  <m:r>
+                    <m:t xml:space="preserve">G</m:t>
+                  </m:r>
+                </m:e>
+                <m:sub>
+                  <m:r>
+                    <m:t xml:space="preserve">j</m:t>
+                  </m:r>
+                </m:sub>
+              </m:sSub>
+              <m:r>
+                <m:t xml:space="preserve">|</m:t>
+              </m:r>
+              <m:r>
+                <m:t xml:space="preserve">.</m:t>
               </m:r>
             </m:oMath>
           </w:p>
@@ -3403,7 +5844,153 @@
           <w:color w:val="202A32"/>
           <w:sz w:val="20"/>
         </w:rPr>
-        <w:t xml:space="preserve"> The full-J oracle uses J_s=J_{ℓ→L}; for a rank-r approximation, the solver instead uses J_s=U_rᵀJ_{ℓ→L}, where U_r contains the leading left singular vectors. In either case, the solver minimizes</w:t>
+        <w:t xml:space="preserve"> The full-J oracle uses </w:t>
+      </w:r>
+      <m:oMath>
+        <m:sSub>
+          <m:e>
+            <m:r>
+              <m:t xml:space="preserve">J</m:t>
+            </m:r>
+          </m:e>
+          <m:sub>
+            <m:r>
+              <m:t xml:space="preserve">s</m:t>
+            </m:r>
+          </m:sub>
+        </m:sSub>
+      </m:oMath>
+      <w:r>
+        <w:rPr>
+          <w:rFonts w:ascii="Times New Roman" w:hAnsi="Times New Roman"/>
+          <w:i w:val="0"/>
+          <w:color w:val="202A32"/>
+          <w:sz w:val="20"/>
+        </w:rPr>
+        <w:t>=</w:t>
+      </w:r>
+      <m:oMath>
+        <m:sSub>
+          <m:e>
+            <m:r>
+              <m:t xml:space="preserve">J</m:t>
+            </m:r>
+          </m:e>
+          <m:sub>
+            <m:r>
+              <m:t xml:space="preserve">ℓ</m:t>
+            </m:r>
+            <m:r>
+              <m:t xml:space="preserve">→</m:t>
+            </m:r>
+            <m:r>
+              <m:t xml:space="preserve">L</m:t>
+            </m:r>
+          </m:sub>
+        </m:sSub>
+      </m:oMath>
+      <w:r>
+        <w:rPr>
+          <w:rFonts w:ascii="Times New Roman" w:hAnsi="Times New Roman"/>
+          <w:i w:val="0"/>
+          <w:color w:val="202A32"/>
+          <w:sz w:val="20"/>
+        </w:rPr>
+        <w:t xml:space="preserve">; for a rank-r approximation, the solver instead uses </w:t>
+      </w:r>
+      <m:oMath>
+        <m:sSub>
+          <m:e>
+            <m:r>
+              <m:t xml:space="preserve">J</m:t>
+            </m:r>
+          </m:e>
+          <m:sub>
+            <m:r>
+              <m:t xml:space="preserve">s</m:t>
+            </m:r>
+          </m:sub>
+        </m:sSub>
+      </m:oMath>
+      <w:r>
+        <w:rPr>
+          <w:rFonts w:ascii="Times New Roman" w:hAnsi="Times New Roman"/>
+          <w:i w:val="0"/>
+          <w:color w:val="202A32"/>
+          <w:sz w:val="20"/>
+        </w:rPr>
+        <w:t>=</w:t>
+      </w:r>
+      <m:oMath>
+        <m:sSubSup>
+          <m:e>
+            <m:r>
+              <m:t xml:space="preserve">U</m:t>
+            </m:r>
+          </m:e>
+          <m:sub>
+            <m:r>
+              <m:t xml:space="preserve">r</m:t>
+            </m:r>
+          </m:sub>
+          <m:sup>
+            <m:r>
+              <m:t xml:space="preserve">T</m:t>
+            </m:r>
+          </m:sup>
+        </m:sSubSup>
+      </m:oMath>
+      <m:oMath>
+        <m:sSub>
+          <m:e>
+            <m:r>
+              <m:t xml:space="preserve">J</m:t>
+            </m:r>
+          </m:e>
+          <m:sub>
+            <m:r>
+              <m:t xml:space="preserve">ℓ</m:t>
+            </m:r>
+            <m:r>
+              <m:t xml:space="preserve">→</m:t>
+            </m:r>
+            <m:r>
+              <m:t xml:space="preserve">L</m:t>
+            </m:r>
+          </m:sub>
+        </m:sSub>
+      </m:oMath>
+      <w:r>
+        <w:rPr>
+          <w:rFonts w:ascii="Times New Roman" w:hAnsi="Times New Roman"/>
+          <w:i w:val="0"/>
+          <w:color w:val="202A32"/>
+          <w:sz w:val="20"/>
+        </w:rPr>
+        <w:t xml:space="preserve">, where </w:t>
+      </w:r>
+      <m:oMath>
+        <m:sSub>
+          <m:e>
+            <m:r>
+              <m:t xml:space="preserve">U</m:t>
+            </m:r>
+          </m:e>
+          <m:sub>
+            <m:r>
+              <m:t xml:space="preserve">r</m:t>
+            </m:r>
+          </m:sub>
+        </m:sSub>
+      </m:oMath>
+      <w:r>
+        <w:rPr>
+          <w:rFonts w:ascii="Times New Roman" w:hAnsi="Times New Roman"/>
+          <w:i w:val="0"/>
+          <w:color w:val="202A32"/>
+          <w:sz w:val="20"/>
+        </w:rPr>
+        <w:t xml:space="preserve"> contains the leading left singular vectors. In either case, the solver minimizes</w:t>
       </w:r>
     </w:p>
     <w:tbl>
@@ -3467,8 +6054,138 @@
               <w:jc w:val="center"/>
             </w:pPr>
             <m:oMath>
+              <m:sSup>
+                <m:e>
+                  <m:r>
+                    <m:t xml:space="preserve">C</m:t>
+                  </m:r>
+                </m:e>
+                <m:sup>
+                  <m:r>
+                    <m:t xml:space="preserve">*</m:t>
+                  </m:r>
+                </m:sup>
+              </m:sSup>
               <m:r>
-                <m:t xml:space="preserve">C^*=arg min[C] ||J[s] rvec(P−SC)||[2]^2 + λ||P−SC||[F]^2.</m:t>
+                <m:t xml:space="preserve">=</m:t>
+              </m:r>
+              <m:r>
+                <m:t xml:space="preserve">arg</m:t>
+              </m:r>
+              <m:r>
+                <m:t xml:space="preserve"> </m:t>
+              </m:r>
+              <m:sSub>
+                <m:e>
+                  <m:r>
+                    <m:t xml:space="preserve">min</m:t>
+                  </m:r>
+                </m:e>
+                <m:sub>
+                  <m:r>
+                    <m:t xml:space="preserve">C</m:t>
+                  </m:r>
+                </m:sub>
+              </m:sSub>
+              <m:r>
+                <m:t xml:space="preserve"> </m:t>
+              </m:r>
+              <m:r>
+                <m:t xml:space="preserve">‖</m:t>
+              </m:r>
+              <m:sSub>
+                <m:e>
+                  <m:r>
+                    <m:t xml:space="preserve">J</m:t>
+                  </m:r>
+                </m:e>
+                <m:sub>
+                  <m:r>
+                    <m:t xml:space="preserve">s</m:t>
+                  </m:r>
+                </m:sub>
+              </m:sSub>
+              <m:r>
+                <m:t xml:space="preserve"> </m:t>
+              </m:r>
+              <m:r>
+                <m:t xml:space="preserve">rvec</m:t>
+              </m:r>
+              <m:r>
+                <m:t xml:space="preserve">(</m:t>
+              </m:r>
+              <m:r>
+                <m:t xml:space="preserve">P</m:t>
+              </m:r>
+              <m:r>
+                <m:t xml:space="preserve">−</m:t>
+              </m:r>
+              <m:r>
+                <m:t xml:space="preserve">SC</m:t>
+              </m:r>
+              <m:r>
+                <m:t xml:space="preserve">)</m:t>
+              </m:r>
+              <m:sSubSup>
+                <m:e>
+                  <m:r>
+                    <m:t xml:space="preserve">‖</m:t>
+                  </m:r>
+                </m:e>
+                <m:sub>
+                  <m:r>
+                    <m:t xml:space="preserve">2</m:t>
+                  </m:r>
+                </m:sub>
+                <m:sup>
+                  <m:r>
+                    <m:t xml:space="preserve">2</m:t>
+                  </m:r>
+                </m:sup>
+              </m:sSubSup>
+              <m:r>
+                <m:t xml:space="preserve"> </m:t>
+              </m:r>
+              <m:r>
+                <m:t xml:space="preserve">+</m:t>
+              </m:r>
+              <m:r>
+                <m:t xml:space="preserve"> </m:t>
+              </m:r>
+              <m:r>
+                <m:t xml:space="preserve">λ</m:t>
+              </m:r>
+              <m:r>
+                <m:t xml:space="preserve">‖</m:t>
+              </m:r>
+              <m:r>
+                <m:t xml:space="preserve">P</m:t>
+              </m:r>
+              <m:r>
+                <m:t xml:space="preserve">−</m:t>
+              </m:r>
+              <m:r>
+                <m:t xml:space="preserve">SC</m:t>
+              </m:r>
+              <m:sSubSup>
+                <m:e>
+                  <m:r>
+                    <m:t xml:space="preserve">‖</m:t>
+                  </m:r>
+                </m:e>
+                <m:sub>
+                  <m:r>
+                    <m:t xml:space="preserve">F</m:t>
+                  </m:r>
+                </m:sub>
+                <m:sup>
+                  <m:r>
+                    <m:t xml:space="preserve">2</m:t>
+                  </m:r>
+                </m:sup>
+              </m:sSubSup>
+              <m:r>
+                <m:t xml:space="preserve">.</m:t>
               </m:r>
             </m:oMath>
           </w:p>
@@ -3512,7 +6229,114 @@
           <w:color w:val="202A32"/>
           <w:sz w:val="20"/>
         </w:rPr>
-        <w:t>The first term penalizes the readout change predicted by the selected operator, while the second is a trace-scaled Tikhonov penalty. Let d_s be the row dimension of J_s (d_z for the full operator and r for a rank-r solve), and let (J_s)_i be its D-column block for patch i. The solver constructs the readout-space Gram matrix and regularization scale</w:t>
+        <w:t xml:space="preserve">The first term penalizes the readout change predicted by the selected operator, while the second is a trace-scaled Tikhonov penalty. Let </w:t>
+      </w:r>
+      <m:oMath>
+        <m:sSub>
+          <m:e>
+            <m:r>
+              <m:t xml:space="preserve">d</m:t>
+            </m:r>
+          </m:e>
+          <m:sub>
+            <m:r>
+              <m:t xml:space="preserve">s</m:t>
+            </m:r>
+          </m:sub>
+        </m:sSub>
+      </m:oMath>
+      <w:r>
+        <w:rPr>
+          <w:rFonts w:ascii="Times New Roman" w:hAnsi="Times New Roman"/>
+          <w:i w:val="0"/>
+          <w:color w:val="202A32"/>
+          <w:sz w:val="20"/>
+        </w:rPr>
+        <w:t xml:space="preserve"> be the row dimension of </w:t>
+      </w:r>
+      <m:oMath>
+        <m:sSub>
+          <m:e>
+            <m:r>
+              <m:t xml:space="preserve">J</m:t>
+            </m:r>
+          </m:e>
+          <m:sub>
+            <m:r>
+              <m:t xml:space="preserve">s</m:t>
+            </m:r>
+          </m:sub>
+        </m:sSub>
+      </m:oMath>
+      <w:r>
+        <w:rPr>
+          <w:rFonts w:ascii="Times New Roman" w:hAnsi="Times New Roman"/>
+          <w:i w:val="0"/>
+          <w:color w:val="202A32"/>
+          <w:sz w:val="20"/>
+        </w:rPr>
+        <w:t xml:space="preserve"> (</w:t>
+      </w:r>
+      <m:oMath>
+        <m:sSub>
+          <m:e>
+            <m:r>
+              <m:t xml:space="preserve">d</m:t>
+            </m:r>
+          </m:e>
+          <m:sub>
+            <m:r>
+              <m:t xml:space="preserve">z</m:t>
+            </m:r>
+          </m:sub>
+        </m:sSub>
+      </m:oMath>
+      <w:r>
+        <w:rPr>
+          <w:rFonts w:ascii="Times New Roman" w:hAnsi="Times New Roman"/>
+          <w:i w:val="0"/>
+          <w:color w:val="202A32"/>
+          <w:sz w:val="20"/>
+        </w:rPr>
+        <w:t xml:space="preserve"> for the full operator and r for a rank-r solve), and let </w:t>
+      </w:r>
+      <m:oMath>
+        <m:sSub>
+          <m:e>
+            <m:r>
+              <m:t xml:space="preserve">(</m:t>
+            </m:r>
+            <m:sSub>
+              <m:e>
+                <m:r>
+                  <m:t xml:space="preserve">J</m:t>
+                </m:r>
+              </m:e>
+              <m:sub>
+                <m:r>
+                  <m:t xml:space="preserve">s</m:t>
+                </m:r>
+              </m:sub>
+            </m:sSub>
+            <m:r>
+              <m:t xml:space="preserve">)</m:t>
+            </m:r>
+          </m:e>
+          <m:sub>
+            <m:r>
+              <m:t xml:space="preserve">i</m:t>
+            </m:r>
+          </m:sub>
+        </m:sSub>
+      </m:oMath>
+      <w:r>
+        <w:rPr>
+          <w:rFonts w:ascii="Times New Roman" w:hAnsi="Times New Roman"/>
+          <w:i w:val="0"/>
+          <w:color w:val="202A32"/>
+          <w:sz w:val="20"/>
+        </w:rPr>
+        <w:t xml:space="preserve"> be its D-column block for patch i. The solver constructs the readout-space Gram matrix and regularization scale</w:t>
       </w:r>
     </w:p>
     <w:tbl>
@@ -3576,20 +6400,237 @@
               <w:jc w:val="center"/>
             </w:pPr>
             <m:oMath>
+              <m:sSub>
+                <m:e>
+                  <m:r>
+                    <m:t xml:space="preserve">K</m:t>
+                  </m:r>
+                </m:e>
+                <m:sub>
+                  <m:r>
+                    <m:t xml:space="preserve">j</m:t>
+                  </m:r>
+                </m:sub>
+              </m:sSub>
               <m:r>
-                <m:t xml:space="preserve">K[j]=Σ[i∈G[j]](J[s])[i], H[J]=Σ[j=1]^B(1/m[j])K[j]K[j]^T,</m:t>
+                <m:t xml:space="preserve">=</m:t>
               </m:r>
-            </m:oMath>
-          </w:p>
-          <w:p>
-            <w:pPr>
-              <w:keepLines/>
-              <w:spacing w:before="0" w:after="0" w:line="240" w:lineRule="auto"/>
-              <w:jc w:val="center"/>
-            </w:pPr>
-            <m:oMath>
+              <m:sSub>
+                <m:e>
+                  <m:r>
+                    <m:t xml:space="preserve">Σ</m:t>
+                  </m:r>
+                </m:e>
+                <m:sub>
+                  <m:r>
+                    <m:t xml:space="preserve">i</m:t>
+                  </m:r>
+                  <m:r>
+                    <m:t xml:space="preserve">∈</m:t>
+                  </m:r>
+                  <m:sSub>
+                    <m:e>
+                      <m:r>
+                        <m:t xml:space="preserve">G</m:t>
+                      </m:r>
+                    </m:e>
+                    <m:sub>
+                      <m:r>
+                        <m:t xml:space="preserve">j</m:t>
+                      </m:r>
+                    </m:sub>
+                  </m:sSub>
+                </m:sub>
+              </m:sSub>
+              <m:sSub>
+                <m:e>
+                  <m:r>
+                    <m:t xml:space="preserve">(</m:t>
+                  </m:r>
+                  <m:sSub>
+                    <m:e>
+                      <m:r>
+                        <m:t xml:space="preserve">J</m:t>
+                      </m:r>
+                    </m:e>
+                    <m:sub>
+                      <m:r>
+                        <m:t xml:space="preserve">s</m:t>
+                      </m:r>
+                    </m:sub>
+                  </m:sSub>
+                  <m:r>
+                    <m:t xml:space="preserve">)</m:t>
+                  </m:r>
+                </m:e>
+                <m:sub>
+                  <m:r>
+                    <m:t xml:space="preserve">i</m:t>
+                  </m:r>
+                </m:sub>
+              </m:sSub>
               <m:r>
-                <m:t xml:space="preserve">λ=10*tr(H[J])/d[s].</m:t>
+                <m:t xml:space="preserve">,</m:t>
+              </m:r>
+              <m:r>
+                <m:t xml:space="preserve"> </m:t>
+              </m:r>
+              <m:sSub>
+                <m:e>
+                  <m:r>
+                    <m:t xml:space="preserve">H</m:t>
+                  </m:r>
+                </m:e>
+                <m:sub>
+                  <m:r>
+                    <m:t xml:space="preserve">J</m:t>
+                  </m:r>
+                </m:sub>
+              </m:sSub>
+              <m:r>
+                <m:t xml:space="preserve">=</m:t>
+              </m:r>
+              <m:sSubSup>
+                <m:e>
+                  <m:r>
+                    <m:t xml:space="preserve">Σ</m:t>
+                  </m:r>
+                </m:e>
+                <m:sub>
+                  <m:r>
+                    <m:t xml:space="preserve">j</m:t>
+                  </m:r>
+                  <m:r>
+                    <m:t xml:space="preserve">=</m:t>
+                  </m:r>
+                  <m:r>
+                    <m:t xml:space="preserve">1</m:t>
+                  </m:r>
+                </m:sub>
+                <m:sup>
+                  <m:r>
+                    <m:t xml:space="preserve">B</m:t>
+                  </m:r>
+                </m:sup>
+              </m:sSubSup>
+              <m:r>
+                <m:t xml:space="preserve">(</m:t>
+              </m:r>
+              <m:r>
+                <m:t xml:space="preserve">1</m:t>
+              </m:r>
+              <m:r>
+                <m:t xml:space="preserve">/</m:t>
+              </m:r>
+              <m:sSub>
+                <m:e>
+                  <m:r>
+                    <m:t xml:space="preserve">m</m:t>
+                  </m:r>
+                </m:e>
+                <m:sub>
+                  <m:r>
+                    <m:t xml:space="preserve">j</m:t>
+                  </m:r>
+                </m:sub>
+              </m:sSub>
+              <m:r>
+                <m:t xml:space="preserve">)</m:t>
+              </m:r>
+              <m:sSub>
+                <m:e>
+                  <m:r>
+                    <m:t xml:space="preserve">K</m:t>
+                  </m:r>
+                </m:e>
+                <m:sub>
+                  <m:r>
+                    <m:t xml:space="preserve">j</m:t>
+                  </m:r>
+                </m:sub>
+              </m:sSub>
+              <m:r>
+                <m:t xml:space="preserve"> </m:t>
+              </m:r>
+              <m:sSubSup>
+                <m:e>
+                  <m:r>
+                    <m:t xml:space="preserve">K</m:t>
+                  </m:r>
+                </m:e>
+                <m:sub>
+                  <m:r>
+                    <m:t xml:space="preserve">j</m:t>
+                  </m:r>
+                </m:sub>
+                <m:sup>
+                  <m:r>
+                    <m:t xml:space="preserve">T</m:t>
+                  </m:r>
+                </m:sup>
+              </m:sSubSup>
+              <m:r>
+                <m:t xml:space="preserve">,</m:t>
+              </m:r>
+              <m:r>
+                <m:t xml:space="preserve"> </m:t>
+              </m:r>
+              <m:r>
+                <m:t xml:space="preserve">λ</m:t>
+              </m:r>
+              <m:r>
+                <m:t xml:space="preserve">=</m:t>
+              </m:r>
+              <m:r>
+                <m:t xml:space="preserve">10</m:t>
+              </m:r>
+              <m:r>
+                <m:t xml:space="preserve"> </m:t>
+              </m:r>
+              <m:r>
+                <m:t xml:space="preserve">·</m:t>
+              </m:r>
+              <m:r>
+                <m:t xml:space="preserve"> </m:t>
+              </m:r>
+              <m:r>
+                <m:t xml:space="preserve">tr</m:t>
+              </m:r>
+              <m:r>
+                <m:t xml:space="preserve">(</m:t>
+              </m:r>
+              <m:sSub>
+                <m:e>
+                  <m:r>
+                    <m:t xml:space="preserve">H</m:t>
+                  </m:r>
+                </m:e>
+                <m:sub>
+                  <m:r>
+                    <m:t xml:space="preserve">J</m:t>
+                  </m:r>
+                </m:sub>
+              </m:sSub>
+              <m:r>
+                <m:t xml:space="preserve">)</m:t>
+              </m:r>
+              <m:r>
+                <m:t xml:space="preserve">/</m:t>
+              </m:r>
+              <m:sSub>
+                <m:e>
+                  <m:r>
+                    <m:t xml:space="preserve">d</m:t>
+                  </m:r>
+                </m:e>
+                <m:sub>
+                  <m:r>
+                    <m:t xml:space="preserve">s</m:t>
+                  </m:r>
+                </m:sub>
+              </m:sSub>
+              <m:r>
+                <m:t xml:space="preserve">.</m:t>
               </m:r>
             </m:oMath>
           </w:p>
@@ -3626,6 +6667,20 @@
       <w:pPr>
         <w:spacing w:after="100" w:line="259" w:lineRule="auto"/>
       </w:pPr>
+      <m:oMath>
+        <m:sSub>
+          <m:e>
+            <m:r>
+              <m:t xml:space="preserve">H</m:t>
+            </m:r>
+          </m:e>
+          <m:sub>
+            <m:r>
+              <m:t xml:space="preserve">J</m:t>
+            </m:r>
+          </m:sub>
+        </m:sSub>
+      </m:oMath>
       <w:r>
         <w:rPr>
           <w:rFonts w:ascii="Times New Roman" w:hAnsi="Times New Roman"/>
@@ -3633,7 +6688,7 @@
           <w:color w:val="202A32"/>
           <w:sz w:val="20"/>
         </w:rPr>
-        <w:t>H_J is a positive-semidefinite Gram matrix of grouped Jacobian blocks, not a feature-activation covariance. It is distinct from the centered calibration-activation covariance that defines PCA directions. The per-image closed-form carrier update is</w:t>
+        <w:t xml:space="preserve"> is a positive-semidefinite Gram matrix of grouped Jacobian blocks, not a feature-activation covariance. It is distinct from the centered calibration-activation covariance that defines PCA directions. The per-image closed-form carrier update is</w:t>
       </w:r>
     </w:p>
     <w:tbl>
@@ -3697,8 +6752,59 @@
               <w:jc w:val="center"/>
             </w:pPr>
             <m:oMath>
+              <m:sSub>
+                <m:e>
+                  <m:r>
+                    <m:t xml:space="preserve">r</m:t>
+                  </m:r>
+                </m:e>
+                <m:sub>
+                  <m:r>
+                    <m:t xml:space="preserve">mean</m:t>
+                  </m:r>
+                </m:sub>
+              </m:sSub>
               <m:r>
-                <m:t xml:space="preserve">r[mean]=J[s] rvec(E[mean]),</m:t>
+                <m:t xml:space="preserve">=</m:t>
+              </m:r>
+              <m:sSub>
+                <m:e>
+                  <m:r>
+                    <m:t xml:space="preserve">J</m:t>
+                  </m:r>
+                </m:e>
+                <m:sub>
+                  <m:r>
+                    <m:t xml:space="preserve">s</m:t>
+                  </m:r>
+                </m:sub>
+              </m:sSub>
+              <m:r>
+                <m:t xml:space="preserve"> </m:t>
+              </m:r>
+              <m:r>
+                <m:t xml:space="preserve">rvec</m:t>
+              </m:r>
+              <m:r>
+                <m:t xml:space="preserve">(</m:t>
+              </m:r>
+              <m:sSub>
+                <m:e>
+                  <m:r>
+                    <m:t xml:space="preserve">E</m:t>
+                  </m:r>
+                </m:e>
+                <m:sub>
+                  <m:r>
+                    <m:t xml:space="preserve">mean</m:t>
+                  </m:r>
+                </m:sub>
+              </m:sSub>
+              <m:r>
+                <m:t xml:space="preserve">)</m:t>
+              </m:r>
+              <m:r>
+                <m:t xml:space="preserve">,</m:t>
               </m:r>
             </m:oMath>
           </w:p>
@@ -3709,8 +6815,155 @@
               <w:jc w:val="center"/>
             </w:pPr>
             <m:oMath>
+              <m:sSubSup>
+                <m:e>
+                  <m:r>
+                    <m:t xml:space="preserve">c</m:t>
+                  </m:r>
+                </m:e>
+                <m:sub>
+                  <m:r>
+                    <m:t xml:space="preserve">j</m:t>
+                  </m:r>
+                </m:sub>
+                <m:sup>
+                  <m:r>
+                    <m:t xml:space="preserve">*</m:t>
+                  </m:r>
+                </m:sup>
+              </m:sSubSup>
               <m:r>
-                <m:t xml:space="preserve">c[j]^*=c[j]^mean+(1/m[j])K[j]^T(H[J]+λI[d[s]])^-1r[mean].</m:t>
+                <m:t xml:space="preserve">=</m:t>
+              </m:r>
+              <m:sSubSup>
+                <m:e>
+                  <m:r>
+                    <m:t xml:space="preserve">c</m:t>
+                  </m:r>
+                </m:e>
+                <m:sub>
+                  <m:r>
+                    <m:t xml:space="preserve">j</m:t>
+                  </m:r>
+                </m:sub>
+                <m:sup>
+                  <m:r>
+                    <m:t xml:space="preserve">mean</m:t>
+                  </m:r>
+                </m:sup>
+              </m:sSubSup>
+              <m:r>
+                <m:t xml:space="preserve">+</m:t>
+              </m:r>
+              <m:r>
+                <m:t xml:space="preserve">(</m:t>
+              </m:r>
+              <m:r>
+                <m:t xml:space="preserve">1</m:t>
+              </m:r>
+              <m:r>
+                <m:t xml:space="preserve">/</m:t>
+              </m:r>
+              <m:sSub>
+                <m:e>
+                  <m:r>
+                    <m:t xml:space="preserve">m</m:t>
+                  </m:r>
+                </m:e>
+                <m:sub>
+                  <m:r>
+                    <m:t xml:space="preserve">j</m:t>
+                  </m:r>
+                </m:sub>
+              </m:sSub>
+              <m:r>
+                <m:t xml:space="preserve">)</m:t>
+              </m:r>
+              <m:sSubSup>
+                <m:e>
+                  <m:r>
+                    <m:t xml:space="preserve">K</m:t>
+                  </m:r>
+                </m:e>
+                <m:sub>
+                  <m:r>
+                    <m:t xml:space="preserve">j</m:t>
+                  </m:r>
+                </m:sub>
+                <m:sup>
+                  <m:r>
+                    <m:t xml:space="preserve">T</m:t>
+                  </m:r>
+                </m:sup>
+              </m:sSubSup>
+              <m:sSup>
+                <m:e>
+                  <m:r>
+                    <m:t xml:space="preserve">(</m:t>
+                  </m:r>
+                  <m:sSub>
+                    <m:e>
+                      <m:r>
+                        <m:t xml:space="preserve">H</m:t>
+                      </m:r>
+                    </m:e>
+                    <m:sub>
+                      <m:r>
+                        <m:t xml:space="preserve">J</m:t>
+                      </m:r>
+                    </m:sub>
+                  </m:sSub>
+                  <m:r>
+                    <m:t xml:space="preserve">+</m:t>
+                  </m:r>
+                  <m:sSub>
+                    <m:e>
+                      <m:r>
+                        <m:t xml:space="preserve">λI</m:t>
+                      </m:r>
+                    </m:e>
+                    <m:sub>
+                      <m:sSub>
+                        <m:e>
+                          <m:r>
+                            <m:t xml:space="preserve">d</m:t>
+                          </m:r>
+                        </m:e>
+                        <m:sub>
+                          <m:r>
+                            <m:t xml:space="preserve">s</m:t>
+                          </m:r>
+                        </m:sub>
+                      </m:sSub>
+                    </m:sub>
+                  </m:sSub>
+                  <m:r>
+                    <m:t xml:space="preserve">)</m:t>
+                  </m:r>
+                </m:e>
+                <m:sup>
+                  <m:r>
+                    <m:t xml:space="preserve">-</m:t>
+                  </m:r>
+                  <m:r>
+                    <m:t xml:space="preserve">1</m:t>
+                  </m:r>
+                </m:sup>
+              </m:sSup>
+              <m:sSub>
+                <m:e>
+                  <m:r>
+                    <m:t xml:space="preserve">r</m:t>
+                  </m:r>
+                </m:e>
+                <m:sub>
+                  <m:r>
+                    <m:t xml:space="preserve">mean</m:t>
+                  </m:r>
+                </m:sub>
+              </m:sSub>
+              <m:r>
+                <m:t xml:space="preserve">.</m:t>
               </m:r>
             </m:oMath>
           </w:p>
@@ -3768,7 +7021,53 @@
           <w:color w:val="202A32"/>
           <w:sz w:val="20"/>
         </w:rPr>
-        <w:t>Each compressed key also carries the number s_t of original tokens represented by that key. With T=B+1 compressed tokens and d_h dimensions per head, the compressed attention adds log multiplicity to each key's attention logit:</w:t>
+        <w:t xml:space="preserve">Each compressed key also carries the number </w:t>
+      </w:r>
+      <m:oMath>
+        <m:sSub>
+          <m:e>
+            <m:r>
+              <m:t xml:space="preserve">s</m:t>
+            </m:r>
+          </m:e>
+          <m:sub>
+            <m:r>
+              <m:t xml:space="preserve">t</m:t>
+            </m:r>
+          </m:sub>
+        </m:sSub>
+      </m:oMath>
+      <w:r>
+        <w:rPr>
+          <w:rFonts w:ascii="Times New Roman" w:hAnsi="Times New Roman"/>
+          <w:i w:val="0"/>
+          <w:color w:val="202A32"/>
+          <w:sz w:val="20"/>
+        </w:rPr>
+        <w:t xml:space="preserve"> of original tokens represented by that key. With T=B+1 compressed tokens and </w:t>
+      </w:r>
+      <m:oMath>
+        <m:sSub>
+          <m:e>
+            <m:r>
+              <m:t xml:space="preserve">d</m:t>
+            </m:r>
+          </m:e>
+          <m:sub>
+            <m:r>
+              <m:t xml:space="preserve">h</m:t>
+            </m:r>
+          </m:sub>
+        </m:sSub>
+      </m:oMath>
+      <w:r>
+        <w:rPr>
+          <w:rFonts w:ascii="Times New Roman" w:hAnsi="Times New Roman"/>
+          <w:i w:val="0"/>
+          <w:color w:val="202A32"/>
+          <w:sz w:val="20"/>
+        </w:rPr>
+        <w:t xml:space="preserve"> dimensions per head, the compressed attention adds log multiplicity to each key's attention logit:</w:t>
       </w:r>
     </w:p>
     <w:tbl>
@@ -3832,20 +7131,200 @@
               <w:jc w:val="center"/>
             </w:pPr>
             <m:oMath>
+              <m:sSup>
+                <m:e>
+                  <m:r>
+                    <m:t xml:space="preserve">A</m:t>
+                  </m:r>
+                </m:e>
+                <m:sup>
+                  <m:r>
+                    <m:t xml:space="preserve">(</m:t>
+                  </m:r>
+                  <m:r>
+                    <m:t xml:space="preserve">h</m:t>
+                  </m:r>
+                  <m:r>
+                    <m:t xml:space="preserve">)</m:t>
+                  </m:r>
+                </m:sup>
+              </m:sSup>
               <m:r>
-                <m:t xml:space="preserve">A^(h)=softmax[key](Q^(h)K^(h)^T/sqrt(d[h])+1[T](log s)^T), s[0]=1,</m:t>
+                <m:t xml:space="preserve">=</m:t>
               </m:r>
-            </m:oMath>
-          </w:p>
-          <w:p>
-            <w:pPr>
-              <w:keepLines/>
-              <w:spacing w:before="0" w:after="0" w:line="240" w:lineRule="auto"/>
-              <w:jc w:val="center"/>
-            </w:pPr>
-            <m:oMath>
+              <m:sSub>
+                <m:e>
+                  <m:r>
+                    <m:t xml:space="preserve">softmax</m:t>
+                  </m:r>
+                </m:e>
+                <m:sub>
+                  <m:r>
+                    <m:t xml:space="preserve">key</m:t>
+                  </m:r>
+                </m:sub>
+              </m:sSub>
               <m:r>
-                <m:t xml:space="preserve">s[j]=m[j].</m:t>
+                <m:t xml:space="preserve">(</m:t>
+              </m:r>
+              <m:sSup>
+                <m:e>
+                  <m:r>
+                    <m:t xml:space="preserve">Q</m:t>
+                  </m:r>
+                </m:e>
+                <m:sup>
+                  <m:r>
+                    <m:t xml:space="preserve">(</m:t>
+                  </m:r>
+                  <m:r>
+                    <m:t xml:space="preserve">h</m:t>
+                  </m:r>
+                  <m:r>
+                    <m:t xml:space="preserve">)</m:t>
+                  </m:r>
+                </m:sup>
+              </m:sSup>
+              <m:sSup>
+                <m:e>
+                  <m:r>
+                    <m:t xml:space="preserve">K</m:t>
+                  </m:r>
+                </m:e>
+                <m:sup>
+                  <m:r>
+                    <m:t xml:space="preserve">(</m:t>
+                  </m:r>
+                  <m:r>
+                    <m:t xml:space="preserve">h</m:t>
+                  </m:r>
+                  <m:r>
+                    <m:t xml:space="preserve">)</m:t>
+                  </m:r>
+                  <m:r>
+                    <m:t xml:space="preserve">T</m:t>
+                  </m:r>
+                </m:sup>
+              </m:sSup>
+              <m:r>
+                <m:t xml:space="preserve">/</m:t>
+              </m:r>
+              <m:r>
+                <m:t xml:space="preserve">√</m:t>
+              </m:r>
+              <m:sSub>
+                <m:e>
+                  <m:r>
+                    <m:t xml:space="preserve">d</m:t>
+                  </m:r>
+                </m:e>
+                <m:sub>
+                  <m:r>
+                    <m:t xml:space="preserve">h</m:t>
+                  </m:r>
+                </m:sub>
+              </m:sSub>
+              <m:r>
+                <m:t xml:space="preserve">+</m:t>
+              </m:r>
+              <m:sSub>
+                <m:e>
+                  <m:r>
+                    <m:t xml:space="preserve">1</m:t>
+                  </m:r>
+                </m:e>
+                <m:sub>
+                  <m:r>
+                    <m:t xml:space="preserve">T</m:t>
+                  </m:r>
+                </m:sub>
+              </m:sSub>
+              <m:sSup>
+                <m:e>
+                  <m:r>
+                    <m:t xml:space="preserve">(</m:t>
+                  </m:r>
+                  <m:r>
+                    <m:t xml:space="preserve">log</m:t>
+                  </m:r>
+                  <m:r>
+                    <m:t xml:space="preserve"> </m:t>
+                  </m:r>
+                  <m:r>
+                    <m:t xml:space="preserve">s</m:t>
+                  </m:r>
+                  <m:r>
+                    <m:t xml:space="preserve">)</m:t>
+                  </m:r>
+                </m:e>
+                <m:sup>
+                  <m:r>
+                    <m:t xml:space="preserve">T</m:t>
+                  </m:r>
+                </m:sup>
+              </m:sSup>
+              <m:r>
+                <m:t xml:space="preserve">)</m:t>
+              </m:r>
+              <m:r>
+                <m:t xml:space="preserve">,</m:t>
+              </m:r>
+              <m:r>
+                <m:t xml:space="preserve"> </m:t>
+              </m:r>
+              <m:sSub>
+                <m:e>
+                  <m:r>
+                    <m:t xml:space="preserve">s</m:t>
+                  </m:r>
+                </m:e>
+                <m:sub>
+                  <m:r>
+                    <m:t xml:space="preserve">0</m:t>
+                  </m:r>
+                </m:sub>
+              </m:sSub>
+              <m:r>
+                <m:t xml:space="preserve">=</m:t>
+              </m:r>
+              <m:r>
+                <m:t xml:space="preserve">1</m:t>
+              </m:r>
+              <m:r>
+                <m:t xml:space="preserve">,</m:t>
+              </m:r>
+              <m:r>
+                <m:t xml:space="preserve"> </m:t>
+              </m:r>
+              <m:sSub>
+                <m:e>
+                  <m:r>
+                    <m:t xml:space="preserve">s</m:t>
+                  </m:r>
+                </m:e>
+                <m:sub>
+                  <m:r>
+                    <m:t xml:space="preserve">j</m:t>
+                  </m:r>
+                </m:sub>
+              </m:sSub>
+              <m:r>
+                <m:t xml:space="preserve">=</m:t>
+              </m:r>
+              <m:sSub>
+                <m:e>
+                  <m:r>
+                    <m:t xml:space="preserve">m</m:t>
+                  </m:r>
+                </m:e>
+                <m:sub>
+                  <m:r>
+                    <m:t xml:space="preserve">j</m:t>
+                  </m:r>
+                </m:sub>
+              </m:sSub>
+              <m:r>
+                <m:t xml:space="preserve">.</m:t>
               </m:r>
             </m:oMath>
           </w:p>
@@ -3889,7 +7368,76 @@
           <w:color w:val="202A32"/>
           <w:sz w:val="20"/>
         </w:rPr>
-        <w:t xml:space="preserve">The vector s includes multiplicity one for the class token and m_j=|G_j| for patch carriers; 1_T broadcasts the log-size bias over query positions. This proportional-attention correction is used in Token Merging (ToMe) to account for merged-token size </w:t>
+        <w:t xml:space="preserve">The vector s includes multiplicity one for the class token and </w:t>
+      </w:r>
+      <m:oMath>
+        <m:sSub>
+          <m:e>
+            <m:r>
+              <m:t xml:space="preserve">m</m:t>
+            </m:r>
+          </m:e>
+          <m:sub>
+            <m:r>
+              <m:t xml:space="preserve">j</m:t>
+            </m:r>
+          </m:sub>
+        </m:sSub>
+      </m:oMath>
+      <w:r>
+        <w:rPr>
+          <w:rFonts w:ascii="Times New Roman" w:hAnsi="Times New Roman"/>
+          <w:i w:val="0"/>
+          <w:color w:val="202A32"/>
+          <w:sz w:val="20"/>
+        </w:rPr>
+        <w:t>=|</w:t>
+      </w:r>
+      <m:oMath>
+        <m:sSub>
+          <m:e>
+            <m:r>
+              <m:t xml:space="preserve">G</m:t>
+            </m:r>
+          </m:e>
+          <m:sub>
+            <m:r>
+              <m:t xml:space="preserve">j</m:t>
+            </m:r>
+          </m:sub>
+        </m:sSub>
+      </m:oMath>
+      <w:r>
+        <w:rPr>
+          <w:rFonts w:ascii="Times New Roman" w:hAnsi="Times New Roman"/>
+          <w:i w:val="0"/>
+          <w:color w:val="202A32"/>
+          <w:sz w:val="20"/>
+        </w:rPr>
+        <w:t xml:space="preserve">| for patch carriers; </w:t>
+      </w:r>
+      <m:oMath>
+        <m:sSub>
+          <m:e>
+            <m:r>
+              <m:t xml:space="preserve">1</m:t>
+            </m:r>
+          </m:e>
+          <m:sub>
+            <m:r>
+              <m:t xml:space="preserve">T</m:t>
+            </m:r>
+          </m:sub>
+        </m:sSub>
+      </m:oMath>
+      <w:r>
+        <w:rPr>
+          <w:rFonts w:ascii="Times New Roman" w:hAnsi="Times New Roman"/>
+          <w:i w:val="0"/>
+          <w:color w:val="202A32"/>
+          <w:sz w:val="20"/>
+        </w:rPr>
+        <w:t xml:space="preserve"> broadcasts the log-size bias over query positions. This proportional-attention correction is used in Token Merging (ToMe) to account for merged-token size </w:t>
       </w:r>
       <w:r>
         <w:rPr>
@@ -5255,7 +8803,59 @@
           <w:color w:val="202A32"/>
           <w:sz w:val="20"/>
         </w:rPr>
-        <w:t>The separate carrier branch tests whether corrections can be amortized in a compact feature-PCA basis. Here, q is the number of feature directions in the correction basis, extracted from centered calibration patch activations with covariance Σ_{act,ℓ}; these directions are not obtained from the Jacobian. This feature-space covariance is distinct from the readout-space solver Gram matrix H_J in Eq. (8). Separately, calibration uses a low-rank subspace derived from downstream-Jacobian targets to estimate a fixed coefficient vector α, which sets the correction weight along each PCA direction. For held-out classifier evaluation, the basis and coefficients are frozen, and no per-image Jacobian or evaluation-label fitting is used. The operator-space experiment uses N=100 held-out operator-space images and does not measure classification. For DeiT-Small at q=16, static Feature-PCA recovers 54.91% of the restricted-oracle ‖J E‖ gain; this remains linearized operator-space evidence only.</w:t>
+        <w:t xml:space="preserve">The separate carrier branch tests whether corrections can be amortized in a compact feature-PCA basis. Here, q is the number of feature directions in the correction basis, extracted from centered calibration patch activations with covariance </w:t>
+      </w:r>
+      <m:oMath>
+        <m:sSub>
+          <m:e>
+            <m:r>
+              <m:t xml:space="preserve">Σ</m:t>
+            </m:r>
+          </m:e>
+          <m:sub>
+            <m:r>
+              <m:t xml:space="preserve">act</m:t>
+            </m:r>
+            <m:r>
+              <m:t xml:space="preserve">,</m:t>
+            </m:r>
+            <m:r>
+              <m:t xml:space="preserve">ℓ</m:t>
+            </m:r>
+          </m:sub>
+        </m:sSub>
+      </m:oMath>
+      <w:r>
+        <w:rPr>
+          <w:rFonts w:ascii="Times New Roman" w:hAnsi="Times New Roman"/>
+          <w:i w:val="0"/>
+          <w:color w:val="202A32"/>
+          <w:sz w:val="20"/>
+        </w:rPr>
+        <w:t xml:space="preserve">; these directions are not obtained from the Jacobian. This feature-space covariance is distinct from the readout-space solver Gram matrix </w:t>
+      </w:r>
+      <m:oMath>
+        <m:sSub>
+          <m:e>
+            <m:r>
+              <m:t xml:space="preserve">H</m:t>
+            </m:r>
+          </m:e>
+          <m:sub>
+            <m:r>
+              <m:t xml:space="preserve">J</m:t>
+            </m:r>
+          </m:sub>
+        </m:sSub>
+      </m:oMath>
+      <w:r>
+        <w:rPr>
+          <w:rFonts w:ascii="Times New Roman" w:hAnsi="Times New Roman"/>
+          <w:i w:val="0"/>
+          <w:color w:val="202A32"/>
+          <w:sz w:val="20"/>
+        </w:rPr>
+        <w:t xml:space="preserve"> in Eq. (8). Separately, calibration uses a low-rank subspace derived from downstream-Jacobian targets to estimate a fixed coefficient vector α, which sets the correction weight along each PCA direction. For held-out classifier evaluation, the basis and coefficients are frozen, and no per-image Jacobian or evaluation-label fitting is used. The operator-space experiment uses N=100 held-out operator-space images and does not measure classification. For DeiT-Small at q=16, static Feature-PCA recovers 54.91% of the restricted-oracle ‖J E‖ gain; this remains linearized operator-space evidence only.</w:t>
       </w:r>
     </w:p>
     <w:p>

</xml_diff>

<commit_message>
Polish PCF manuscript experiment terminology
</commit_message>
<xml_diff>
--- a/docs/PAPER_DRAFT_v4_synced.docx
+++ b/docs/PAPER_DRAFT_v4_synced.docx
@@ -541,7 +541,7 @@
         <w:jc w:val="both"/>
       </w:pPr>
       <w:r>
-        <w:t>The paper draws on distinct evidence cohorts. Table I summarizes the primary findings and reports their evaluation units; grouped analyses remain separate wherever protocols differ. Here, N denotes the count of the stated sampling unit, which differs across image-based and perturbation-based studies. Top-1 accuracy is the fraction of evaluated images for which the highest-scoring class equals the ground-truth label.</w:t>
+        <w:t>The paper draws on distinct evidence cohorts; Table I summarizes each primary finding and its sampling unit without pooling. N denotes the count of the stated unit, which differs across image-based and perturbation-based studies. Top-1 accuracy is the fraction of evaluated images whose highest-scoring predicted class matches the ground-truth label; margin, feature-geometry, and operator-space measures are separate endpoints. Image-based studies use frozen pretrained models and ImageNet-1k validation images with protocol-specific preprocessing and splits. The strict confirmatory benchmark evaluates DeiT-Tiny and DeiT-Small at block 8, ViT-B/16 AugReg at block 7, and DINOv2 ViT-S/14 at block 8. It uses 1,000 held-out images per architecture, one per class (evaluation seed 9201), and a disjoint 1,000-image calibration set (seed 9101); no tuning uses held-out images. The remaining audits retain their own cohorts and sampling units as shown in Table I.</w:t>
       </w:r>
     </w:p>
     <w:p>
@@ -1969,87 +1969,7 @@
         <w:jc w:val="both"/>
       </w:pPr>
       <w:r>
-        <w:t>For compression, an end</w:t>
-      </w:r>
-      <w:r>
-        <w:t>-</w:t>
-      </w:r>
-      <w:r>
-        <w:t>to</w:t>
-      </w:r>
-      <w:r>
-        <w:t>-</w:t>
-      </w:r>
-      <w:r>
-        <w:t xml:space="preserve">end Jacobian locally maps a perturbation of the patch matrix at layer ℓ to the measured downstream readout z. The Jacobian is evaluated at the unperturbed activation; its product with a flattened perturbation </w:t>
-      </w:r>
-      <w:r>
-        <w:lastRenderedPageBreak/>
-        <w:t>gives a first</w:t>
-      </w:r>
-      <w:r>
-        <w:t>-</w:t>
-      </w:r>
-      <w:r>
-        <w:t>order prediction of the readout change. The full</w:t>
-      </w:r>
-      <w:r>
-        <w:t>-</w:t>
-      </w:r>
-      <w:r>
-        <w:t>J oracle uses a per</w:t>
-      </w:r>
-      <w:r>
-        <w:t>-</w:t>
-      </w:r>
-      <w:r>
-        <w:t>example Jacobian and is an offline reference, not a deployable inference procedure. Section 6 defines the operator objective and its grouping variables.</w:t>
-      </w:r>
-    </w:p>
-    <w:p>
-      <w:pPr>
-        <w:pStyle w:val="Heading1"/>
-      </w:pPr>
-      <w:r>
-        <w:rPr>
-          <w:rFonts w:ascii="Times New Roman" w:hAnsi="Times New Roman"/>
-        </w:rPr>
-        <w:t>4. Geometric and Diversity Constraints on Patch</w:t>
-      </w:r>
-      <w:r>
-        <w:rPr>
-          <w:rFonts w:ascii="Times New Roman" w:hAnsi="Times New Roman"/>
-        </w:rPr>
-        <w:t>-</w:t>
-      </w:r>
-      <w:r>
-        <w:rPr>
-          <w:rFonts w:ascii="Times New Roman" w:hAnsi="Times New Roman"/>
-        </w:rPr>
-        <w:t>Content Fungibility</w:t>
-      </w:r>
-    </w:p>
-    <w:p>
-      <w:pPr>
-        <w:pStyle w:val="Heading2"/>
-      </w:pPr>
-      <w:r>
-        <w:rPr>
-          <w:rFonts w:ascii="Times New Roman" w:hAnsi="Times New Roman"/>
-        </w:rPr>
-        <w:t>4.1 Depth</w:t>
-      </w:r>
-      <w:r>
-        <w:rPr>
-          <w:rFonts w:ascii="Times New Roman" w:hAnsi="Times New Roman"/>
-        </w:rPr>
-        <w:t>-</w:t>
-      </w:r>
-      <w:r>
-        <w:rPr>
-          <w:rFonts w:ascii="Times New Roman" w:hAnsi="Times New Roman"/>
-        </w:rPr>
-        <w:t>Dependent Replacement Tolerance</w:t>
+        <w:t>Surrogate values and replacement masks are protocol-specific: audited controls include calibration centroids, diagonal-Gaussian samples, and geometry or learned-direction variants. The mask identifies the selected patch positions and replacement fraction; calibration-derived quantities are estimated only from calibration data. Section 4 reports the layer, fraction, and control used in each replacement study.</w:t>
       </w:r>
     </w:p>
     <w:p>
@@ -2058,6 +1978,61 @@
         <w:jc w:val="both"/>
       </w:pPr>
       <w:r>
+        <w:t>For compression, the end-to-end Jacobian maps a patch-matrix perturbation at layer ℓ to the pre-classifier readout u defined in Section 6, not directly to Top-1 accuracy. Evaluated at the unperturbed activation, its product with a flattened perturbation predicts the readout change to first order; classification outcomes are measured by applying the actual classifier to the compressed model output. The full-J oracle uses a per-image Jacobian as an offline reference, not a deployable inference procedure. Section 6 defines the operator objective and grouping variables.</w:t>
+      </w:r>
+    </w:p>
+    <w:p>
+      <w:pPr>
+        <w:pStyle w:val="Heading1"/>
+      </w:pPr>
+      <w:r>
+        <w:rPr>
+          <w:rFonts w:ascii="Times New Roman" w:hAnsi="Times New Roman"/>
+        </w:rPr>
+        <w:t>4. Geometric and Diversity Constraints on Patch</w:t>
+      </w:r>
+      <w:r>
+        <w:rPr>
+          <w:rFonts w:ascii="Times New Roman" w:hAnsi="Times New Roman"/>
+        </w:rPr>
+        <w:t>-</w:t>
+      </w:r>
+      <w:r>
+        <w:rPr>
+          <w:rFonts w:ascii="Times New Roman" w:hAnsi="Times New Roman"/>
+        </w:rPr>
+        <w:t>Content Fungibility</w:t>
+      </w:r>
+    </w:p>
+    <w:p>
+      <w:pPr>
+        <w:pStyle w:val="Heading2"/>
+      </w:pPr>
+      <w:r>
+        <w:rPr>
+          <w:rFonts w:ascii="Times New Roman" w:hAnsi="Times New Roman"/>
+        </w:rPr>
+        <w:t>4.1 Depth</w:t>
+      </w:r>
+      <w:r>
+        <w:rPr>
+          <w:rFonts w:ascii="Times New Roman" w:hAnsi="Times New Roman"/>
+        </w:rPr>
+        <w:t>-</w:t>
+      </w:r>
+      <w:r>
+        <w:rPr>
+          <w:rFonts w:ascii="Times New Roman" w:hAnsi="Times New Roman"/>
+        </w:rPr>
+        <w:t>Dependent Replacement Tolerance</w:t>
+      </w:r>
+    </w:p>
+    <w:p>
+      <w:pPr>
+        <w:spacing w:after="100" w:line="259" w:lineRule="auto"/>
+        <w:jc w:val="both"/>
+      </w:pPr>
+      <w:r>
         <w:t>Across the audited replacement controls, late</w:t>
       </w:r>
       <w:r>
@@ -2070,7 +2045,7 @@
         <w:t>-</w:t>
       </w:r>
       <w:r>
-        <w:t>layer content, but arbitrary substitutions do not preserve function. The original V1 depthwise validation evaluates 1,000 images per architecture under 25% patch replacement. A separately recorded follow</w:t>
+        <w:t>layer content, but arbitrary substitutions do not preserve function. The initial depth-dependent replacement study evaluates 1,000 images per architecture under 25% patch replacement. A separately recorded follow</w:t>
       </w:r>
       <w:r>
         <w:t>-</w:t>
@@ -2211,7 +2186,7 @@
           <w:color w:val="4C5963"/>
           <w:sz w:val="17"/>
         </w:rPr>
-        <w:t>patch replacement. Original V1 depths are 5, 7, 8, 9, and 10; depth 6 is a separately recorded follow</w:t>
+        <w:t>patch replacement. The initial study measured depths 5, 7, 8, 9, and 10; depth 6 is a separately recorded follow</w:t>
       </w:r>
       <w:r>
         <w:rPr>
@@ -2263,13 +2238,13 @@
         <w:jc w:val="both"/>
       </w:pPr>
       <w:r>
-        <w:t>Geometry and diversity constrain replacement. In the separate V0.7 activation</w:t>
-      </w:r>
-      <w:r>
-        <w:t>-</w:t>
-      </w:r>
-      <w:r>
-        <w:t>replacement experiment (N=1,000 images per model; 50% replacement), coordinate permutation changes Top</w:t>
+        <w:t>Geometry and diversity constrain replacement. In a separate activation-replacement geometry-control experiment</w:t>
+      </w:r>
+      <w:r>
+        <w:t/>
+      </w:r>
+      <w:r>
+        <w:t xml:space="preserve"> (N=1,000 images per model; 50% replacement), coordinate permutation changes Top</w:t>
       </w:r>
       <w:r>
         <w:t>-</w:t>
@@ -2381,7 +2356,7 @@
           <w:color w:val="4C5963"/>
           <w:sz w:val="17"/>
         </w:rPr>
-        <w:t>Fig. 3. (a) V1 geometry controls at 50% replacement for ViT</w:t>
+        <w:t>Fig. 3. (a) Cross-architecture geometry controls at 50% replacement for ViT</w:t>
       </w:r>
       <w:r>
         <w:rPr>
@@ -2445,7 +2420,7 @@
           <w:color w:val="4C5963"/>
           <w:sz w:val="17"/>
         </w:rPr>
-        <w:t>inverted centroid. (b) The V0.8 grouped</w:t>
+        <w:t>inverted centroid. (b) The grouped token-diversity sweep</w:t>
       </w:r>
       <w:r>
         <w:rPr>
@@ -2453,7 +2428,7 @@
           <w:color w:val="4C5963"/>
           <w:sz w:val="17"/>
         </w:rPr>
-        <w:t>-</w:t>
+        <w:t/>
       </w:r>
       <w:r>
         <w:rPr>
@@ -2461,7 +2436,7 @@
           <w:color w:val="4C5963"/>
           <w:sz w:val="17"/>
         </w:rPr>
-        <w:t>diversity sweep on DeiT</w:t>
+        <w:t xml:space="preserve"> on DeiT</w:t>
       </w:r>
       <w:r>
         <w:rPr>
@@ -2550,7 +2525,7 @@
         <w:jc w:val="both"/>
       </w:pPr>
       <w:r>
-        <w:t>In the separate V0.9 study, with 100% patch replacement, N=1,000 evaluation images and a disjoint N=1,000 calibration set per DeiT model, learned low-dimensional variation is more compatible than energy-matched random directions. This advantage depends on model and amplitude and does not establish rank-1 sufficiency. Complementary V0.8 diversity tests show that low-dimensional variation alone does not restore full performance; the tested setting requires higher-dimensional structure. Together, these interventions show that late-layer replaceability is structured by feature geometry and token diversity, rather than implying universal interchangeability or cost-free token deletion.</w:t>
+        <w:t>In a separate learned-direction replacement experiment, with 100% patch replacement, N=1,000 evaluation images and a disjoint N=1,000 calibration set per DeiT model, learned low-dimensional variation is more compatible than energy-matched random directions. This advantage depends on model and amplitude and does not establish rank-1 sufficiency. Complementary token-diversity experiments show that low-dimensional variation alone does not restore full performance; the tested setting requires higher-dimensional structure. Together, these interventions show that late-layer replaceability is structured by feature geometry and token diversity, rather than implying universal interchangeability or cost-free token deletion.</w:t>
       </w:r>
     </w:p>
     <w:p>
@@ -10968,13 +10943,13 @@
         <w:jc w:val="both"/>
       </w:pPr>
       <w:r>
-        <w:t>The real</w:t>
-      </w:r>
-      <w:r>
-        <w:t>-</w:t>
-      </w:r>
-      <w:r>
-        <w:t>final benchmark evaluates actual model predictions on N=1,000 held</w:t>
+        <w:t>The held-out classifier-carrier evaluation measures</w:t>
+      </w:r>
+      <w:r>
+        <w:t/>
+      </w:r>
+      <w:r>
+        <w:t xml:space="preserve"> actual model predictions on N=1,000 held</w:t>
       </w:r>
       <w:r>
         <w:t>-</w:t>
@@ -11919,7 +11894,7 @@
           <w:color w:val="4C5963"/>
           <w:sz w:val="17"/>
         </w:rPr>
-        <w:t>Fig. S1. Real</w:t>
+        <w:t>Fig. S1. Held-out classifier-carrier accuracy</w:t>
       </w:r>
       <w:r>
         <w:rPr>
@@ -11927,7 +11902,7 @@
           <w:color w:val="4C5963"/>
           <w:sz w:val="17"/>
         </w:rPr>
-        <w:t>-</w:t>
+        <w:t/>
       </w:r>
       <w:r>
         <w:rPr>
@@ -11935,7 +11910,7 @@
           <w:color w:val="4C5963"/>
           <w:sz w:val="17"/>
         </w:rPr>
-        <w:t>final classification and full</w:t>
+        <w:t xml:space="preserve"> and full</w:t>
       </w:r>
       <w:r>
         <w:rPr>

</xml_diff>

<commit_message>
Clarify depth-wise replacement findings
</commit_message>
<xml_diff>
--- a/docs/PAPER_DRAFT_v4_synced.docx
+++ b/docs/PAPER_DRAFT_v4_synced.docx
@@ -2033,49 +2033,49 @@
         <w:jc w:val="both"/>
       </w:pPr>
       <w:r>
-        <w:t>Across the audited replacement controls, late</w:t>
-      </w:r>
-      <w:r>
-        <w:t>-</w:t>
-      </w:r>
-      <w:r>
-        <w:t>layer patch content is more replaceable than early</w:t>
-      </w:r>
-      <w:r>
-        <w:t>-</w:t>
-      </w:r>
-      <w:r>
-        <w:t>layer content, but arbitrary substitutions do not preserve function. The initial depth-dependent replacement study evaluates 1,000 images per architecture under 25% patch replacement. A separately recorded follow</w:t>
-      </w:r>
-      <w:r>
-        <w:t>-</w:t>
-      </w:r>
-      <w:r>
-        <w:t>up measured the previously unsampled depth 6 with the same split seeds, replacement fraction, controls, and 1,000</w:t>
-      </w:r>
-      <w:r>
-        <w:t>-</w:t>
-      </w:r>
-      <w:r>
-        <w:t>image calibration and evaluation sets for ViT</w:t>
-      </w:r>
-      <w:r>
-        <w:t>-</w:t>
-      </w:r>
-      <w:r>
-        <w:t>B/16 AugReg and DINOv2. At depth 6, centroid/Gaussian replacement gives 73.9%/74.9% for ViT</w:t>
-      </w:r>
-      <w:r>
-        <w:t>-</w:t>
-      </w:r>
-      <w:r>
-        <w:t>B/16 AugReg and 70.6%/74.6% for DINOv2, compared with zero replacement at 71.5%/28.8%; Gaussian values are means over three seeds. Fig. 2 combines that follow</w:t>
-      </w:r>
-      <w:r>
-        <w:t>-</w:t>
-      </w:r>
-      <w:r>
-        <w:t>up with the original depths 5, 7, 8, 9, and 10. These results are conditional on the tested models, layer, replacement fraction, calibration distribution, and readout.</w:t>
+        <w:t>We examine how patch-content replacement tolerance varies across transformer depths. We replace 25% of spatial patch activations with class-agnostic surrogates and evaluate classification accuracy on 1,000 images per architecture. Across the tested depths, later-layer replacements are generally better tolerated, although performance depends on the replacement distribution. At depth 6, centroid and Gaussian replacements achieve 73.9% and 74.9% Top-1 accuracy on ViT-B/16 AugReg, compared with 71.5% under zero replacement. On DINOv2, the corresponding accuracies are 70.6%, 74.6%, and 28.8%, respectively. Gaussian results are averaged over three seeds. Depth 6 was evaluated in a subsequent follow-up using the same replacement conditions and split seeds as the initial depth sweep, with 1,000-image calibration and evaluation sets. Fig. 2 summarizes the initial depth sweep and depth-6 follow-up. These results are conditional on the tested models, layers, replacement fraction, surrogates, and readouts.</w:t>
+      </w:r>
+      <w:r>
+        <w:t/>
+      </w:r>
+      <w:r>
+        <w:t/>
+      </w:r>
+      <w:r>
+        <w:t/>
+      </w:r>
+      <w:r>
+        <w:t/>
+      </w:r>
+      <w:r>
+        <w:t/>
+      </w:r>
+      <w:r>
+        <w:t/>
+      </w:r>
+      <w:r>
+        <w:t/>
+      </w:r>
+      <w:r>
+        <w:t/>
+      </w:r>
+      <w:r>
+        <w:t/>
+      </w:r>
+      <w:r>
+        <w:t/>
+      </w:r>
+      <w:r>
+        <w:t/>
+      </w:r>
+      <w:r>
+        <w:t/>
+      </w:r>
+      <w:r>
+        <w:t/>
+      </w:r>
+      <w:r>
+        <w:t/>
       </w:r>
     </w:p>
     <w:p>

</xml_diff>

<commit_message>
Shorten Figure 2 caption
</commit_message>
<xml_diff>
--- a/docs/PAPER_DRAFT_v4_synced.docx
+++ b/docs/PAPER_DRAFT_v4_synced.docx
@@ -2186,7 +2186,7 @@
           <w:color w:val="4C5963"/>
           <w:sz w:val="17"/>
         </w:rPr>
-        <w:t>patch replacement. The initial study measured depths 5, 7, 8, 9, and 10; depth 6 is a separately recorded follow</w:t>
+        <w:t>patch replacement.</w:t>
       </w:r>
       <w:r>
         <w:rPr>
@@ -2194,7 +2194,7 @@
           <w:color w:val="4C5963"/>
           <w:sz w:val="17"/>
         </w:rPr>
-        <w:t>-</w:t>
+        <w:t/>
       </w:r>
       <w:r>
         <w:rPr>
@@ -2202,7 +2202,7 @@
           <w:color w:val="4C5963"/>
           <w:sz w:val="17"/>
         </w:rPr>
-        <w:t>up. Each evaluation uses N=1,000 images per model. Error bars show Gaussian seed</w:t>
+        <w:t xml:space="preserve"> Error bars show Gaussian seed</w:t>
       </w:r>
       <w:r>
         <w:rPr>

</xml_diff>

<commit_message>
Refine geometry and diversity manuscript narrative
</commit_message>
<xml_diff>
--- a/docs/PAPER_DRAFT_v4_synced.docx
+++ b/docs/PAPER_DRAFT_v4_synced.docx
@@ -2238,61 +2238,28 @@
         <w:jc w:val="both"/>
       </w:pPr>
       <w:r>
-        <w:t>Geometry and diversity constrain replacement. In a separate activation-replacement geometry-control experiment</w:t>
-      </w:r>
-      <w:r>
-        <w:t/>
-      </w:r>
-      <w:r>
-        <w:t xml:space="preserve"> (N=1,000 images per model; 50% replacement), coordinate permutation changes Top</w:t>
-      </w:r>
-      <w:r>
-        <w:t>-</w:t>
-      </w:r>
-      <w:r>
-        <w:t>1 accuracy from 66.3% to 52.2% on DeiT</w:t>
-      </w:r>
-      <w:r>
-        <w:t>-</w:t>
-      </w:r>
-      <w:r>
-        <w:t>Tiny and from 75.6% to 62.6% on DeiT</w:t>
-      </w:r>
-      <w:r>
-        <w:t>-</w:t>
-      </w:r>
-      <w:r>
-        <w:t>Small; sign inversion reduces it to 0.7% and 1.1%, respectively. These are classifier outcomes from the N=1,000 replacement study. A distinct N=100 DeiT</w:t>
-      </w:r>
-      <w:r>
-        <w:t>-</w:t>
-      </w:r>
-      <w:r>
-        <w:t>Small operator</w:t>
-      </w:r>
-      <w:r>
-        <w:t>-</w:t>
-      </w:r>
-      <w:r>
-        <w:t>space control finds that shuffling principal component analysis (PCA) coordinates increases mean ‖J E‖ by 1.474 (from 6.602 to 8.076); this is linearized operator</w:t>
-      </w:r>
-      <w:r>
-        <w:t>-</w:t>
-      </w:r>
-      <w:r>
-        <w:t>space evidence, not Top</w:t>
-      </w:r>
-      <w:r>
-        <w:t>-</w:t>
-      </w:r>
-      <w:r>
-        <w:t>1 accuracy. Fig. 3 compares the audited geometry and token</w:t>
-      </w:r>
-      <w:r>
-        <w:t>-</w:t>
-      </w:r>
-      <w:r>
-        <w:t>diversity controls.</w:t>
+        <w:rPr>
+          <w:b/>
+        </w:rPr>
+        <w:t xml:space="preserve">Geometry. </w:t>
+      </w:r>
+      <w:r>
+        <w:t xml:space="preserve">Successful surrogate replacement depends on alignment with learned feature coordinates and orientation, not simply on vector magnitude. At Block 8, replacing 50% of patch slots with coordinate-permuted calibration-centroid vectors lowers Top-1 accuracy from 66.3% to 52.2% for DeiT-Tiny; sign inversion lowers it to 0.7%. Both transformations preserve the centroid's L2 norm (N=1,000 evaluation images and a disjoint N=1,000 calibration set). DeiT-Small shows the same qualitative pattern. Fig. 3(a) extends these geometry controls to ViT-B/16 AugReg and DINOv2 ViT-S/14.</w:t>
+      </w:r>
+    </w:p>
+    <w:p>
+      <w:pPr>
+        <w:spacing w:after="100" w:line="259" w:lineRule="auto"/>
+        <w:jc w:val="both"/>
+      </w:pPr>
+      <w:r>
+        <w:rPr>
+          <w:b/>
+        </w:rPr>
+        <w:t xml:space="preserve">Token diversity. </w:t>
+      </w:r>
+      <w:r>
+        <w:t xml:space="preserve">Independent surrogate vectors preserve substantially more accuracy than a single shared vector under complete replacement. When all 196 patch positions are replaced, independent Gaussian surrogates improve Top-1 from 1.02% to 26.34% in DeiT-Tiny and from 9.28% to 46.36% in DeiT-Small (five seeds). Fig. 3(b) resolves this effect across K, the number of distinct surrogates assigned across the 196 positions: mean accuracy rises monotonically from 1.2% to 26.4% for DeiT-Tiny and from 10.4% to 46.5% for DeiT-Small as K increases from 1 to 196 (three seeds per K). These conditions use N=1,000 evaluation images and a disjoint N=1,000 calibration set per model; performance remains below the clean baseline. K measures diversity across token positions, not feature-space dimensionality.</w:t>
       </w:r>
     </w:p>
     <w:p>
@@ -2356,167 +2323,7 @@
           <w:color w:val="4C5963"/>
           <w:sz w:val="17"/>
         </w:rPr>
-        <w:t>Fig. 3. (a) Cross-architecture geometry controls at 50% replacement for ViT</w:t>
-      </w:r>
-      <w:r>
-        <w:rPr>
-          <w:i/>
-          <w:color w:val="4C5963"/>
-          <w:sz w:val="17"/>
-        </w:rPr>
-        <w:t>-</w:t>
-      </w:r>
-      <w:r>
-        <w:rPr>
-          <w:i/>
-          <w:color w:val="4C5963"/>
-          <w:sz w:val="17"/>
-        </w:rPr>
-        <w:t>B/16 AugReg and DINOv2 ViT</w:t>
-      </w:r>
-      <w:r>
-        <w:rPr>
-          <w:i/>
-          <w:color w:val="4C5963"/>
-          <w:sz w:val="17"/>
-        </w:rPr>
-        <w:t>-</w:t>
-      </w:r>
-      <w:r>
-        <w:rPr>
-          <w:i/>
-          <w:color w:val="4C5963"/>
-          <w:sz w:val="17"/>
-        </w:rPr>
-        <w:t>S/14 compare a calibration centroid, a coordinate</w:t>
-      </w:r>
-      <w:r>
-        <w:rPr>
-          <w:i/>
-          <w:color w:val="4C5963"/>
-          <w:sz w:val="17"/>
-        </w:rPr>
-        <w:t>-</w:t>
-      </w:r>
-      <w:r>
-        <w:rPr>
-          <w:i/>
-          <w:color w:val="4C5963"/>
-          <w:sz w:val="17"/>
-        </w:rPr>
-        <w:t>shuffled centroid, and a sign</w:t>
-      </w:r>
-      <w:r>
-        <w:rPr>
-          <w:i/>
-          <w:color w:val="4C5963"/>
-          <w:sz w:val="17"/>
-        </w:rPr>
-        <w:t>-</w:t>
-      </w:r>
-      <w:r>
-        <w:rPr>
-          <w:i/>
-          <w:color w:val="4C5963"/>
-          <w:sz w:val="17"/>
-        </w:rPr>
-        <w:t>inverted centroid. (b) The grouped token-diversity sweep</w:t>
-      </w:r>
-      <w:r>
-        <w:rPr>
-          <w:i/>
-          <w:color w:val="4C5963"/>
-          <w:sz w:val="17"/>
-        </w:rPr>
-        <w:t/>
-      </w:r>
-      <w:r>
-        <w:rPr>
-          <w:i/>
-          <w:color w:val="4C5963"/>
-          <w:sz w:val="17"/>
-        </w:rPr>
-        <w:t xml:space="preserve"> on DeiT</w:t>
-      </w:r>
-      <w:r>
-        <w:rPr>
-          <w:i/>
-          <w:color w:val="4C5963"/>
-          <w:sz w:val="17"/>
-        </w:rPr>
-        <w:t>-</w:t>
-      </w:r>
-      <w:r>
-        <w:rPr>
-          <w:i/>
-          <w:color w:val="4C5963"/>
-          <w:sz w:val="17"/>
-        </w:rPr>
-        <w:t>Tiny and DeiT</w:t>
-      </w:r>
-      <w:r>
-        <w:rPr>
-          <w:i/>
-          <w:color w:val="4C5963"/>
-          <w:sz w:val="17"/>
-        </w:rPr>
-        <w:t>-</w:t>
-      </w:r>
-      <w:r>
-        <w:rPr>
-          <w:i/>
-          <w:color w:val="4C5963"/>
-          <w:sz w:val="17"/>
-        </w:rPr>
-        <w:t>Small varies K, the number of distinct replacement vectors across all 196 patch positions. Gray dashed lines mark each model’s clean Top</w:t>
-      </w:r>
-      <w:r>
-        <w:rPr>
-          <w:i/>
-          <w:color w:val="4C5963"/>
-          <w:sz w:val="17"/>
-        </w:rPr>
-        <w:t>-</w:t>
-      </w:r>
-      <w:r>
-        <w:rPr>
-          <w:i/>
-          <w:color w:val="4C5963"/>
-          <w:sz w:val="17"/>
-        </w:rPr>
-        <w:t>1 accuracy. Bars and line markers show means; dots show recorded runs; error bars show across</w:t>
-      </w:r>
-      <w:r>
-        <w:rPr>
-          <w:i/>
-          <w:color w:val="4C5963"/>
-          <w:sz w:val="17"/>
-        </w:rPr>
-        <w:t>-</w:t>
-      </w:r>
-      <w:r>
-        <w:rPr>
-          <w:i/>
-          <w:color w:val="4C5963"/>
-          <w:sz w:val="17"/>
-        </w:rPr>
-        <w:t>seed standard deviation where repeated seeds are available. Each model uses N=1,000 evaluation images and separate calibration data. These are distinct study cohorts, so conditions should be compared within each panel rather than treated as a matched</w:t>
-      </w:r>
-      <w:r>
-        <w:rPr>
-          <w:i/>
-          <w:color w:val="4C5963"/>
-          <w:sz w:val="17"/>
-        </w:rPr>
-        <w:t>-</w:t>
-      </w:r>
-      <w:r>
-        <w:rPr>
-          <w:i/>
-          <w:color w:val="4C5963"/>
-          <w:sz w:val="17"/>
-        </w:rPr>
-        <w:t>model contrast.</w:t>
+        <w:t xml:space="preserve">Fig. 3. (a) Geometry controls at 50% replacement compare calibration centroids with coordinate-permuted and sign-inverted centroids in ViT-B/16 AugReg and DINOv2 ViT-S/14. (b) The grouped-diversity sweep under complete replacement varies K, the number of distinct surrogate vectors assigned across the 196 patch positions, in DeiT-Tiny and DeiT-Small. Gray dashed lines indicate clean Top-1 accuracy; bars and line markers show means, dots show individual runs, and error bars show across-seed standard deviation when repeated seeds are available. Each model uses N=1,000 evaluation images and calibration images disjoint from evaluation.</w:t>
       </w:r>
     </w:p>
     <w:p>
@@ -2525,7 +2332,17 @@
         <w:jc w:val="both"/>
       </w:pPr>
       <w:r>
-        <w:t>In a separate learned-direction replacement experiment, with 100% patch replacement, N=1,000 evaluation images and a disjoint N=1,000 calibration set per DeiT model, learned low-dimensional variation is more compatible than energy-matched random directions. This advantage depends on model and amplitude and does not establish rank-1 sufficiency. Complementary token-diversity experiments show that low-dimensional variation alone does not restore full performance; the tested setting requires higher-dimensional structure. Together, these interventions show that late-layer replaceability is structured by feature geometry and token diversity, rather than implying universal interchangeability or cost-free token deletion.</w:t>
+        <w:rPr>
+          <w:b/>
+          <w:b/>
+        </w:rPr>
+        <w:t xml:space="preserve">Learned directions. </w:t>
+      </w:r>
+      <w:r>
+        <w:rPr>
+          <w:b/>
+        </w:rPr>
+        <w:t xml:space="preserve">Principal component analysis (PCA) of calibration activations yields a first principal component (PC1) that can outperform an energy-matched random direction under complete replacement, but the gain depends on architecture.</w:t>
       </w:r>
     </w:p>
     <w:p>
@@ -6284,6 +6101,15 @@
       </m:oMath>
       <w:r>
         <w:t xml:space="preserve"> in Eq. (2).</w:t>
+      </w:r>
+    </w:p>
+    <w:p>
+      <w:pPr>
+        <w:spacing w:after="100" w:line="259" w:lineRule="auto"/>
+        <w:jc w:val="both"/>
+      </w:pPr>
+      <w:r>
+        <w:t xml:space="preserve">A separate operator-space control also finds a cost to disrupting PCA coordinate structure: for DeiT-Small at q=16, shuffling PCA coordinates raises mean ‖J E‖ from 6.602 to 8.076 (Δ=1.474; N=100 held-out operator-space images). This is a linearized operator-error measure, not a classification-accuracy result.</w:t>
       </w:r>
     </w:p>
     <w:p>

</xml_diff>

<commit_message>
Revise depth-dependent replacement narrative
</commit_message>
<xml_diff>
--- a/docs/PAPER_DRAFT_v4_synced.docx
+++ b/docs/PAPER_DRAFT_v4_synced.docx
@@ -2033,49 +2033,16 @@
         <w:jc w:val="both"/>
       </w:pPr>
       <w:r>
-        <w:t>We examine how patch-content replacement tolerance varies across transformer depths by replacing 25% of spatial patch activations with class-agnostic surrogates and evaluating classification accuracy on 1,000 images per architecture. As shown in Fig. 2, replacement is generally better tolerated at later layers, with the degree of preservation depending on both the model architecture and surrogate distribution. Centroid and Gaussian replacements consistently demonstrate the importance of preserving appropriate activation statistics, whereas zero replacement can cause substantially greater degradation. These findings indicate that late-layer patch-content fungibility is governed not merely by network depth, but also by the geometry of the replacement representations.</w:t>
-      </w:r>
-      <w:r>
-        <w:t/>
-      </w:r>
-      <w:r>
-        <w:t/>
-      </w:r>
-      <w:r>
-        <w:t/>
-      </w:r>
-      <w:r>
-        <w:t/>
-      </w:r>
-      <w:r>
-        <w:t/>
-      </w:r>
-      <w:r>
-        <w:t/>
-      </w:r>
-      <w:r>
-        <w:t/>
-      </w:r>
-      <w:r>
-        <w:t/>
-      </w:r>
-      <w:r>
-        <w:t/>
-      </w:r>
-      <w:r>
-        <w:t/>
-      </w:r>
-      <w:r>
-        <w:t/>
-      </w:r>
-      <w:r>
-        <w:t/>
-      </w:r>
-      <w:r>
-        <w:t/>
-      </w:r>
-      <w:r>
-        <w:t/>
+        <w:t>We examine how patch-content replacement tolerance varies across transformer depths by replacing 25% of spatial patch activations with class-agnostic surrogates and evaluating classification accuracy on 1,000 images per architecture. Figure 2 reveals a pronounced distinction between removing patch activations and replacing their image-specific content with distribution-informed surrogates. On DINOv2, zero replacement reduces Top-1 accuracy to 60.2% at depth 5 and only 4.5% at depth 9, whereas centroid replacement preserves 73.2% and 74.1%, respectively. A similar, though less pronounced, distinction appears in ViT-B/16 AugReg, where centroid replacement achieves 74.5% accuracy at depth 7 compared with 70.4% under zero replacement.</w:t>
+      </w:r>
+    </w:p>
+    <w:p>
+      <w:pPr>
+        <w:spacing w:after="100" w:line="259" w:lineRule="auto"/>
+        <w:jc w:val="both"/>
+      </w:pPr>
+      <w:r>
+        <w:t>These results reveal a depth-dependent dissociation between patch-content specificity and the preservation of compatible activation representations. Even when removing patch activations severely disrupts classification, replacing their image-specific content with class-agnostic surrogates can preserve much of the model's predictive performance. The effect varies across architectures and depths, indicating that patch-content fungibility cannot be characterized by a universal transition layer or by zero-ablation sensitivity alone.</w:t>
       </w:r>
     </w:p>
     <w:p>

</xml_diff>

<commit_message>
Standardize figure labels in manuscript
</commit_message>
<xml_diff>
--- a/docs/PAPER_DRAFT_v4_synced.docx
+++ b/docs/PAPER_DRAFT_v4_synced.docx
@@ -180,7 +180,7 @@
         <w:t>-</w:t>
       </w:r>
       <w:r>
-        <w:t>agnostic calibration surrogates while token slots, sequence length, model weights, and all downstream computation are held fixed. The intervention isolates content dependence while preserving the structure of the sequence received by later layers. Replaceability is conditional on feature geometry and token diversity; the intervention tests content substitution with fixed token slots rather than token deletion. Fig. 1 summarizes the fixed</w:t>
+        <w:t>agnostic calibration surrogates while token slots, sequence length, model weights, and all downstream computation are held fixed. The intervention isolates content dependence while preserving the structure of the sequence received by later layers. Replaceability is conditional on feature geometry and token diversity; the intervention tests content substitution with fixed token slots rather than token deletion. Figure 1 summarizes the fixed</w:t>
       </w:r>
       <w:r>
         <w:t>-</w:t>
@@ -265,7 +265,7 @@
           <w:color w:val="4C5963"/>
           <w:sz w:val="17"/>
         </w:rPr>
-        <w:t>Fig. 1. Fixed</w:t>
+        <w:t>Figure 1. Fixed</w:t>
       </w:r>
       <w:r>
         <w:rPr>
@@ -2105,7 +2105,7 @@
           <w:color w:val="4C5963"/>
           <w:sz w:val="17"/>
         </w:rPr>
-        <w:t>Fig. 2. Depth</w:t>
+        <w:t>Figure 2. Depth</w:t>
       </w:r>
       <w:r>
         <w:rPr>
@@ -2211,7 +2211,7 @@
         <w:t xml:space="preserve">Geometry. </w:t>
       </w:r>
       <w:r>
-        <w:t xml:space="preserve">Successful surrogate replacement depends on alignment with learned feature coordinates and orientation, not simply on vector magnitude. At Block 8, replacing 50% of patch slots with coordinate-permuted calibration-centroid vectors lowers Top-1 accuracy from 66.3% to 52.2% for DeiT-Tiny; sign inversion lowers it to 0.7%. Both transformations preserve the centroid's L2 norm (N=1,000 evaluation images and a disjoint N=1,000 calibration set). DeiT-Small shows the same qualitative pattern. Fig. 3(a) extends these geometry controls to ViT-B/16 AugReg and DINOv2 ViT-S/14.</w:t>
+        <w:t xml:space="preserve">Successful surrogate replacement depends on alignment with learned feature coordinates and orientation, not simply on vector magnitude. At Block 8, replacing 50% of patch slots with coordinate-permuted calibration-centroid vectors lowers Top-1 accuracy from 66.3% to 52.2% for DeiT-Tiny; sign inversion lowers it to 0.7%. Both transformations preserve the centroid's L2 norm (N=1,000 evaluation images and a disjoint N=1,000 calibration set). DeiT-Small shows the same qualitative pattern. Figure 3(a) extends these geometry controls to ViT-B/16 AugReg and DINOv2 ViT-S/14.</w:t>
       </w:r>
     </w:p>
     <w:p>
@@ -2226,7 +2226,7 @@
         <w:t xml:space="preserve">Token diversity. </w:t>
       </w:r>
       <w:r>
-        <w:t xml:space="preserve">Independent surrogate vectors preserve substantially more accuracy than a single shared vector under complete replacement. When all 196 patch positions are replaced, independent Gaussian surrogates improve Top-1 from 1.02% to 26.34% in DeiT-Tiny and from 9.28% to 46.36% in DeiT-Small (five seeds). Fig. 3(b) resolves this effect across K, the number of distinct surrogates assigned across the 196 positions: mean accuracy rises monotonically from 1.2% to 26.4% for DeiT-Tiny and from 10.4% to 46.5% for DeiT-Small as K increases from 1 to 196 (three seeds per K). These conditions use N=1,000 evaluation images and a disjoint N=1,000 calibration set per model; performance remains below the clean baseline. K measures diversity across token positions, not feature-space dimensionality.</w:t>
+        <w:t xml:space="preserve">Independent surrogate vectors preserve substantially more accuracy than a single shared vector under complete replacement. When all 196 patch positions are replaced, independent Gaussian surrogates improve Top-1 from 1.02% to 26.34% in DeiT-Tiny and from 9.28% to 46.36% in DeiT-Small (five seeds). Figure 3(b) resolves this effect across K, the number of distinct surrogates assigned across the 196 positions: mean accuracy rises monotonically from 1.2% to 26.4% for DeiT-Tiny and from 10.4% to 46.5% for DeiT-Small as K increases from 1 to 196 (three seeds per K). These conditions use N=1,000 evaluation images and a disjoint N=1,000 calibration set per model; performance remains below the clean baseline. K measures diversity across token positions, not feature-space dimensionality.</w:t>
       </w:r>
     </w:p>
     <w:p>
@@ -2290,7 +2290,7 @@
           <w:color w:val="4C5963"/>
           <w:sz w:val="17"/>
         </w:rPr>
-        <w:t xml:space="preserve">Fig. 3. (a) Geometry controls at 50% replacement compare calibration centroids with coordinate-permuted and sign-inverted centroids in ViT-B/16 AugReg and DINOv2 ViT-S/14. (b) The grouped-diversity sweep under complete replacement varies K, the number of distinct surrogate vectors assigned across the 196 patch positions, in DeiT-Tiny and DeiT-Small. Gray dashed lines indicate clean Top-1 accuracy; bars and line markers show means, dots show individual runs, and error bars show across-seed standard deviation when repeated seeds are available. Each model uses N=1,000 evaluation images and calibration images disjoint from evaluation.</w:t>
+        <w:t xml:space="preserve">Figure 3. (a) Geometry controls at 50% replacement compare calibration centroids with coordinate-permuted and sign-inverted centroids in ViT-B/16 AugReg and DINOv2 ViT-S/14. (b) The grouped-diversity sweep under complete replacement varies K, the number of distinct surrogate vectors assigned across the 196 patch positions, in DeiT-Tiny and DeiT-Small. Gray dashed lines indicate clean Top-1 accuracy; bars and line markers show means, dots show individual runs, and error bars show across-seed standard deviation when repeated seeds are available. Each model uses N=1,000 evaluation images and calibration images disjoint from evaluation.</w:t>
       </w:r>
     </w:p>
     <w:p>
@@ -2358,7 +2358,7 @@
         <w:t>-</w:t>
       </w:r>
       <w:r>
-        <w:t>dependent. Fig. 4 summarizes the audited depth</w:t>
+        <w:t>dependent. Figure 4 summarizes the audited depth</w:t>
       </w:r>
       <w:r>
         <w:t>-</w:t>
@@ -2427,7 +2427,7 @@
           <w:color w:val="4C5963"/>
           <w:sz w:val="17"/>
         </w:rPr>
-        <w:t>Fig. 4. (a) Ratio of the empirical margin</w:t>
+        <w:t>Figure 4. (a) Ratio of the empirical margin</w:t>
       </w:r>
       <w:r>
         <w:rPr>
@@ -3951,7 +3951,7 @@
         <w:jc w:val="both"/>
       </w:pPr>
       <w:r>
-        <w:t>In the attention causal audit (N=100 evaluation images), the frozen-attention Value-only path reproduces approximately 97.4% and 99.3% of the immediate readout disturbance in DeiT-Small and ViT-B/16 AugReg, respectively. It also explains 70.8% and 102.2% of the defined coherence-gap margin effect. The ViT-B/16 ratio exceeds 100% because a secondary contribution partially opposes the Value-path effect. With attention frozen, patch-key perturbations leave the unperturbed classification-token query unchanged, so the immediate query contribution is zero; key-mediated rerouting is outside this decomposition. Fig. 5 compares coherent with sign-varying Value-path transmission.</w:t>
+        <w:t>In the attention causal audit (N=100 evaluation images), the frozen-attention Value-only path reproduces approximately 97.4% and 99.3% of the immediate readout disturbance in DeiT-Small and ViT-B/16 AugReg, respectively. It also explains 70.8% and 102.2% of the defined coherence-gap margin effect. The ViT-B/16 ratio exceeds 100% because a secondary contribution partially opposes the Value-path effect. With attention frozen, patch-key perturbations leave the unperturbed classification-token query unchanged, so the immediate query contribution is zero; key-mediated rerouting is outside this decomposition. Figure 5 compares coherent with sign-varying Value-path transmission.</w:t>
       </w:r>
     </w:p>
     <w:p>
@@ -4014,7 +4014,7 @@
           <w:color w:val="4C5963"/>
           <w:sz w:val="17"/>
         </w:rPr>
-        <w:t>Fig. 5. Immediate readout disturbance for Value</w:t>
+        <w:t>Figure 5. Immediate readout disturbance for Value</w:t>
       </w:r>
       <w:r>
         <w:rPr>
@@ -4764,7 +4764,7 @@
         <w:jc w:val="both"/>
       </w:pPr>
       <w:r>
-        <w:t>On N=100 held-out perturbations, the multi-block operator predicts downstream damage more closely than the single-block operator (Pearson r=0.975, Spearman ρ=0.945 vs. r=0.753, ρ=0.735). The mean principal angle from block 8 to block 9 is 49.0 degrees (Fig. 6). Separately, in the N=100-image functional-geometry pilot, the threshold-defined near-null subspace of</w:t>
+        <w:t>On N=100 held-out perturbations, the multi-block operator predicts downstream damage more closely than the single-block operator (Pearson r=0.975, Spearman ρ=0.945 vs. r=0.753, ρ=0.735). The mean principal angle from block 8 to block 9 is 49.0 degrees (Figure 6). Separately, in the N=100-image functional-geometry pilot, the threshold-defined near-null subspace of</w:t>
       </w:r>
       <m:oMath>
         <m:sSub>
@@ -5400,7 +5400,7 @@
           <w:color w:val="4C5963"/>
           <w:sz w:val="17"/>
         </w:rPr>
-        <w:t>Fig. 6. Pearson and Spearman correlations between the single</w:t>
+        <w:t>Figure 6. Pearson and Spearman correlations between the single</w:t>
       </w:r>
       <w:r>
         <w:rPr>
@@ -9036,7 +9036,7 @@
         <w:t>-</w:t>
       </w:r>
       <w:r>
-        <w:t>count experiment. Fig. 7 presents the full accuracy</w:t>
+        <w:t>count experiment. Figure 7 presents the full accuracy</w:t>
       </w:r>
       <w:r>
         <w:t>-</w:t>
@@ -10314,7 +10314,7 @@
         <w:t>-</w:t>
       </w:r>
       <w:r>
-        <w:t>32 outcomes vary by architecture and budget; the confirmatory data do not support a universal recovery fraction. Fig. 7 reports the measured accuracy</w:t>
+        <w:t>32 outcomes vary by architecture and budget; the confirmatory data do not support a universal recovery fraction. Figure 7 reports the measured accuracy</w:t>
       </w:r>
       <w:r>
         <w:t>-</w:t>
@@ -10402,7 +10402,7 @@
           <w:color w:val="4C5963"/>
           <w:sz w:val="17"/>
         </w:rPr>
-        <w:t>Fig. 7. Confirmatory Top</w:t>
+        <w:t>Figure 7. Confirmatory Top</w:t>
       </w:r>
       <w:r>
         <w:rPr>
@@ -11624,7 +11624,7 @@
         <w:jc w:val="both"/>
       </w:pPr>
       <w:r>
-        <w:t>On held-out classification, Compact Feature-PCA does not consistently improve on Hybrid Group Mean: both DeiT-Small budgets and the aggressive DINOv2 budget are at or below it, while ViT-B/16 AugReg has a limited positive case. Fig. S1 reports measured full-model throughput; q=16 adds a narrow ViT-B/16 AugReg point at some batch sizes, without establishing a general deployment speedup.</w:t>
+        <w:t>On held-out classification, Compact Feature-PCA does not consistently improve on Hybrid Group Mean: both DeiT-Small budgets and the aggressive DINOv2 budget are at or below it, while ViT-B/16 AugReg has a limited positive case. Figure S1 reports measured full-model throughput; q=16 adds a narrow ViT-B/16 AugReg point at some batch sizes, without establishing a general deployment speedup.</w:t>
       </w:r>
     </w:p>
     <w:p>
@@ -11687,7 +11687,7 @@
           <w:color w:val="4C5963"/>
           <w:sz w:val="17"/>
         </w:rPr>
-        <w:t>Fig. S1. Held-out classifier-carrier accuracy</w:t>
+        <w:t>Figure S1. Held-out classifier-carrier accuracy</w:t>
       </w:r>
       <w:r>
         <w:rPr>

</xml_diff>